<commit_message>
Add high-resolution schematics, PCB top & bottom layout check point maps, and troubleshooting flowcharts to Maintenance Manual
Co-authored-by: arena-agent <297053741+arena-agent@users.noreply.github.com>
</commit_message>
<xml_diff>
--- a/docs/ADRV9009_Board_Maintenance_and_Repair_Manual.docx
+++ b/docs/ADRV9009_Board_Maintenance_and_Repair_Manual.docx
@@ -4,7 +4,7 @@
   <w:body>
     <w:p>
       <w:pPr>
-        <w:spacing w:before="240" w:after="80"/>
+        <w:spacing w:before="200" w:after="80"/>
         <w:jc w:val="center"/>
       </w:pPr>
       <w:r>
@@ -12,7 +12,7 @@
           <w:rFonts w:ascii="Arial" w:hAnsi="Arial"/>
           <w:b/>
           <w:color w:val="003366"/>
-          <w:sz w:val="44"/>
+          <w:sz w:val="40"/>
         </w:rPr>
         <w:t>ADRV9009 RF Transceiver Board</w:t>
         <w:br/>
@@ -28,9 +28,9 @@
         <w:rPr>
           <w:rFonts w:ascii="Arial" w:hAnsi="Arial"/>
           <w:color w:val="5A646E"/>
-          <w:sz w:val="22"/>
+          <w:sz w:val="21"/>
         </w:rPr>
-        <w:t>Preventative Maintenance Schedules, Power Rail Diagnostics, BGA Rework Profiles, and Spare Parts BOM</w:t>
+        <w:t>Preventative Maintenance Schedules, Power Rail Diagnostics, BGA Rework Profiles, Schematic Check Points &amp; PCB Layout Maps</w:t>
         <w:br/>
         <w:t>[English &amp; Persian Technical Documentation - راهنمای جامع نگهداری، عیب‌یابی و تعمیرات برد]</w:t>
       </w:r>
@@ -51,8 +51,8 @@
         </w:tblBorders>
       </w:tblPr>
       <w:tblGrid>
-        <w:gridCol w:w="4896"/>
-        <w:gridCol w:w="4896"/>
+        <w:gridCol w:w="5040"/>
+        <w:gridCol w:w="5040"/>
       </w:tblGrid>
       <w:tr>
         <w:tc>
@@ -253,9 +253,9 @@
           <w:rFonts w:ascii="Arial" w:hAnsi="Arial"/>
           <w:b/>
           <w:color w:val="003366"/>
-          <w:sz w:val="32"/>
+          <w:sz w:val="30"/>
         </w:rPr>
-        <w:t>1. Preventative Maintenance Schedules &amp; Visual Inspection</w:t>
+        <w:t>1. Preventative Maintenance Schedules &amp; Visual Inspection Standards</w:t>
       </w:r>
     </w:p>
     <w:p>
@@ -283,15 +283,15 @@
         </w:tblBorders>
       </w:tblPr>
       <w:tblGrid>
-        <w:gridCol w:w="2448"/>
-        <w:gridCol w:w="2448"/>
-        <w:gridCol w:w="2448"/>
-        <w:gridCol w:w="2448"/>
+        <w:gridCol w:w="2520"/>
+        <w:gridCol w:w="2520"/>
+        <w:gridCol w:w="2520"/>
+        <w:gridCol w:w="2520"/>
       </w:tblGrid>
       <w:tr>
         <w:tc>
           <w:tcPr>
-            <w:tcW w:type="dxa" w:w="2448"/>
+            <w:tcW w:type="dxa" w:w="2520"/>
             <w:shd w:fill="003366"/>
             <w:tcMar>
               <w:top w:w="80" w:type="dxa"/>
@@ -314,7 +314,7 @@
         </w:tc>
         <w:tc>
           <w:tcPr>
-            <w:tcW w:type="dxa" w:w="2448"/>
+            <w:tcW w:type="dxa" w:w="2520"/>
             <w:shd w:fill="003366"/>
             <w:tcMar>
               <w:top w:w="80" w:type="dxa"/>
@@ -337,7 +337,7 @@
         </w:tc>
         <w:tc>
           <w:tcPr>
-            <w:tcW w:type="dxa" w:w="2448"/>
+            <w:tcW w:type="dxa" w:w="2520"/>
             <w:shd w:fill="003366"/>
             <w:tcMar>
               <w:top w:w="80" w:type="dxa"/>
@@ -360,7 +360,7 @@
         </w:tc>
         <w:tc>
           <w:tcPr>
-            <w:tcW w:type="dxa" w:w="2448"/>
+            <w:tcW w:type="dxa" w:w="2520"/>
             <w:shd w:fill="003366"/>
             <w:tcMar>
               <w:top w:w="80" w:type="dxa"/>
@@ -385,7 +385,7 @@
       <w:tr>
         <w:tc>
           <w:tcPr>
-            <w:tcW w:type="dxa" w:w="2448"/>
+            <w:tcW w:type="dxa" w:w="2520"/>
             <w:shd w:fill="FFFFFF"/>
             <w:tcMar>
               <w:top w:w="40" w:type="dxa"/>
@@ -408,7 +408,7 @@
         </w:tc>
         <w:tc>
           <w:tcPr>
-            <w:tcW w:type="dxa" w:w="2448"/>
+            <w:tcW w:type="dxa" w:w="2520"/>
             <w:shd w:fill="FFFFFF"/>
             <w:tcMar>
               <w:top w:w="40" w:type="dxa"/>
@@ -429,7 +429,7 @@
         </w:tc>
         <w:tc>
           <w:tcPr>
-            <w:tcW w:type="dxa" w:w="2448"/>
+            <w:tcW w:type="dxa" w:w="2520"/>
             <w:shd w:fill="FFFFFF"/>
             <w:tcMar>
               <w:top w:w="40" w:type="dxa"/>
@@ -450,7 +450,7 @@
         </w:tc>
         <w:tc>
           <w:tcPr>
-            <w:tcW w:type="dxa" w:w="2448"/>
+            <w:tcW w:type="dxa" w:w="2520"/>
             <w:shd w:fill="FFFFFF"/>
             <w:tcMar>
               <w:top w:w="40" w:type="dxa"/>
@@ -473,7 +473,7 @@
       <w:tr>
         <w:tc>
           <w:tcPr>
-            <w:tcW w:type="dxa" w:w="2448"/>
+            <w:tcW w:type="dxa" w:w="2520"/>
             <w:shd w:fill="F7FAFC"/>
             <w:tcMar>
               <w:top w:w="40" w:type="dxa"/>
@@ -496,7 +496,7 @@
         </w:tc>
         <w:tc>
           <w:tcPr>
-            <w:tcW w:type="dxa" w:w="2448"/>
+            <w:tcW w:type="dxa" w:w="2520"/>
             <w:shd w:fill="F7FAFC"/>
             <w:tcMar>
               <w:top w:w="40" w:type="dxa"/>
@@ -517,7 +517,7 @@
         </w:tc>
         <w:tc>
           <w:tcPr>
-            <w:tcW w:type="dxa" w:w="2448"/>
+            <w:tcW w:type="dxa" w:w="2520"/>
             <w:shd w:fill="F7FAFC"/>
             <w:tcMar>
               <w:top w:w="40" w:type="dxa"/>
@@ -538,7 +538,7 @@
         </w:tc>
         <w:tc>
           <w:tcPr>
-            <w:tcW w:type="dxa" w:w="2448"/>
+            <w:tcW w:type="dxa" w:w="2520"/>
             <w:shd w:fill="F7FAFC"/>
             <w:tcMar>
               <w:top w:w="40" w:type="dxa"/>
@@ -561,7 +561,7 @@
       <w:tr>
         <w:tc>
           <w:tcPr>
-            <w:tcW w:type="dxa" w:w="2448"/>
+            <w:tcW w:type="dxa" w:w="2520"/>
             <w:shd w:fill="FFFFFF"/>
             <w:tcMar>
               <w:top w:w="40" w:type="dxa"/>
@@ -584,7 +584,7 @@
         </w:tc>
         <w:tc>
           <w:tcPr>
-            <w:tcW w:type="dxa" w:w="2448"/>
+            <w:tcW w:type="dxa" w:w="2520"/>
             <w:shd w:fill="FFFFFF"/>
             <w:tcMar>
               <w:top w:w="40" w:type="dxa"/>
@@ -605,7 +605,7 @@
         </w:tc>
         <w:tc>
           <w:tcPr>
-            <w:tcW w:type="dxa" w:w="2448"/>
+            <w:tcW w:type="dxa" w:w="2520"/>
             <w:shd w:fill="FFFFFF"/>
             <w:tcMar>
               <w:top w:w="40" w:type="dxa"/>
@@ -626,7 +626,7 @@
         </w:tc>
         <w:tc>
           <w:tcPr>
-            <w:tcW w:type="dxa" w:w="2448"/>
+            <w:tcW w:type="dxa" w:w="2520"/>
             <w:shd w:fill="FFFFFF"/>
             <w:tcMar>
               <w:top w:w="40" w:type="dxa"/>
@@ -649,7 +649,7 @@
       <w:tr>
         <w:tc>
           <w:tcPr>
-            <w:tcW w:type="dxa" w:w="2448"/>
+            <w:tcW w:type="dxa" w:w="2520"/>
             <w:shd w:fill="F7FAFC"/>
             <w:tcMar>
               <w:top w:w="40" w:type="dxa"/>
@@ -672,7 +672,7 @@
         </w:tc>
         <w:tc>
           <w:tcPr>
-            <w:tcW w:type="dxa" w:w="2448"/>
+            <w:tcW w:type="dxa" w:w="2520"/>
             <w:shd w:fill="F7FAFC"/>
             <w:tcMar>
               <w:top w:w="40" w:type="dxa"/>
@@ -693,7 +693,7 @@
         </w:tc>
         <w:tc>
           <w:tcPr>
-            <w:tcW w:type="dxa" w:w="2448"/>
+            <w:tcW w:type="dxa" w:w="2520"/>
             <w:shd w:fill="F7FAFC"/>
             <w:tcMar>
               <w:top w:w="40" w:type="dxa"/>
@@ -714,7 +714,7 @@
         </w:tc>
         <w:tc>
           <w:tcPr>
-            <w:tcW w:type="dxa" w:w="2448"/>
+            <w:tcW w:type="dxa" w:w="2520"/>
             <w:shd w:fill="F7FAFC"/>
             <w:tcMar>
               <w:top w:w="40" w:type="dxa"/>
@@ -737,7 +737,7 @@
       <w:tr>
         <w:tc>
           <w:tcPr>
-            <w:tcW w:type="dxa" w:w="2448"/>
+            <w:tcW w:type="dxa" w:w="2520"/>
             <w:shd w:fill="FFFFFF"/>
             <w:tcMar>
               <w:top w:w="40" w:type="dxa"/>
@@ -760,7 +760,7 @@
         </w:tc>
         <w:tc>
           <w:tcPr>
-            <w:tcW w:type="dxa" w:w="2448"/>
+            <w:tcW w:type="dxa" w:w="2520"/>
             <w:shd w:fill="FFFFFF"/>
             <w:tcMar>
               <w:top w:w="40" w:type="dxa"/>
@@ -781,7 +781,7 @@
         </w:tc>
         <w:tc>
           <w:tcPr>
-            <w:tcW w:type="dxa" w:w="2448"/>
+            <w:tcW w:type="dxa" w:w="2520"/>
             <w:shd w:fill="FFFFFF"/>
             <w:tcMar>
               <w:top w:w="40" w:type="dxa"/>
@@ -802,7 +802,7 @@
         </w:tc>
         <w:tc>
           <w:tcPr>
-            <w:tcW w:type="dxa" w:w="2448"/>
+            <w:tcW w:type="dxa" w:w="2520"/>
             <w:shd w:fill="FFFFFF"/>
             <w:tcMar>
               <w:top w:w="40" w:type="dxa"/>
@@ -836,7 +836,7 @@
         <w:tblLook w:firstColumn="1" w:firstRow="1" w:lastColumn="0" w:lastRow="0" w:noHBand="0" w:noVBand="1" w:val="04A0"/>
       </w:tblPr>
       <w:tblGrid>
-        <w:gridCol w:w="9792"/>
+        <w:gridCol w:w="10080"/>
       </w:tblGrid>
       <w:tr>
         <w:tc>
@@ -887,7 +887,7 @@
     </w:tbl>
     <w:p>
       <w:pPr>
-        <w:spacing w:before="0" w:after="80"/>
+        <w:spacing w:after="80"/>
       </w:pPr>
     </w:p>
     <w:p>
@@ -899,7 +899,7 @@
           <w:rFonts w:ascii="Arial" w:hAnsi="Arial"/>
           <w:b/>
           <w:color w:val="003366"/>
-          <w:sz w:val="32"/>
+          <w:sz w:val="30"/>
         </w:rPr>
         <w:t>2. DC Power Supply Rail Diagnostics &amp; Test Point Mapping</w:t>
       </w:r>
@@ -910,7 +910,7 @@
           <w:rFonts w:ascii="Arial" w:hAnsi="Arial"/>
           <w:sz w:val="20"/>
         </w:rPr>
-        <w:t>Power supply failure is the most common cause of board unresponsiveness. Table 2.1 maps all primary DC voltage test points, nominal voltages, maximum allowable AC ripple, and diagnostic steps:</w:t>
+        <w:t>Power supply failure is the primary cause of board unresponsiveness. Table 2.1 maps all primary DC voltage test points, nominal voltages, maximum allowable AC ripple, and diagnostic root cause paths:</w:t>
       </w:r>
     </w:p>
     <w:tbl>
@@ -929,17 +929,17 @@
         </w:tblBorders>
       </w:tblPr>
       <w:tblGrid>
-        <w:gridCol w:w="1632"/>
-        <w:gridCol w:w="1632"/>
-        <w:gridCol w:w="1632"/>
-        <w:gridCol w:w="1632"/>
-        <w:gridCol w:w="1632"/>
-        <w:gridCol w:w="1632"/>
+        <w:gridCol w:w="1680"/>
+        <w:gridCol w:w="1680"/>
+        <w:gridCol w:w="1680"/>
+        <w:gridCol w:w="1680"/>
+        <w:gridCol w:w="1680"/>
+        <w:gridCol w:w="1680"/>
       </w:tblGrid>
       <w:tr>
         <w:tc>
           <w:tcPr>
-            <w:tcW w:type="dxa" w:w="1632"/>
+            <w:tcW w:type="dxa" w:w="1680"/>
             <w:shd w:fill="003366"/>
             <w:tcMar>
               <w:top w:w="80" w:type="dxa"/>
@@ -962,7 +962,7 @@
         </w:tc>
         <w:tc>
           <w:tcPr>
-            <w:tcW w:type="dxa" w:w="1632"/>
+            <w:tcW w:type="dxa" w:w="1680"/>
             <w:shd w:fill="003366"/>
             <w:tcMar>
               <w:top w:w="80" w:type="dxa"/>
@@ -985,7 +985,7 @@
         </w:tc>
         <w:tc>
           <w:tcPr>
-            <w:tcW w:type="dxa" w:w="1632"/>
+            <w:tcW w:type="dxa" w:w="1680"/>
             <w:shd w:fill="003366"/>
             <w:tcMar>
               <w:top w:w="80" w:type="dxa"/>
@@ -1008,7 +1008,7 @@
         </w:tc>
         <w:tc>
           <w:tcPr>
-            <w:tcW w:type="dxa" w:w="1632"/>
+            <w:tcW w:type="dxa" w:w="1680"/>
             <w:shd w:fill="003366"/>
             <w:tcMar>
               <w:top w:w="80" w:type="dxa"/>
@@ -1031,7 +1031,7 @@
         </w:tc>
         <w:tc>
           <w:tcPr>
-            <w:tcW w:type="dxa" w:w="1632"/>
+            <w:tcW w:type="dxa" w:w="1680"/>
             <w:shd w:fill="003366"/>
             <w:tcMar>
               <w:top w:w="80" w:type="dxa"/>
@@ -1054,7 +1054,7 @@
         </w:tc>
         <w:tc>
           <w:tcPr>
-            <w:tcW w:type="dxa" w:w="1632"/>
+            <w:tcW w:type="dxa" w:w="1680"/>
             <w:shd w:fill="003366"/>
             <w:tcMar>
               <w:top w:w="80" w:type="dxa"/>
@@ -1079,7 +1079,7 @@
       <w:tr>
         <w:tc>
           <w:tcPr>
-            <w:tcW w:type="dxa" w:w="1632"/>
+            <w:tcW w:type="dxa" w:w="1680"/>
             <w:shd w:fill="FFFFFF"/>
             <w:tcMar>
               <w:top w:w="40" w:type="dxa"/>
@@ -1102,7 +1102,7 @@
         </w:tc>
         <w:tc>
           <w:tcPr>
-            <w:tcW w:type="dxa" w:w="1632"/>
+            <w:tcW w:type="dxa" w:w="1680"/>
             <w:shd w:fill="FFFFFF"/>
             <w:tcMar>
               <w:top w:w="40" w:type="dxa"/>
@@ -1123,7 +1123,7 @@
         </w:tc>
         <w:tc>
           <w:tcPr>
-            <w:tcW w:type="dxa" w:w="1632"/>
+            <w:tcW w:type="dxa" w:w="1680"/>
             <w:shd w:fill="FFFFFF"/>
             <w:tcMar>
               <w:top w:w="40" w:type="dxa"/>
@@ -1144,7 +1144,7 @@
         </w:tc>
         <w:tc>
           <w:tcPr>
-            <w:tcW w:type="dxa" w:w="1632"/>
+            <w:tcW w:type="dxa" w:w="1680"/>
             <w:shd w:fill="FFFFFF"/>
             <w:tcMar>
               <w:top w:w="40" w:type="dxa"/>
@@ -1165,7 +1165,7 @@
         </w:tc>
         <w:tc>
           <w:tcPr>
-            <w:tcW w:type="dxa" w:w="1632"/>
+            <w:tcW w:type="dxa" w:w="1680"/>
             <w:shd w:fill="FFFFFF"/>
             <w:tcMar>
               <w:top w:w="40" w:type="dxa"/>
@@ -1186,7 +1186,7 @@
         </w:tc>
         <w:tc>
           <w:tcPr>
-            <w:tcW w:type="dxa" w:w="1632"/>
+            <w:tcW w:type="dxa" w:w="1680"/>
             <w:shd w:fill="FFFFFF"/>
             <w:tcMar>
               <w:top w:w="40" w:type="dxa"/>
@@ -1209,7 +1209,7 @@
       <w:tr>
         <w:tc>
           <w:tcPr>
-            <w:tcW w:type="dxa" w:w="1632"/>
+            <w:tcW w:type="dxa" w:w="1680"/>
             <w:shd w:fill="F7FAFC"/>
             <w:tcMar>
               <w:top w:w="40" w:type="dxa"/>
@@ -1232,7 +1232,7 @@
         </w:tc>
         <w:tc>
           <w:tcPr>
-            <w:tcW w:type="dxa" w:w="1632"/>
+            <w:tcW w:type="dxa" w:w="1680"/>
             <w:shd w:fill="F7FAFC"/>
             <w:tcMar>
               <w:top w:w="40" w:type="dxa"/>
@@ -1253,7 +1253,7 @@
         </w:tc>
         <w:tc>
           <w:tcPr>
-            <w:tcW w:type="dxa" w:w="1632"/>
+            <w:tcW w:type="dxa" w:w="1680"/>
             <w:shd w:fill="F7FAFC"/>
             <w:tcMar>
               <w:top w:w="40" w:type="dxa"/>
@@ -1274,7 +1274,7 @@
         </w:tc>
         <w:tc>
           <w:tcPr>
-            <w:tcW w:type="dxa" w:w="1632"/>
+            <w:tcW w:type="dxa" w:w="1680"/>
             <w:shd w:fill="F7FAFC"/>
             <w:tcMar>
               <w:top w:w="40" w:type="dxa"/>
@@ -1295,7 +1295,7 @@
         </w:tc>
         <w:tc>
           <w:tcPr>
-            <w:tcW w:type="dxa" w:w="1632"/>
+            <w:tcW w:type="dxa" w:w="1680"/>
             <w:shd w:fill="F7FAFC"/>
             <w:tcMar>
               <w:top w:w="40" w:type="dxa"/>
@@ -1316,7 +1316,7 @@
         </w:tc>
         <w:tc>
           <w:tcPr>
-            <w:tcW w:type="dxa" w:w="1632"/>
+            <w:tcW w:type="dxa" w:w="1680"/>
             <w:shd w:fill="F7FAFC"/>
             <w:tcMar>
               <w:top w:w="40" w:type="dxa"/>
@@ -1339,7 +1339,7 @@
       <w:tr>
         <w:tc>
           <w:tcPr>
-            <w:tcW w:type="dxa" w:w="1632"/>
+            <w:tcW w:type="dxa" w:w="1680"/>
             <w:shd w:fill="FFFFFF"/>
             <w:tcMar>
               <w:top w:w="40" w:type="dxa"/>
@@ -1362,7 +1362,7 @@
         </w:tc>
         <w:tc>
           <w:tcPr>
-            <w:tcW w:type="dxa" w:w="1632"/>
+            <w:tcW w:type="dxa" w:w="1680"/>
             <w:shd w:fill="FFFFFF"/>
             <w:tcMar>
               <w:top w:w="40" w:type="dxa"/>
@@ -1383,7 +1383,7 @@
         </w:tc>
         <w:tc>
           <w:tcPr>
-            <w:tcW w:type="dxa" w:w="1632"/>
+            <w:tcW w:type="dxa" w:w="1680"/>
             <w:shd w:fill="FFFFFF"/>
             <w:tcMar>
               <w:top w:w="40" w:type="dxa"/>
@@ -1404,7 +1404,7 @@
         </w:tc>
         <w:tc>
           <w:tcPr>
-            <w:tcW w:type="dxa" w:w="1632"/>
+            <w:tcW w:type="dxa" w:w="1680"/>
             <w:shd w:fill="FFFFFF"/>
             <w:tcMar>
               <w:top w:w="40" w:type="dxa"/>
@@ -1425,7 +1425,7 @@
         </w:tc>
         <w:tc>
           <w:tcPr>
-            <w:tcW w:type="dxa" w:w="1632"/>
+            <w:tcW w:type="dxa" w:w="1680"/>
             <w:shd w:fill="FFFFFF"/>
             <w:tcMar>
               <w:top w:w="40" w:type="dxa"/>
@@ -1446,7 +1446,7 @@
         </w:tc>
         <w:tc>
           <w:tcPr>
-            <w:tcW w:type="dxa" w:w="1632"/>
+            <w:tcW w:type="dxa" w:w="1680"/>
             <w:shd w:fill="FFFFFF"/>
             <w:tcMar>
               <w:top w:w="40" w:type="dxa"/>
@@ -1469,7 +1469,7 @@
       <w:tr>
         <w:tc>
           <w:tcPr>
-            <w:tcW w:type="dxa" w:w="1632"/>
+            <w:tcW w:type="dxa" w:w="1680"/>
             <w:shd w:fill="F7FAFC"/>
             <w:tcMar>
               <w:top w:w="40" w:type="dxa"/>
@@ -1492,7 +1492,7 @@
         </w:tc>
         <w:tc>
           <w:tcPr>
-            <w:tcW w:type="dxa" w:w="1632"/>
+            <w:tcW w:type="dxa" w:w="1680"/>
             <w:shd w:fill="F7FAFC"/>
             <w:tcMar>
               <w:top w:w="40" w:type="dxa"/>
@@ -1513,7 +1513,7 @@
         </w:tc>
         <w:tc>
           <w:tcPr>
-            <w:tcW w:type="dxa" w:w="1632"/>
+            <w:tcW w:type="dxa" w:w="1680"/>
             <w:shd w:fill="F7FAFC"/>
             <w:tcMar>
               <w:top w:w="40" w:type="dxa"/>
@@ -1534,7 +1534,7 @@
         </w:tc>
         <w:tc>
           <w:tcPr>
-            <w:tcW w:type="dxa" w:w="1632"/>
+            <w:tcW w:type="dxa" w:w="1680"/>
             <w:shd w:fill="F7FAFC"/>
             <w:tcMar>
               <w:top w:w="40" w:type="dxa"/>
@@ -1555,7 +1555,7 @@
         </w:tc>
         <w:tc>
           <w:tcPr>
-            <w:tcW w:type="dxa" w:w="1632"/>
+            <w:tcW w:type="dxa" w:w="1680"/>
             <w:shd w:fill="F7FAFC"/>
             <w:tcMar>
               <w:top w:w="40" w:type="dxa"/>
@@ -1576,7 +1576,7 @@
         </w:tc>
         <w:tc>
           <w:tcPr>
-            <w:tcW w:type="dxa" w:w="1632"/>
+            <w:tcW w:type="dxa" w:w="1680"/>
             <w:shd w:fill="F7FAFC"/>
             <w:tcMar>
               <w:top w:w="40" w:type="dxa"/>
@@ -1599,7 +1599,7 @@
       <w:tr>
         <w:tc>
           <w:tcPr>
-            <w:tcW w:type="dxa" w:w="1632"/>
+            <w:tcW w:type="dxa" w:w="1680"/>
             <w:shd w:fill="FFFFFF"/>
             <w:tcMar>
               <w:top w:w="40" w:type="dxa"/>
@@ -1622,7 +1622,7 @@
         </w:tc>
         <w:tc>
           <w:tcPr>
-            <w:tcW w:type="dxa" w:w="1632"/>
+            <w:tcW w:type="dxa" w:w="1680"/>
             <w:shd w:fill="FFFFFF"/>
             <w:tcMar>
               <w:top w:w="40" w:type="dxa"/>
@@ -1643,7 +1643,7 @@
         </w:tc>
         <w:tc>
           <w:tcPr>
-            <w:tcW w:type="dxa" w:w="1632"/>
+            <w:tcW w:type="dxa" w:w="1680"/>
             <w:shd w:fill="FFFFFF"/>
             <w:tcMar>
               <w:top w:w="40" w:type="dxa"/>
@@ -1664,7 +1664,7 @@
         </w:tc>
         <w:tc>
           <w:tcPr>
-            <w:tcW w:type="dxa" w:w="1632"/>
+            <w:tcW w:type="dxa" w:w="1680"/>
             <w:shd w:fill="FFFFFF"/>
             <w:tcMar>
               <w:top w:w="40" w:type="dxa"/>
@@ -1685,7 +1685,7 @@
         </w:tc>
         <w:tc>
           <w:tcPr>
-            <w:tcW w:type="dxa" w:w="1632"/>
+            <w:tcW w:type="dxa" w:w="1680"/>
             <w:shd w:fill="FFFFFF"/>
             <w:tcMar>
               <w:top w:w="40" w:type="dxa"/>
@@ -1706,7 +1706,7 @@
         </w:tc>
         <w:tc>
           <w:tcPr>
-            <w:tcW w:type="dxa" w:w="1632"/>
+            <w:tcW w:type="dxa" w:w="1680"/>
             <w:shd w:fill="FFFFFF"/>
             <w:tcMar>
               <w:top w:w="40" w:type="dxa"/>
@@ -1729,7 +1729,7 @@
       <w:tr>
         <w:tc>
           <w:tcPr>
-            <w:tcW w:type="dxa" w:w="1632"/>
+            <w:tcW w:type="dxa" w:w="1680"/>
             <w:shd w:fill="F7FAFC"/>
             <w:tcMar>
               <w:top w:w="40" w:type="dxa"/>
@@ -1752,7 +1752,7 @@
         </w:tc>
         <w:tc>
           <w:tcPr>
-            <w:tcW w:type="dxa" w:w="1632"/>
+            <w:tcW w:type="dxa" w:w="1680"/>
             <w:shd w:fill="F7FAFC"/>
             <w:tcMar>
               <w:top w:w="40" w:type="dxa"/>
@@ -1773,7 +1773,7 @@
         </w:tc>
         <w:tc>
           <w:tcPr>
-            <w:tcW w:type="dxa" w:w="1632"/>
+            <w:tcW w:type="dxa" w:w="1680"/>
             <w:shd w:fill="F7FAFC"/>
             <w:tcMar>
               <w:top w:w="40" w:type="dxa"/>
@@ -1794,7 +1794,7 @@
         </w:tc>
         <w:tc>
           <w:tcPr>
-            <w:tcW w:type="dxa" w:w="1632"/>
+            <w:tcW w:type="dxa" w:w="1680"/>
             <w:shd w:fill="F7FAFC"/>
             <w:tcMar>
               <w:top w:w="40" w:type="dxa"/>
@@ -1815,7 +1815,7 @@
         </w:tc>
         <w:tc>
           <w:tcPr>
-            <w:tcW w:type="dxa" w:w="1632"/>
+            <w:tcW w:type="dxa" w:w="1680"/>
             <w:shd w:fill="F7FAFC"/>
             <w:tcMar>
               <w:top w:w="40" w:type="dxa"/>
@@ -1836,7 +1836,7 @@
         </w:tc>
         <w:tc>
           <w:tcPr>
-            <w:tcW w:type="dxa" w:w="1632"/>
+            <w:tcW w:type="dxa" w:w="1680"/>
             <w:shd w:fill="F7FAFC"/>
             <w:tcMar>
               <w:top w:w="40" w:type="dxa"/>
@@ -1859,8 +1859,176 @@
     </w:tbl>
     <w:p>
       <w:pPr>
-        <w:spacing w:after="120"/>
+        <w:spacing w:after="160"/>
       </w:pPr>
+    </w:p>
+    <w:p>
+      <w:pPr>
+        <w:keepNext/>
+        <w:spacing w:before="160" w:after="40"/>
+        <w:jc w:val="center"/>
+      </w:pPr>
+      <w:r>
+        <w:drawing>
+          <wp:inline xmlns:a="http://schemas.openxmlformats.org/drawingml/2006/main" xmlns:pic="http://schemas.openxmlformats.org/drawingml/2006/picture">
+            <wp:extent cx="5669280" cy="3629971"/>
+            <wp:docPr id="1" name="Picture 1"/>
+            <wp:cNvGraphicFramePr>
+              <a:graphicFrameLocks noChangeAspect="1"/>
+            </wp:cNvGraphicFramePr>
+            <a:graphic>
+              <a:graphicData uri="http://schemas.openxmlformats.org/drawingml/2006/picture">
+                <pic:pic>
+                  <pic:nvPicPr>
+                    <pic:cNvPr id="0" name="adrv9009_power_tree_schematic.png"/>
+                    <pic:cNvPicPr/>
+                  </pic:nvPicPr>
+                  <pic:blipFill>
+                    <a:blip r:embed="rId9"/>
+                    <a:stretch>
+                      <a:fillRect/>
+                    </a:stretch>
+                  </pic:blipFill>
+                  <pic:spPr>
+                    <a:xfrm>
+                      <a:off x="0" y="0"/>
+                      <a:ext cx="5669280" cy="3629971"/>
+                    </a:xfrm>
+                    <a:prstGeom prst="rect"/>
+                  </pic:spPr>
+                </pic:pic>
+              </a:graphicData>
+            </a:graphic>
+          </wp:inline>
+        </w:drawing>
+      </w:r>
+    </w:p>
+    <w:p>
+      <w:pPr>
+        <w:spacing w:before="40" w:after="200"/>
+        <w:jc w:val="center"/>
+      </w:pPr>
+      <w:r>
+        <w:rPr>
+          <w:rFonts w:ascii="Arial" w:hAnsi="Arial"/>
+          <w:i/>
+          <w:color w:val="505A64"/>
+          <w:sz w:val="18"/>
+        </w:rPr>
+        <w:t>Figure 1.1: ADRV9009 Power Tree Architecture &amp; Voltage Check Points Schematic (ADP5054 PMIC, LT3045 LDOs, Fuse F1, and TP1–TP6).</w:t>
+      </w:r>
+    </w:p>
+    <w:p>
+      <w:pPr>
+        <w:keepNext/>
+        <w:spacing w:before="160" w:after="40"/>
+        <w:jc w:val="center"/>
+      </w:pPr>
+      <w:r>
+        <w:drawing>
+          <wp:inline xmlns:a="http://schemas.openxmlformats.org/drawingml/2006/main" xmlns:pic="http://schemas.openxmlformats.org/drawingml/2006/picture">
+            <wp:extent cx="5669280" cy="4037833"/>
+            <wp:docPr id="2" name="Picture 2"/>
+            <wp:cNvGraphicFramePr>
+              <a:graphicFrameLocks noChangeAspect="1"/>
+            </wp:cNvGraphicFramePr>
+            <a:graphic>
+              <a:graphicData uri="http://schemas.openxmlformats.org/drawingml/2006/picture">
+                <pic:pic>
+                  <pic:nvPicPr>
+                    <pic:cNvPr id="0" name="adrv9009_pcb_top_layer.png"/>
+                    <pic:cNvPicPr/>
+                  </pic:nvPicPr>
+                  <pic:blipFill>
+                    <a:blip r:embed="rId10"/>
+                    <a:stretch>
+                      <a:fillRect/>
+                    </a:stretch>
+                  </pic:blipFill>
+                  <pic:spPr>
+                    <a:xfrm>
+                      <a:off x="0" y="0"/>
+                      <a:ext cx="5669280" cy="4037833"/>
+                    </a:xfrm>
+                    <a:prstGeom prst="rect"/>
+                  </pic:spPr>
+                </pic:pic>
+              </a:graphicData>
+            </a:graphic>
+          </wp:inline>
+        </w:drawing>
+      </w:r>
+    </w:p>
+    <w:p>
+      <w:pPr>
+        <w:spacing w:before="40" w:after="200"/>
+        <w:jc w:val="center"/>
+      </w:pPr>
+      <w:r>
+        <w:rPr>
+          <w:rFonts w:ascii="Arial" w:hAnsi="Arial"/>
+          <w:i/>
+          <w:color w:val="505A64"/>
+          <w:sz w:val="18"/>
+        </w:rPr>
+        <w:t>Figure 1.2: ADRV9009 Evaluation Board Top Layer Layout &amp; Voltage Test Point Locations (Fuse F1, TVS D1, U1 ADRV9009, U2 HMC7044, Baluns T1–T4, and Check Points TP1–TP6).</w:t>
+      </w:r>
+    </w:p>
+    <w:p>
+      <w:pPr>
+        <w:keepNext/>
+        <w:spacing w:before="160" w:after="40"/>
+        <w:jc w:val="center"/>
+      </w:pPr>
+      <w:r>
+        <w:drawing>
+          <wp:inline xmlns:a="http://schemas.openxmlformats.org/drawingml/2006/main" xmlns:pic="http://schemas.openxmlformats.org/drawingml/2006/picture">
+            <wp:extent cx="5669280" cy="4037833"/>
+            <wp:docPr id="3" name="Picture 3"/>
+            <wp:cNvGraphicFramePr>
+              <a:graphicFrameLocks noChangeAspect="1"/>
+            </wp:cNvGraphicFramePr>
+            <a:graphic>
+              <a:graphicData uri="http://schemas.openxmlformats.org/drawingml/2006/picture">
+                <pic:pic>
+                  <pic:nvPicPr>
+                    <pic:cNvPr id="0" name="adrv9009_pcb_bottom_layer.png"/>
+                    <pic:cNvPicPr/>
+                  </pic:nvPicPr>
+                  <pic:blipFill>
+                    <a:blip r:embed="rId11"/>
+                    <a:stretch>
+                      <a:fillRect/>
+                    </a:stretch>
+                  </pic:blipFill>
+                  <pic:spPr>
+                    <a:xfrm>
+                      <a:off x="0" y="0"/>
+                      <a:ext cx="5669280" cy="4037833"/>
+                    </a:xfrm>
+                    <a:prstGeom prst="rect"/>
+                  </pic:spPr>
+                </pic:pic>
+              </a:graphicData>
+            </a:graphic>
+          </wp:inline>
+        </w:drawing>
+      </w:r>
+    </w:p>
+    <w:p>
+      <w:pPr>
+        <w:spacing w:before="40" w:after="200"/>
+        <w:jc w:val="center"/>
+      </w:pPr>
+      <w:r>
+        <w:rPr>
+          <w:rFonts w:ascii="Arial" w:hAnsi="Arial"/>
+          <w:i/>
+          <w:color w:val="505A64"/>
+          <w:sz w:val="18"/>
+        </w:rPr>
+        <w:t>Figure 1.3: ADRV9009 Evaluation Board Bottom Layer Component &amp; Decoupling Map (ADP5054 PMIC U3, LT3045 LDOs U4/U5, Inductors L1–L4, and High-Frequency BGA Decoupling Array).</w:t>
+      </w:r>
     </w:p>
     <w:p>
       <w:pPr>
@@ -1871,7 +2039,7 @@
           <w:rFonts w:ascii="Arial" w:hAnsi="Arial"/>
           <w:b/>
           <w:color w:val="003366"/>
-          <w:sz w:val="32"/>
+          <w:sz w:val="30"/>
         </w:rPr>
         <w:t>3. Clock Distribution (HMC7044) &amp; PLL Lock Troubleshooting</w:t>
       </w:r>
@@ -1893,141 +2061,54 @@
         <w:tblLook w:firstColumn="1" w:firstRow="1" w:lastColumn="0" w:lastRow="0" w:noHBand="0" w:noVBand="1" w:val="04A0"/>
       </w:tblPr>
       <w:tblGrid>
-        <w:gridCol w:w="9792"/>
+        <w:gridCol w:w="10080"/>
       </w:tblGrid>
       <w:tr>
         <w:tc>
           <w:tcPr>
             <w:tcW w:type="dxa" w:w="9360"/>
-            <w:shd w:fill="1E1E1E"/>
+            <w:shd w:fill="1E293B"/>
             <w:tcMar>
-              <w:top w:w="120" w:type="dxa"/>
-              <w:bottom w:w="120" w:type="dxa"/>
-              <w:left w:w="180" w:type="dxa"/>
-              <w:right w:w="180" w:type="dxa"/>
+              <w:top w:w="100" w:type="dxa"/>
+              <w:bottom w:w="100" w:type="dxa"/>
+              <w:left w:w="140" w:type="dxa"/>
+              <w:right w:w="140" w:type="dxa"/>
             </w:tcMar>
           </w:tcPr>
           <w:p>
             <w:pPr>
-              <w:spacing w:before="0" w:after="0" w:line="252" w:lineRule="auto"/>
+              <w:spacing w:before="0" w:after="0"/>
+              <w:jc w:val="left"/>
             </w:pPr>
             <w:r>
               <w:rPr>
                 <w:rFonts w:ascii="Consolas" w:hAnsi="Consolas"/>
-                <w:color w:val="6A9955"/>
-                <w:sz w:val="18"/>
+                <w:color w:val="F1F5F9"/>
+                <w:sz w:val="17"/>
               </w:rPr>
               <w:t># --- Diagnostic Step 1: Check HMC7044 Clock Status via Linux Sysfs ---</w:t>
               <w:br/>
-            </w:r>
-            <w:r>
-              <w:rPr>
-                <w:rFonts w:ascii="Consolas" w:hAnsi="Consolas"/>
-                <w:b/>
-                <w:color w:val="DCDCAA"/>
-                <w:sz w:val="18"/>
-              </w:rPr>
               <w:t>root@analog:~# cat /sys/bus/iio/devices/iio:device*/name | grep hmc7044</w:t>
               <w:br/>
-            </w:r>
-            <w:r>
-              <w:rPr>
-                <w:rFonts w:ascii="Consolas" w:hAnsi="Consolas"/>
-                <w:color w:val="DCDCDC"/>
-                <w:sz w:val="18"/>
-              </w:rPr>
               <w:t>hmc7044</w:t>
               <w:br/>
-            </w:r>
-            <w:r>
-              <w:rPr>
-                <w:rFonts w:ascii="Consolas" w:hAnsi="Consolas"/>
-                <w:color w:val="DCDCDC"/>
-                <w:sz w:val="18"/>
-              </w:rPr>
               <w:br/>
-            </w:r>
-            <w:r>
-              <w:rPr>
-                <w:rFonts w:ascii="Consolas" w:hAnsi="Consolas"/>
-                <w:color w:val="6A9955"/>
-                <w:sz w:val="18"/>
-              </w:rPr>
               <w:t># --- Diagnostic Step 2: Read Lock Detect Pin Status ---</w:t>
               <w:br/>
-            </w:r>
-            <w:r>
-              <w:rPr>
-                <w:rFonts w:ascii="Consolas" w:hAnsi="Consolas"/>
-                <w:b/>
-                <w:color w:val="DCDCAA"/>
-                <w:sz w:val="18"/>
-              </w:rPr>
               <w:t>root@analog:~# iio_attr -d hmc7044 pll1_locked</w:t>
               <w:br/>
-            </w:r>
-            <w:r>
-              <w:rPr>
-                <w:rFonts w:ascii="Consolas" w:hAnsi="Consolas"/>
-                <w:color w:val="DCDCDC"/>
-                <w:sz w:val="18"/>
-              </w:rPr>
               <w:t>1</w:t>
               <w:br/>
-            </w:r>
-            <w:r>
-              <w:rPr>
-                <w:rFonts w:ascii="Consolas" w:hAnsi="Consolas"/>
-                <w:b/>
-                <w:color w:val="DCDCAA"/>
-                <w:sz w:val="18"/>
-              </w:rPr>
               <w:t>root@analog:~# iio_attr -d hmc7044 pll2_locked</w:t>
               <w:br/>
-            </w:r>
-            <w:r>
-              <w:rPr>
-                <w:rFonts w:ascii="Consolas" w:hAnsi="Consolas"/>
-                <w:color w:val="DCDCDC"/>
-                <w:sz w:val="18"/>
-              </w:rPr>
               <w:t>1</w:t>
               <w:br/>
-            </w:r>
-            <w:r>
-              <w:rPr>
-                <w:rFonts w:ascii="Consolas" w:hAnsi="Consolas"/>
-                <w:color w:val="DCDCDC"/>
-                <w:sz w:val="18"/>
-              </w:rPr>
               <w:br/>
-            </w:r>
-            <w:r>
-              <w:rPr>
-                <w:rFonts w:ascii="Consolas" w:hAnsi="Consolas"/>
-                <w:color w:val="6A9955"/>
-                <w:sz w:val="18"/>
-              </w:rPr>
               <w:t># --- Diagnostic Step 3: Verify DEV_CLK Output Frequency ---</w:t>
               <w:br/>
-            </w:r>
-            <w:r>
-              <w:rPr>
-                <w:rFonts w:ascii="Consolas" w:hAnsi="Consolas"/>
-                <w:color w:val="6A9955"/>
-                <w:sz w:val="18"/>
-              </w:rPr>
               <w:t># Probe TP_CLK_P and TP_CLK_N with high-bandwidth differential probe (100 MHz - 500 MHz scope):</w:t>
               <w:br/>
-            </w:r>
-            <w:r>
-              <w:rPr>
-                <w:rFonts w:ascii="Consolas" w:hAnsi="Consolas"/>
-                <w:color w:val="6A9955"/>
-                <w:sz w:val="18"/>
-              </w:rPr>
               <w:t># Expected: 122.88 MHz Differential LVDS (Peak-to-Peak: 700 mVpp, Common-Mode: 1.25 V)</w:t>
-              <w:br/>
             </w:r>
           </w:p>
         </w:tc>
@@ -2035,7 +2116,7 @@
     </w:tbl>
     <w:p>
       <w:pPr>
-        <w:spacing w:before="0" w:after="80"/>
+        <w:spacing w:after="80"/>
       </w:pPr>
     </w:p>
     <w:tbl>
@@ -2046,7 +2127,7 @@
         <w:tblLook w:firstColumn="1" w:firstRow="1" w:lastColumn="0" w:lastRow="0" w:noHBand="0" w:noVBand="1" w:val="04A0"/>
       </w:tblPr>
       <w:tblGrid>
-        <w:gridCol w:w="9792"/>
+        <w:gridCol w:w="10080"/>
       </w:tblGrid>
       <w:tr>
         <w:tc>
@@ -2101,7 +2182,7 @@
     </w:tbl>
     <w:p>
       <w:pPr>
-        <w:spacing w:before="0" w:after="80"/>
+        <w:spacing w:after="80"/>
       </w:pPr>
     </w:p>
     <w:p>
@@ -2113,7 +2194,7 @@
           <w:rFonts w:ascii="Arial" w:hAnsi="Arial"/>
           <w:b/>
           <w:color w:val="003366"/>
-          <w:sz w:val="32"/>
+          <w:sz w:val="30"/>
         </w:rPr>
         <w:t>4. RF Frontend Component Repair &amp; SMT Replacement Procedures</w:t>
       </w:r>
@@ -2229,7 +2310,7 @@
           <w:rFonts w:ascii="Arial" w:hAnsi="Arial"/>
           <w:b/>
           <w:color w:val="003366"/>
-          <w:sz w:val="32"/>
+          <w:sz w:val="30"/>
         </w:rPr>
         <w:t>5. ADRV9009 BGA IC Rework &amp; Reflow Soldering Profile</w:t>
       </w:r>
@@ -2259,16 +2340,16 @@
         </w:tblBorders>
       </w:tblPr>
       <w:tblGrid>
-        <w:gridCol w:w="1958"/>
-        <w:gridCol w:w="1958"/>
-        <w:gridCol w:w="1958"/>
-        <w:gridCol w:w="1958"/>
-        <w:gridCol w:w="1958"/>
+        <w:gridCol w:w="2016"/>
+        <w:gridCol w:w="2016"/>
+        <w:gridCol w:w="2016"/>
+        <w:gridCol w:w="2016"/>
+        <w:gridCol w:w="2016"/>
       </w:tblGrid>
       <w:tr>
         <w:tc>
           <w:tcPr>
-            <w:tcW w:type="dxa" w:w="1958"/>
+            <w:tcW w:type="dxa" w:w="2016"/>
             <w:shd w:fill="003366"/>
             <w:tcMar>
               <w:top w:w="80" w:type="dxa"/>
@@ -2291,7 +2372,7 @@
         </w:tc>
         <w:tc>
           <w:tcPr>
-            <w:tcW w:type="dxa" w:w="1958"/>
+            <w:tcW w:type="dxa" w:w="2016"/>
             <w:shd w:fill="003366"/>
             <w:tcMar>
               <w:top w:w="80" w:type="dxa"/>
@@ -2314,7 +2395,7 @@
         </w:tc>
         <w:tc>
           <w:tcPr>
-            <w:tcW w:type="dxa" w:w="1958"/>
+            <w:tcW w:type="dxa" w:w="2016"/>
             <w:shd w:fill="003366"/>
             <w:tcMar>
               <w:top w:w="80" w:type="dxa"/>
@@ -2337,7 +2418,7 @@
         </w:tc>
         <w:tc>
           <w:tcPr>
-            <w:tcW w:type="dxa" w:w="1958"/>
+            <w:tcW w:type="dxa" w:w="2016"/>
             <w:shd w:fill="003366"/>
             <w:tcMar>
               <w:top w:w="80" w:type="dxa"/>
@@ -2360,7 +2441,7 @@
         </w:tc>
         <w:tc>
           <w:tcPr>
-            <w:tcW w:type="dxa" w:w="1958"/>
+            <w:tcW w:type="dxa" w:w="2016"/>
             <w:shd w:fill="003366"/>
             <w:tcMar>
               <w:top w:w="80" w:type="dxa"/>
@@ -2385,7 +2466,7 @@
       <w:tr>
         <w:tc>
           <w:tcPr>
-            <w:tcW w:type="dxa" w:w="1958"/>
+            <w:tcW w:type="dxa" w:w="2016"/>
             <w:shd w:fill="FFFFFF"/>
             <w:tcMar>
               <w:top w:w="40" w:type="dxa"/>
@@ -2408,7 +2489,7 @@
         </w:tc>
         <w:tc>
           <w:tcPr>
-            <w:tcW w:type="dxa" w:w="1958"/>
+            <w:tcW w:type="dxa" w:w="2016"/>
             <w:shd w:fill="FFFFFF"/>
             <w:tcMar>
               <w:top w:w="40" w:type="dxa"/>
@@ -2429,7 +2510,7 @@
         </w:tc>
         <w:tc>
           <w:tcPr>
-            <w:tcW w:type="dxa" w:w="1958"/>
+            <w:tcW w:type="dxa" w:w="2016"/>
             <w:shd w:fill="FFFFFF"/>
             <w:tcMar>
               <w:top w:w="40" w:type="dxa"/>
@@ -2450,7 +2531,7 @@
         </w:tc>
         <w:tc>
           <w:tcPr>
-            <w:tcW w:type="dxa" w:w="1958"/>
+            <w:tcW w:type="dxa" w:w="2016"/>
             <w:shd w:fill="FFFFFF"/>
             <w:tcMar>
               <w:top w:w="40" w:type="dxa"/>
@@ -2471,7 +2552,7 @@
         </w:tc>
         <w:tc>
           <w:tcPr>
-            <w:tcW w:type="dxa" w:w="1958"/>
+            <w:tcW w:type="dxa" w:w="2016"/>
             <w:shd w:fill="FFFFFF"/>
             <w:tcMar>
               <w:top w:w="40" w:type="dxa"/>
@@ -2494,7 +2575,7 @@
       <w:tr>
         <w:tc>
           <w:tcPr>
-            <w:tcW w:type="dxa" w:w="1958"/>
+            <w:tcW w:type="dxa" w:w="2016"/>
             <w:shd w:fill="F7FAFC"/>
             <w:tcMar>
               <w:top w:w="40" w:type="dxa"/>
@@ -2517,7 +2598,7 @@
         </w:tc>
         <w:tc>
           <w:tcPr>
-            <w:tcW w:type="dxa" w:w="1958"/>
+            <w:tcW w:type="dxa" w:w="2016"/>
             <w:shd w:fill="F7FAFC"/>
             <w:tcMar>
               <w:top w:w="40" w:type="dxa"/>
@@ -2538,7 +2619,7 @@
         </w:tc>
         <w:tc>
           <w:tcPr>
-            <w:tcW w:type="dxa" w:w="1958"/>
+            <w:tcW w:type="dxa" w:w="2016"/>
             <w:shd w:fill="F7FAFC"/>
             <w:tcMar>
               <w:top w:w="40" w:type="dxa"/>
@@ -2559,7 +2640,7 @@
         </w:tc>
         <w:tc>
           <w:tcPr>
-            <w:tcW w:type="dxa" w:w="1958"/>
+            <w:tcW w:type="dxa" w:w="2016"/>
             <w:shd w:fill="F7FAFC"/>
             <w:tcMar>
               <w:top w:w="40" w:type="dxa"/>
@@ -2580,7 +2661,7 @@
         </w:tc>
         <w:tc>
           <w:tcPr>
-            <w:tcW w:type="dxa" w:w="1958"/>
+            <w:tcW w:type="dxa" w:w="2016"/>
             <w:shd w:fill="F7FAFC"/>
             <w:tcMar>
               <w:top w:w="40" w:type="dxa"/>
@@ -2603,7 +2684,7 @@
       <w:tr>
         <w:tc>
           <w:tcPr>
-            <w:tcW w:type="dxa" w:w="1958"/>
+            <w:tcW w:type="dxa" w:w="2016"/>
             <w:shd w:fill="FFFFFF"/>
             <w:tcMar>
               <w:top w:w="40" w:type="dxa"/>
@@ -2626,7 +2707,7 @@
         </w:tc>
         <w:tc>
           <w:tcPr>
-            <w:tcW w:type="dxa" w:w="1958"/>
+            <w:tcW w:type="dxa" w:w="2016"/>
             <w:shd w:fill="FFFFFF"/>
             <w:tcMar>
               <w:top w:w="40" w:type="dxa"/>
@@ -2647,7 +2728,7 @@
         </w:tc>
         <w:tc>
           <w:tcPr>
-            <w:tcW w:type="dxa" w:w="1958"/>
+            <w:tcW w:type="dxa" w:w="2016"/>
             <w:shd w:fill="FFFFFF"/>
             <w:tcMar>
               <w:top w:w="40" w:type="dxa"/>
@@ -2668,7 +2749,7 @@
         </w:tc>
         <w:tc>
           <w:tcPr>
-            <w:tcW w:type="dxa" w:w="1958"/>
+            <w:tcW w:type="dxa" w:w="2016"/>
             <w:shd w:fill="FFFFFF"/>
             <w:tcMar>
               <w:top w:w="40" w:type="dxa"/>
@@ -2689,7 +2770,7 @@
         </w:tc>
         <w:tc>
           <w:tcPr>
-            <w:tcW w:type="dxa" w:w="1958"/>
+            <w:tcW w:type="dxa" w:w="2016"/>
             <w:shd w:fill="FFFFFF"/>
             <w:tcMar>
               <w:top w:w="40" w:type="dxa"/>
@@ -2712,7 +2793,7 @@
       <w:tr>
         <w:tc>
           <w:tcPr>
-            <w:tcW w:type="dxa" w:w="1958"/>
+            <w:tcW w:type="dxa" w:w="2016"/>
             <w:shd w:fill="F7FAFC"/>
             <w:tcMar>
               <w:top w:w="40" w:type="dxa"/>
@@ -2735,7 +2816,7 @@
         </w:tc>
         <w:tc>
           <w:tcPr>
-            <w:tcW w:type="dxa" w:w="1958"/>
+            <w:tcW w:type="dxa" w:w="2016"/>
             <w:shd w:fill="F7FAFC"/>
             <w:tcMar>
               <w:top w:w="40" w:type="dxa"/>
@@ -2756,7 +2837,7 @@
         </w:tc>
         <w:tc>
           <w:tcPr>
-            <w:tcW w:type="dxa" w:w="1958"/>
+            <w:tcW w:type="dxa" w:w="2016"/>
             <w:shd w:fill="F7FAFC"/>
             <w:tcMar>
               <w:top w:w="40" w:type="dxa"/>
@@ -2777,7 +2858,7 @@
         </w:tc>
         <w:tc>
           <w:tcPr>
-            <w:tcW w:type="dxa" w:w="1958"/>
+            <w:tcW w:type="dxa" w:w="2016"/>
             <w:shd w:fill="F7FAFC"/>
             <w:tcMar>
               <w:top w:w="40" w:type="dxa"/>
@@ -2798,7 +2879,7 @@
         </w:tc>
         <w:tc>
           <w:tcPr>
-            <w:tcW w:type="dxa" w:w="1958"/>
+            <w:tcW w:type="dxa" w:w="2016"/>
             <w:shd w:fill="F7FAFC"/>
             <w:tcMar>
               <w:top w:w="40" w:type="dxa"/>
@@ -2821,7 +2902,7 @@
       <w:tr>
         <w:tc>
           <w:tcPr>
-            <w:tcW w:type="dxa" w:w="1958"/>
+            <w:tcW w:type="dxa" w:w="2016"/>
             <w:shd w:fill="FFFFFF"/>
             <w:tcMar>
               <w:top w:w="40" w:type="dxa"/>
@@ -2844,7 +2925,7 @@
         </w:tc>
         <w:tc>
           <w:tcPr>
-            <w:tcW w:type="dxa" w:w="1958"/>
+            <w:tcW w:type="dxa" w:w="2016"/>
             <w:shd w:fill="FFFFFF"/>
             <w:tcMar>
               <w:top w:w="40" w:type="dxa"/>
@@ -2865,7 +2946,7 @@
         </w:tc>
         <w:tc>
           <w:tcPr>
-            <w:tcW w:type="dxa" w:w="1958"/>
+            <w:tcW w:type="dxa" w:w="2016"/>
             <w:shd w:fill="FFFFFF"/>
             <w:tcMar>
               <w:top w:w="40" w:type="dxa"/>
@@ -2886,7 +2967,7 @@
         </w:tc>
         <w:tc>
           <w:tcPr>
-            <w:tcW w:type="dxa" w:w="1958"/>
+            <w:tcW w:type="dxa" w:w="2016"/>
             <w:shd w:fill="FFFFFF"/>
             <w:tcMar>
               <w:top w:w="40" w:type="dxa"/>
@@ -2907,7 +2988,7 @@
         </w:tc>
         <w:tc>
           <w:tcPr>
-            <w:tcW w:type="dxa" w:w="1958"/>
+            <w:tcW w:type="dxa" w:w="2016"/>
             <w:shd w:fill="FFFFFF"/>
             <w:tcMar>
               <w:top w:w="40" w:type="dxa"/>
@@ -2930,8 +3011,64 @@
     </w:tbl>
     <w:p>
       <w:pPr>
-        <w:spacing w:after="120"/>
+        <w:spacing w:after="160"/>
       </w:pPr>
+    </w:p>
+    <w:p>
+      <w:pPr>
+        <w:keepNext/>
+        <w:spacing w:before="160" w:after="40"/>
+        <w:jc w:val="center"/>
+      </w:pPr>
+      <w:r>
+        <w:drawing>
+          <wp:inline xmlns:a="http://schemas.openxmlformats.org/drawingml/2006/main" xmlns:pic="http://schemas.openxmlformats.org/drawingml/2006/picture">
+            <wp:extent cx="5486400" cy="3181190"/>
+            <wp:docPr id="4" name="Picture 4"/>
+            <wp:cNvGraphicFramePr>
+              <a:graphicFrameLocks noChangeAspect="1"/>
+            </wp:cNvGraphicFramePr>
+            <a:graphic>
+              <a:graphicData uri="http://schemas.openxmlformats.org/drawingml/2006/picture">
+                <pic:pic>
+                  <pic:nvPicPr>
+                    <pic:cNvPr id="0" name="adrv9009_bga_rework_thermal_profile.png"/>
+                    <pic:cNvPicPr/>
+                  </pic:nvPicPr>
+                  <pic:blipFill>
+                    <a:blip r:embed="rId12"/>
+                    <a:stretch>
+                      <a:fillRect/>
+                    </a:stretch>
+                  </pic:blipFill>
+                  <pic:spPr>
+                    <a:xfrm>
+                      <a:off x="0" y="0"/>
+                      <a:ext cx="5486400" cy="3181190"/>
+                    </a:xfrm>
+                    <a:prstGeom prst="rect"/>
+                  </pic:spPr>
+                </pic:pic>
+              </a:graphicData>
+            </a:graphic>
+          </wp:inline>
+        </w:drawing>
+      </w:r>
+    </w:p>
+    <w:p>
+      <w:pPr>
+        <w:spacing w:before="40" w:after="200"/>
+        <w:jc w:val="center"/>
+      </w:pPr>
+      <w:r>
+        <w:rPr>
+          <w:rFonts w:ascii="Arial" w:hAnsi="Arial"/>
+          <w:i/>
+          <w:color w:val="505A64"/>
+          <w:sz w:val="18"/>
+        </w:rPr>
+        <w:t>Figure 1.4: ADRV9009 196-Ball CSP_BGA Rework &amp; Soldering Thermal Profile (IPC-7711/7721 Standard SAC305 Lead-Free Alloy).</w:t>
+      </w:r>
     </w:p>
     <w:p>
       <w:pPr>
@@ -2942,7 +3079,7 @@
           <w:rFonts w:ascii="Arial" w:hAnsi="Arial"/>
           <w:b/>
           <w:color w:val="003366"/>
-          <w:sz w:val="32"/>
+          <w:sz w:val="30"/>
         </w:rPr>
         <w:t>6. Bill of Materials (BOM) &amp; Spare Parts Catalog</w:t>
       </w:r>
@@ -2953,7 +3090,7 @@
           <w:rFonts w:ascii="Arial" w:hAnsi="Arial"/>
           <w:sz w:val="20"/>
         </w:rPr>
-        <w:t>Table 6.1 lists the approved manufacturer part numbers for critical onboard active components:</w:t>
+        <w:t>Table 6.1 lists the approved manufacturer part numbers for critical onboard active and passive components:</w:t>
       </w:r>
     </w:p>
     <w:tbl>
@@ -2972,16 +3109,16 @@
         </w:tblBorders>
       </w:tblPr>
       <w:tblGrid>
-        <w:gridCol w:w="1958"/>
-        <w:gridCol w:w="1958"/>
-        <w:gridCol w:w="1958"/>
-        <w:gridCol w:w="1958"/>
-        <w:gridCol w:w="1958"/>
+        <w:gridCol w:w="2016"/>
+        <w:gridCol w:w="2016"/>
+        <w:gridCol w:w="2016"/>
+        <w:gridCol w:w="2016"/>
+        <w:gridCol w:w="2016"/>
       </w:tblGrid>
       <w:tr>
         <w:tc>
           <w:tcPr>
-            <w:tcW w:type="dxa" w:w="1958"/>
+            <w:tcW w:type="dxa" w:w="2016"/>
             <w:shd w:fill="003366"/>
             <w:tcMar>
               <w:top w:w="80" w:type="dxa"/>
@@ -3004,7 +3141,7 @@
         </w:tc>
         <w:tc>
           <w:tcPr>
-            <w:tcW w:type="dxa" w:w="1958"/>
+            <w:tcW w:type="dxa" w:w="2016"/>
             <w:shd w:fill="003366"/>
             <w:tcMar>
               <w:top w:w="80" w:type="dxa"/>
@@ -3027,7 +3164,7 @@
         </w:tc>
         <w:tc>
           <w:tcPr>
-            <w:tcW w:type="dxa" w:w="1958"/>
+            <w:tcW w:type="dxa" w:w="2016"/>
             <w:shd w:fill="003366"/>
             <w:tcMar>
               <w:top w:w="80" w:type="dxa"/>
@@ -3050,7 +3187,7 @@
         </w:tc>
         <w:tc>
           <w:tcPr>
-            <w:tcW w:type="dxa" w:w="1958"/>
+            <w:tcW w:type="dxa" w:w="2016"/>
             <w:shd w:fill="003366"/>
             <w:tcMar>
               <w:top w:w="80" w:type="dxa"/>
@@ -3073,7 +3210,7 @@
         </w:tc>
         <w:tc>
           <w:tcPr>
-            <w:tcW w:type="dxa" w:w="1958"/>
+            <w:tcW w:type="dxa" w:w="2016"/>
             <w:shd w:fill="003366"/>
             <w:tcMar>
               <w:top w:w="80" w:type="dxa"/>
@@ -3098,7 +3235,7 @@
       <w:tr>
         <w:tc>
           <w:tcPr>
-            <w:tcW w:type="dxa" w:w="1958"/>
+            <w:tcW w:type="dxa" w:w="2016"/>
             <w:shd w:fill="FFFFFF"/>
             <w:tcMar>
               <w:top w:w="40" w:type="dxa"/>
@@ -3121,7 +3258,7 @@
         </w:tc>
         <w:tc>
           <w:tcPr>
-            <w:tcW w:type="dxa" w:w="1958"/>
+            <w:tcW w:type="dxa" w:w="2016"/>
             <w:shd w:fill="FFFFFF"/>
             <w:tcMar>
               <w:top w:w="40" w:type="dxa"/>
@@ -3142,7 +3279,7 @@
         </w:tc>
         <w:tc>
           <w:tcPr>
-            <w:tcW w:type="dxa" w:w="1958"/>
+            <w:tcW w:type="dxa" w:w="2016"/>
             <w:shd w:fill="FFFFFF"/>
             <w:tcMar>
               <w:top w:w="40" w:type="dxa"/>
@@ -3163,7 +3300,7 @@
         </w:tc>
         <w:tc>
           <w:tcPr>
-            <w:tcW w:type="dxa" w:w="1958"/>
+            <w:tcW w:type="dxa" w:w="2016"/>
             <w:shd w:fill="FFFFFF"/>
             <w:tcMar>
               <w:top w:w="40" w:type="dxa"/>
@@ -3184,7 +3321,7 @@
         </w:tc>
         <w:tc>
           <w:tcPr>
-            <w:tcW w:type="dxa" w:w="1958"/>
+            <w:tcW w:type="dxa" w:w="2016"/>
             <w:shd w:fill="FFFFFF"/>
             <w:tcMar>
               <w:top w:w="40" w:type="dxa"/>
@@ -3207,7 +3344,7 @@
       <w:tr>
         <w:tc>
           <w:tcPr>
-            <w:tcW w:type="dxa" w:w="1958"/>
+            <w:tcW w:type="dxa" w:w="2016"/>
             <w:shd w:fill="F7FAFC"/>
             <w:tcMar>
               <w:top w:w="40" w:type="dxa"/>
@@ -3230,7 +3367,7 @@
         </w:tc>
         <w:tc>
           <w:tcPr>
-            <w:tcW w:type="dxa" w:w="1958"/>
+            <w:tcW w:type="dxa" w:w="2016"/>
             <w:shd w:fill="F7FAFC"/>
             <w:tcMar>
               <w:top w:w="40" w:type="dxa"/>
@@ -3251,7 +3388,7 @@
         </w:tc>
         <w:tc>
           <w:tcPr>
-            <w:tcW w:type="dxa" w:w="1958"/>
+            <w:tcW w:type="dxa" w:w="2016"/>
             <w:shd w:fill="F7FAFC"/>
             <w:tcMar>
               <w:top w:w="40" w:type="dxa"/>
@@ -3272,7 +3409,7 @@
         </w:tc>
         <w:tc>
           <w:tcPr>
-            <w:tcW w:type="dxa" w:w="1958"/>
+            <w:tcW w:type="dxa" w:w="2016"/>
             <w:shd w:fill="F7FAFC"/>
             <w:tcMar>
               <w:top w:w="40" w:type="dxa"/>
@@ -3293,7 +3430,7 @@
         </w:tc>
         <w:tc>
           <w:tcPr>
-            <w:tcW w:type="dxa" w:w="1958"/>
+            <w:tcW w:type="dxa" w:w="2016"/>
             <w:shd w:fill="F7FAFC"/>
             <w:tcMar>
               <w:top w:w="40" w:type="dxa"/>
@@ -3316,7 +3453,7 @@
       <w:tr>
         <w:tc>
           <w:tcPr>
-            <w:tcW w:type="dxa" w:w="1958"/>
+            <w:tcW w:type="dxa" w:w="2016"/>
             <w:shd w:fill="FFFFFF"/>
             <w:tcMar>
               <w:top w:w="40" w:type="dxa"/>
@@ -3339,7 +3476,7 @@
         </w:tc>
         <w:tc>
           <w:tcPr>
-            <w:tcW w:type="dxa" w:w="1958"/>
+            <w:tcW w:type="dxa" w:w="2016"/>
             <w:shd w:fill="FFFFFF"/>
             <w:tcMar>
               <w:top w:w="40" w:type="dxa"/>
@@ -3360,7 +3497,7 @@
         </w:tc>
         <w:tc>
           <w:tcPr>
-            <w:tcW w:type="dxa" w:w="1958"/>
+            <w:tcW w:type="dxa" w:w="2016"/>
             <w:shd w:fill="FFFFFF"/>
             <w:tcMar>
               <w:top w:w="40" w:type="dxa"/>
@@ -3381,7 +3518,7 @@
         </w:tc>
         <w:tc>
           <w:tcPr>
-            <w:tcW w:type="dxa" w:w="1958"/>
+            <w:tcW w:type="dxa" w:w="2016"/>
             <w:shd w:fill="FFFFFF"/>
             <w:tcMar>
               <w:top w:w="40" w:type="dxa"/>
@@ -3402,7 +3539,7 @@
         </w:tc>
         <w:tc>
           <w:tcPr>
-            <w:tcW w:type="dxa" w:w="1958"/>
+            <w:tcW w:type="dxa" w:w="2016"/>
             <w:shd w:fill="FFFFFF"/>
             <w:tcMar>
               <w:top w:w="40" w:type="dxa"/>
@@ -3425,7 +3562,7 @@
       <w:tr>
         <w:tc>
           <w:tcPr>
-            <w:tcW w:type="dxa" w:w="1958"/>
+            <w:tcW w:type="dxa" w:w="2016"/>
             <w:shd w:fill="F7FAFC"/>
             <w:tcMar>
               <w:top w:w="40" w:type="dxa"/>
@@ -3448,7 +3585,7 @@
         </w:tc>
         <w:tc>
           <w:tcPr>
-            <w:tcW w:type="dxa" w:w="1958"/>
+            <w:tcW w:type="dxa" w:w="2016"/>
             <w:shd w:fill="F7FAFC"/>
             <w:tcMar>
               <w:top w:w="40" w:type="dxa"/>
@@ -3469,7 +3606,7 @@
         </w:tc>
         <w:tc>
           <w:tcPr>
-            <w:tcW w:type="dxa" w:w="1958"/>
+            <w:tcW w:type="dxa" w:w="2016"/>
             <w:shd w:fill="F7FAFC"/>
             <w:tcMar>
               <w:top w:w="40" w:type="dxa"/>
@@ -3490,7 +3627,7 @@
         </w:tc>
         <w:tc>
           <w:tcPr>
-            <w:tcW w:type="dxa" w:w="1958"/>
+            <w:tcW w:type="dxa" w:w="2016"/>
             <w:shd w:fill="F7FAFC"/>
             <w:tcMar>
               <w:top w:w="40" w:type="dxa"/>
@@ -3511,7 +3648,7 @@
         </w:tc>
         <w:tc>
           <w:tcPr>
-            <w:tcW w:type="dxa" w:w="1958"/>
+            <w:tcW w:type="dxa" w:w="2016"/>
             <w:shd w:fill="F7FAFC"/>
             <w:tcMar>
               <w:top w:w="40" w:type="dxa"/>
@@ -3534,7 +3671,7 @@
       <w:tr>
         <w:tc>
           <w:tcPr>
-            <w:tcW w:type="dxa" w:w="1958"/>
+            <w:tcW w:type="dxa" w:w="2016"/>
             <w:shd w:fill="FFFFFF"/>
             <w:tcMar>
               <w:top w:w="40" w:type="dxa"/>
@@ -3557,7 +3694,7 @@
         </w:tc>
         <w:tc>
           <w:tcPr>
-            <w:tcW w:type="dxa" w:w="1958"/>
+            <w:tcW w:type="dxa" w:w="2016"/>
             <w:shd w:fill="FFFFFF"/>
             <w:tcMar>
               <w:top w:w="40" w:type="dxa"/>
@@ -3578,7 +3715,7 @@
         </w:tc>
         <w:tc>
           <w:tcPr>
-            <w:tcW w:type="dxa" w:w="1958"/>
+            <w:tcW w:type="dxa" w:w="2016"/>
             <w:shd w:fill="FFFFFF"/>
             <w:tcMar>
               <w:top w:w="40" w:type="dxa"/>
@@ -3599,7 +3736,7 @@
         </w:tc>
         <w:tc>
           <w:tcPr>
-            <w:tcW w:type="dxa" w:w="1958"/>
+            <w:tcW w:type="dxa" w:w="2016"/>
             <w:shd w:fill="FFFFFF"/>
             <w:tcMar>
               <w:top w:w="40" w:type="dxa"/>
@@ -3620,7 +3757,7 @@
         </w:tc>
         <w:tc>
           <w:tcPr>
-            <w:tcW w:type="dxa" w:w="1958"/>
+            <w:tcW w:type="dxa" w:w="2016"/>
             <w:shd w:fill="FFFFFF"/>
             <w:tcMar>
               <w:top w:w="40" w:type="dxa"/>
@@ -3643,7 +3780,7 @@
       <w:tr>
         <w:tc>
           <w:tcPr>
-            <w:tcW w:type="dxa" w:w="1958"/>
+            <w:tcW w:type="dxa" w:w="2016"/>
             <w:shd w:fill="F7FAFC"/>
             <w:tcMar>
               <w:top w:w="40" w:type="dxa"/>
@@ -3666,7 +3803,7 @@
         </w:tc>
         <w:tc>
           <w:tcPr>
-            <w:tcW w:type="dxa" w:w="1958"/>
+            <w:tcW w:type="dxa" w:w="2016"/>
             <w:shd w:fill="F7FAFC"/>
             <w:tcMar>
               <w:top w:w="40" w:type="dxa"/>
@@ -3687,7 +3824,7 @@
         </w:tc>
         <w:tc>
           <w:tcPr>
-            <w:tcW w:type="dxa" w:w="1958"/>
+            <w:tcW w:type="dxa" w:w="2016"/>
             <w:shd w:fill="F7FAFC"/>
             <w:tcMar>
               <w:top w:w="40" w:type="dxa"/>
@@ -3708,7 +3845,7 @@
         </w:tc>
         <w:tc>
           <w:tcPr>
-            <w:tcW w:type="dxa" w:w="1958"/>
+            <w:tcW w:type="dxa" w:w="2016"/>
             <w:shd w:fill="F7FAFC"/>
             <w:tcMar>
               <w:top w:w="40" w:type="dxa"/>
@@ -3729,7 +3866,7 @@
         </w:tc>
         <w:tc>
           <w:tcPr>
-            <w:tcW w:type="dxa" w:w="1958"/>
+            <w:tcW w:type="dxa" w:w="2016"/>
             <w:shd w:fill="F7FAFC"/>
             <w:tcMar>
               <w:top w:w="40" w:type="dxa"/>
@@ -3752,7 +3889,7 @@
       <w:tr>
         <w:tc>
           <w:tcPr>
-            <w:tcW w:type="dxa" w:w="1958"/>
+            <w:tcW w:type="dxa" w:w="2016"/>
             <w:shd w:fill="FFFFFF"/>
             <w:tcMar>
               <w:top w:w="40" w:type="dxa"/>
@@ -3775,7 +3912,7 @@
         </w:tc>
         <w:tc>
           <w:tcPr>
-            <w:tcW w:type="dxa" w:w="1958"/>
+            <w:tcW w:type="dxa" w:w="2016"/>
             <w:shd w:fill="FFFFFF"/>
             <w:tcMar>
               <w:top w:w="40" w:type="dxa"/>
@@ -3796,7 +3933,7 @@
         </w:tc>
         <w:tc>
           <w:tcPr>
-            <w:tcW w:type="dxa" w:w="1958"/>
+            <w:tcW w:type="dxa" w:w="2016"/>
             <w:shd w:fill="FFFFFF"/>
             <w:tcMar>
               <w:top w:w="40" w:type="dxa"/>
@@ -3817,7 +3954,7 @@
         </w:tc>
         <w:tc>
           <w:tcPr>
-            <w:tcW w:type="dxa" w:w="1958"/>
+            <w:tcW w:type="dxa" w:w="2016"/>
             <w:shd w:fill="FFFFFF"/>
             <w:tcMar>
               <w:top w:w="40" w:type="dxa"/>
@@ -3838,7 +3975,7 @@
         </w:tc>
         <w:tc>
           <w:tcPr>
-            <w:tcW w:type="dxa" w:w="1958"/>
+            <w:tcW w:type="dxa" w:w="2016"/>
             <w:shd w:fill="FFFFFF"/>
             <w:tcMar>
               <w:top w:w="40" w:type="dxa"/>
@@ -3863,6 +4000,85 @@
       <w:pPr>
         <w:spacing w:after="160"/>
       </w:pPr>
+    </w:p>
+    <w:p>
+      <w:pPr>
+        <w:pStyle w:val="Heading1"/>
+      </w:pPr>
+      <w:r>
+        <w:rPr>
+          <w:rFonts w:ascii="Arial" w:hAnsi="Arial"/>
+          <w:b/>
+          <w:color w:val="003366"/>
+          <w:sz w:val="30"/>
+        </w:rPr>
+        <w:t>7. Complete Hardware Troubleshooting &amp; Diagnostic Flowchart</w:t>
+      </w:r>
+    </w:p>
+    <w:p>
+      <w:r>
+        <w:rPr>
+          <w:rFonts w:ascii="Arial" w:hAnsi="Arial"/>
+          <w:sz w:val="20"/>
+        </w:rPr>
+        <w:t>Figure 1.5 provides the comprehensive step-by-step troubleshooting sequence for field and laboratory repair technicians, covering power entry verification, voltage rail testing, clock stability check, and RF transmission path validation:</w:t>
+      </w:r>
+    </w:p>
+    <w:p>
+      <w:pPr>
+        <w:keepNext/>
+        <w:spacing w:before="160" w:after="40"/>
+        <w:jc w:val="center"/>
+      </w:pPr>
+      <w:r>
+        <w:drawing>
+          <wp:inline xmlns:a="http://schemas.openxmlformats.org/drawingml/2006/main" xmlns:pic="http://schemas.openxmlformats.org/drawingml/2006/picture">
+            <wp:extent cx="5669280" cy="4445694"/>
+            <wp:docPr id="5" name="Picture 5"/>
+            <wp:cNvGraphicFramePr>
+              <a:graphicFrameLocks noChangeAspect="1"/>
+            </wp:cNvGraphicFramePr>
+            <a:graphic>
+              <a:graphicData uri="http://schemas.openxmlformats.org/drawingml/2006/picture">
+                <pic:pic>
+                  <pic:nvPicPr>
+                    <pic:cNvPr id="0" name="adrv9009_hardware_troubleshooting_flowchart.png"/>
+                    <pic:cNvPicPr/>
+                  </pic:nvPicPr>
+                  <pic:blipFill>
+                    <a:blip r:embed="rId13"/>
+                    <a:stretch>
+                      <a:fillRect/>
+                    </a:stretch>
+                  </pic:blipFill>
+                  <pic:spPr>
+                    <a:xfrm>
+                      <a:off x="0" y="0"/>
+                      <a:ext cx="5669280" cy="4445694"/>
+                    </a:xfrm>
+                    <a:prstGeom prst="rect"/>
+                  </pic:spPr>
+                </pic:pic>
+              </a:graphicData>
+            </a:graphic>
+          </wp:inline>
+        </w:drawing>
+      </w:r>
+    </w:p>
+    <w:p>
+      <w:pPr>
+        <w:spacing w:before="40" w:after="200"/>
+        <w:jc w:val="center"/>
+      </w:pPr>
+      <w:r>
+        <w:rPr>
+          <w:rFonts w:ascii="Arial" w:hAnsi="Arial"/>
+          <w:i/>
+          <w:color w:val="505A64"/>
+          <w:sz w:val="18"/>
+        </w:rPr>
+        <w:t>Figure 1.5: End-to-End ADRV9009 Hardware System Troubleshooting &amp; Fault Isolation Flowchart.</w:t>
+      </w:r>
     </w:p>
     <w:p>
       <w:r>
@@ -3900,11 +4116,11 @@
           <w:rFonts w:ascii="Vazirmatn" w:hAnsi="Vazirmatn"/>
           <w:b w:val="0"/>
           <w:color w:val="5A646E"/>
-          <w:sz w:val="22"/>
+          <w:sz w:val="21"/>
           <w:rFonts w:ascii="Vazirmatn" w:hAnsi="Vazirmatn" w:cs="Vazirmatn"/>
           <w:rtl/>
         </w:rPr>
-        <w:t>مستندات استاندارد پایش دوره‌ای، عیب‌یابی خطوط تغذیه، تعویض قطعات SMT/BGA، پروفایل ریفلو و جدول قطعات یدکی</w:t>
+        <w:t>مستندات استاندارد پایش دوره‌ای، شماتیک نقاط تست، نقشه‌های لایه‌های PCB، پروفایل ریورک BGA و فلوچارت‌های عیب‌یابی</w:t>
       </w:r>
     </w:p>
     <w:p>
@@ -3922,7 +4138,7 @@
           <w:rFonts w:ascii="Vazirmatn" w:hAnsi="Vazirmatn" w:cs="Vazirmatn"/>
           <w:rtl/>
         </w:rPr>
-        <w:t>۱. زمان‌بندی نگهداری پیشگیرانه و بازرسی چشمی</w:t>
+        <w:t>۱. زمان‌بندی نگهداری پیشگیرانه و استانداردهای بازرسی چشمی</w:t>
       </w:r>
     </w:p>
     <w:p>
@@ -3958,15 +4174,15 @@
         </w:tblBorders>
       </w:tblPr>
       <w:tblGrid>
-        <w:gridCol w:w="2448"/>
-        <w:gridCol w:w="2448"/>
-        <w:gridCol w:w="2448"/>
-        <w:gridCol w:w="2448"/>
+        <w:gridCol w:w="2520"/>
+        <w:gridCol w:w="2520"/>
+        <w:gridCol w:w="2520"/>
+        <w:gridCol w:w="2520"/>
       </w:tblGrid>
       <w:tr>
         <w:tc>
           <w:tcPr>
-            <w:tcW w:type="dxa" w:w="2448"/>
+            <w:tcW w:type="dxa" w:w="2520"/>
             <w:shd w:fill="003366"/>
             <w:tcMar>
               <w:top w:w="80" w:type="dxa"/>
@@ -3995,7 +4211,7 @@
         </w:tc>
         <w:tc>
           <w:tcPr>
-            <w:tcW w:type="dxa" w:w="2448"/>
+            <w:tcW w:type="dxa" w:w="2520"/>
             <w:shd w:fill="003366"/>
             <w:tcMar>
               <w:top w:w="80" w:type="dxa"/>
@@ -4024,7 +4240,7 @@
         </w:tc>
         <w:tc>
           <w:tcPr>
-            <w:tcW w:type="dxa" w:w="2448"/>
+            <w:tcW w:type="dxa" w:w="2520"/>
             <w:shd w:fill="003366"/>
             <w:tcMar>
               <w:top w:w="80" w:type="dxa"/>
@@ -4053,7 +4269,7 @@
         </w:tc>
         <w:tc>
           <w:tcPr>
-            <w:tcW w:type="dxa" w:w="2448"/>
+            <w:tcW w:type="dxa" w:w="2520"/>
             <w:shd w:fill="003366"/>
             <w:tcMar>
               <w:top w:w="80" w:type="dxa"/>
@@ -4084,7 +4300,7 @@
       <w:tr>
         <w:tc>
           <w:tcPr>
-            <w:tcW w:type="dxa" w:w="2448"/>
+            <w:tcW w:type="dxa" w:w="2520"/>
             <w:shd w:fill="FFFFFF"/>
             <w:tcMar>
               <w:top w:w="40" w:type="dxa"/>
@@ -4113,7 +4329,7 @@
         </w:tc>
         <w:tc>
           <w:tcPr>
-            <w:tcW w:type="dxa" w:w="2448"/>
+            <w:tcW w:type="dxa" w:w="2520"/>
             <w:shd w:fill="FFFFFF"/>
             <w:tcMar>
               <w:top w:w="40" w:type="dxa"/>
@@ -4142,7 +4358,7 @@
         </w:tc>
         <w:tc>
           <w:tcPr>
-            <w:tcW w:type="dxa" w:w="2448"/>
+            <w:tcW w:type="dxa" w:w="2520"/>
             <w:shd w:fill="FFFFFF"/>
             <w:tcMar>
               <w:top w:w="40" w:type="dxa"/>
@@ -4171,7 +4387,7 @@
         </w:tc>
         <w:tc>
           <w:tcPr>
-            <w:tcW w:type="dxa" w:w="2448"/>
+            <w:tcW w:type="dxa" w:w="2520"/>
             <w:shd w:fill="FFFFFF"/>
             <w:tcMar>
               <w:top w:w="40" w:type="dxa"/>
@@ -4202,7 +4418,7 @@
       <w:tr>
         <w:tc>
           <w:tcPr>
-            <w:tcW w:type="dxa" w:w="2448"/>
+            <w:tcW w:type="dxa" w:w="2520"/>
             <w:shd w:fill="F7FAFC"/>
             <w:tcMar>
               <w:top w:w="40" w:type="dxa"/>
@@ -4231,7 +4447,7 @@
         </w:tc>
         <w:tc>
           <w:tcPr>
-            <w:tcW w:type="dxa" w:w="2448"/>
+            <w:tcW w:type="dxa" w:w="2520"/>
             <w:shd w:fill="F7FAFC"/>
             <w:tcMar>
               <w:top w:w="40" w:type="dxa"/>
@@ -4260,7 +4476,7 @@
         </w:tc>
         <w:tc>
           <w:tcPr>
-            <w:tcW w:type="dxa" w:w="2448"/>
+            <w:tcW w:type="dxa" w:w="2520"/>
             <w:shd w:fill="F7FAFC"/>
             <w:tcMar>
               <w:top w:w="40" w:type="dxa"/>
@@ -4289,7 +4505,7 @@
         </w:tc>
         <w:tc>
           <w:tcPr>
-            <w:tcW w:type="dxa" w:w="2448"/>
+            <w:tcW w:type="dxa" w:w="2520"/>
             <w:shd w:fill="F7FAFC"/>
             <w:tcMar>
               <w:top w:w="40" w:type="dxa"/>
@@ -4320,7 +4536,7 @@
       <w:tr>
         <w:tc>
           <w:tcPr>
-            <w:tcW w:type="dxa" w:w="2448"/>
+            <w:tcW w:type="dxa" w:w="2520"/>
             <w:shd w:fill="FFFFFF"/>
             <w:tcMar>
               <w:top w:w="40" w:type="dxa"/>
@@ -4349,7 +4565,7 @@
         </w:tc>
         <w:tc>
           <w:tcPr>
-            <w:tcW w:type="dxa" w:w="2448"/>
+            <w:tcW w:type="dxa" w:w="2520"/>
             <w:shd w:fill="FFFFFF"/>
             <w:tcMar>
               <w:top w:w="40" w:type="dxa"/>
@@ -4378,7 +4594,7 @@
         </w:tc>
         <w:tc>
           <w:tcPr>
-            <w:tcW w:type="dxa" w:w="2448"/>
+            <w:tcW w:type="dxa" w:w="2520"/>
             <w:shd w:fill="FFFFFF"/>
             <w:tcMar>
               <w:top w:w="40" w:type="dxa"/>
@@ -4407,7 +4623,7 @@
         </w:tc>
         <w:tc>
           <w:tcPr>
-            <w:tcW w:type="dxa" w:w="2448"/>
+            <w:tcW w:type="dxa" w:w="2520"/>
             <w:shd w:fill="FFFFFF"/>
             <w:tcMar>
               <w:top w:w="40" w:type="dxa"/>
@@ -4438,7 +4654,7 @@
       <w:tr>
         <w:tc>
           <w:tcPr>
-            <w:tcW w:type="dxa" w:w="2448"/>
+            <w:tcW w:type="dxa" w:w="2520"/>
             <w:shd w:fill="F7FAFC"/>
             <w:tcMar>
               <w:top w:w="40" w:type="dxa"/>
@@ -4467,7 +4683,7 @@
         </w:tc>
         <w:tc>
           <w:tcPr>
-            <w:tcW w:type="dxa" w:w="2448"/>
+            <w:tcW w:type="dxa" w:w="2520"/>
             <w:shd w:fill="F7FAFC"/>
             <w:tcMar>
               <w:top w:w="40" w:type="dxa"/>
@@ -4496,7 +4712,7 @@
         </w:tc>
         <w:tc>
           <w:tcPr>
-            <w:tcW w:type="dxa" w:w="2448"/>
+            <w:tcW w:type="dxa" w:w="2520"/>
             <w:shd w:fill="F7FAFC"/>
             <w:tcMar>
               <w:top w:w="40" w:type="dxa"/>
@@ -4525,7 +4741,7 @@
         </w:tc>
         <w:tc>
           <w:tcPr>
-            <w:tcW w:type="dxa" w:w="2448"/>
+            <w:tcW w:type="dxa" w:w="2520"/>
             <w:shd w:fill="F7FAFC"/>
             <w:tcMar>
               <w:top w:w="40" w:type="dxa"/>
@@ -4556,7 +4772,7 @@
       <w:tr>
         <w:tc>
           <w:tcPr>
-            <w:tcW w:type="dxa" w:w="2448"/>
+            <w:tcW w:type="dxa" w:w="2520"/>
             <w:shd w:fill="FFFFFF"/>
             <w:tcMar>
               <w:top w:w="40" w:type="dxa"/>
@@ -4585,7 +4801,7 @@
         </w:tc>
         <w:tc>
           <w:tcPr>
-            <w:tcW w:type="dxa" w:w="2448"/>
+            <w:tcW w:type="dxa" w:w="2520"/>
             <w:shd w:fill="FFFFFF"/>
             <w:tcMar>
               <w:top w:w="40" w:type="dxa"/>
@@ -4614,7 +4830,7 @@
         </w:tc>
         <w:tc>
           <w:tcPr>
-            <w:tcW w:type="dxa" w:w="2448"/>
+            <w:tcW w:type="dxa" w:w="2520"/>
             <w:shd w:fill="FFFFFF"/>
             <w:tcMar>
               <w:top w:w="40" w:type="dxa"/>
@@ -4643,7 +4859,7 @@
         </w:tc>
         <w:tc>
           <w:tcPr>
-            <w:tcW w:type="dxa" w:w="2448"/>
+            <w:tcW w:type="dxa" w:w="2520"/>
             <w:shd w:fill="FFFFFF"/>
             <w:tcMar>
               <w:top w:w="40" w:type="dxa"/>
@@ -4692,7 +4908,24 @@
           <w:rFonts w:ascii="Vazirmatn" w:hAnsi="Vazirmatn" w:cs="Vazirmatn"/>
           <w:rtl/>
         </w:rPr>
-        <w:t>۲. عیب‌یابی خطوط تغذیه DC و جدول نقاط تست ولتاژ</w:t>
+        <w:t>۲. عیب‌یابی خطوط تغذیه DC، شماتیک نقاط تست و نقشه‌های PCB</w:t>
+      </w:r>
+    </w:p>
+    <w:p>
+      <w:pPr>
+        <w:bidi/>
+        <w:jc w:val="right"/>
+      </w:pPr>
+      <w:r>
+        <w:rPr>
+          <w:rFonts w:ascii="Vazirmatn" w:hAnsi="Vazirmatn"/>
+          <w:b w:val="0"/>
+          <w:color w:val="282828"/>
+          <w:sz w:val="20"/>
+          <w:rFonts w:ascii="Vazirmatn" w:hAnsi="Vazirmatn" w:cs="Vazirmatn"/>
+          <w:rtl/>
+        </w:rPr>
+        <w:t>خرابی در مدارات تغذیه و نوسان ولتاژهای کاری، شایع‌ترین عامل عدم پاسخ‌دهی یا خرابی برد فرستنده/گیرنده ADRV9009 است. جدول زیر مشخصات کامل نقاط تست ولتاژ (TP1 تا TP6)، تلرانس مجاز، حداکثر ریپل AC و منشأ خطاهای احتمالی را تشریح می‌نماید:</w:t>
       </w:r>
     </w:p>
     <w:tbl>
@@ -4711,17 +4944,17 @@
         </w:tblBorders>
       </w:tblPr>
       <w:tblGrid>
-        <w:gridCol w:w="1632"/>
-        <w:gridCol w:w="1632"/>
-        <w:gridCol w:w="1632"/>
-        <w:gridCol w:w="1632"/>
-        <w:gridCol w:w="1632"/>
-        <w:gridCol w:w="1632"/>
+        <w:gridCol w:w="1680"/>
+        <w:gridCol w:w="1680"/>
+        <w:gridCol w:w="1680"/>
+        <w:gridCol w:w="1680"/>
+        <w:gridCol w:w="1680"/>
+        <w:gridCol w:w="1680"/>
       </w:tblGrid>
       <w:tr>
         <w:tc>
           <w:tcPr>
-            <w:tcW w:type="dxa" w:w="1632"/>
+            <w:tcW w:type="dxa" w:w="1680"/>
             <w:shd w:fill="003366"/>
             <w:tcMar>
               <w:top w:w="80" w:type="dxa"/>
@@ -4750,7 +4983,7 @@
         </w:tc>
         <w:tc>
           <w:tcPr>
-            <w:tcW w:type="dxa" w:w="1632"/>
+            <w:tcW w:type="dxa" w:w="1680"/>
             <w:shd w:fill="003366"/>
             <w:tcMar>
               <w:top w:w="80" w:type="dxa"/>
@@ -4779,7 +5012,7 @@
         </w:tc>
         <w:tc>
           <w:tcPr>
-            <w:tcW w:type="dxa" w:w="1632"/>
+            <w:tcW w:type="dxa" w:w="1680"/>
             <w:shd w:fill="003366"/>
             <w:tcMar>
               <w:top w:w="80" w:type="dxa"/>
@@ -4808,7 +5041,7 @@
         </w:tc>
         <w:tc>
           <w:tcPr>
-            <w:tcW w:type="dxa" w:w="1632"/>
+            <w:tcW w:type="dxa" w:w="1680"/>
             <w:shd w:fill="003366"/>
             <w:tcMar>
               <w:top w:w="80" w:type="dxa"/>
@@ -4837,7 +5070,7 @@
         </w:tc>
         <w:tc>
           <w:tcPr>
-            <w:tcW w:type="dxa" w:w="1632"/>
+            <w:tcW w:type="dxa" w:w="1680"/>
             <w:shd w:fill="003366"/>
             <w:tcMar>
               <w:top w:w="80" w:type="dxa"/>
@@ -4866,7 +5099,7 @@
         </w:tc>
         <w:tc>
           <w:tcPr>
-            <w:tcW w:type="dxa" w:w="1632"/>
+            <w:tcW w:type="dxa" w:w="1680"/>
             <w:shd w:fill="003366"/>
             <w:tcMar>
               <w:top w:w="80" w:type="dxa"/>
@@ -4897,7 +5130,7 @@
       <w:tr>
         <w:tc>
           <w:tcPr>
-            <w:tcW w:type="dxa" w:w="1632"/>
+            <w:tcW w:type="dxa" w:w="1680"/>
             <w:shd w:fill="FFFFFF"/>
             <w:tcMar>
               <w:top w:w="40" w:type="dxa"/>
@@ -4926,7 +5159,7 @@
         </w:tc>
         <w:tc>
           <w:tcPr>
-            <w:tcW w:type="dxa" w:w="1632"/>
+            <w:tcW w:type="dxa" w:w="1680"/>
             <w:shd w:fill="FFFFFF"/>
             <w:tcMar>
               <w:top w:w="40" w:type="dxa"/>
@@ -4955,7 +5188,7 @@
         </w:tc>
         <w:tc>
           <w:tcPr>
-            <w:tcW w:type="dxa" w:w="1632"/>
+            <w:tcW w:type="dxa" w:w="1680"/>
             <w:shd w:fill="FFFFFF"/>
             <w:tcMar>
               <w:top w:w="40" w:type="dxa"/>
@@ -4984,7 +5217,7 @@
         </w:tc>
         <w:tc>
           <w:tcPr>
-            <w:tcW w:type="dxa" w:w="1632"/>
+            <w:tcW w:type="dxa" w:w="1680"/>
             <w:shd w:fill="FFFFFF"/>
             <w:tcMar>
               <w:top w:w="40" w:type="dxa"/>
@@ -5013,7 +5246,7 @@
         </w:tc>
         <w:tc>
           <w:tcPr>
-            <w:tcW w:type="dxa" w:w="1632"/>
+            <w:tcW w:type="dxa" w:w="1680"/>
             <w:shd w:fill="FFFFFF"/>
             <w:tcMar>
               <w:top w:w="40" w:type="dxa"/>
@@ -5042,7 +5275,7 @@
         </w:tc>
         <w:tc>
           <w:tcPr>
-            <w:tcW w:type="dxa" w:w="1632"/>
+            <w:tcW w:type="dxa" w:w="1680"/>
             <w:shd w:fill="FFFFFF"/>
             <w:tcMar>
               <w:top w:w="40" w:type="dxa"/>
@@ -5073,7 +5306,7 @@
       <w:tr>
         <w:tc>
           <w:tcPr>
-            <w:tcW w:type="dxa" w:w="1632"/>
+            <w:tcW w:type="dxa" w:w="1680"/>
             <w:shd w:fill="F7FAFC"/>
             <w:tcMar>
               <w:top w:w="40" w:type="dxa"/>
@@ -5102,7 +5335,7 @@
         </w:tc>
         <w:tc>
           <w:tcPr>
-            <w:tcW w:type="dxa" w:w="1632"/>
+            <w:tcW w:type="dxa" w:w="1680"/>
             <w:shd w:fill="F7FAFC"/>
             <w:tcMar>
               <w:top w:w="40" w:type="dxa"/>
@@ -5131,7 +5364,7 @@
         </w:tc>
         <w:tc>
           <w:tcPr>
-            <w:tcW w:type="dxa" w:w="1632"/>
+            <w:tcW w:type="dxa" w:w="1680"/>
             <w:shd w:fill="F7FAFC"/>
             <w:tcMar>
               <w:top w:w="40" w:type="dxa"/>
@@ -5160,7 +5393,7 @@
         </w:tc>
         <w:tc>
           <w:tcPr>
-            <w:tcW w:type="dxa" w:w="1632"/>
+            <w:tcW w:type="dxa" w:w="1680"/>
             <w:shd w:fill="F7FAFC"/>
             <w:tcMar>
               <w:top w:w="40" w:type="dxa"/>
@@ -5189,7 +5422,7 @@
         </w:tc>
         <w:tc>
           <w:tcPr>
-            <w:tcW w:type="dxa" w:w="1632"/>
+            <w:tcW w:type="dxa" w:w="1680"/>
             <w:shd w:fill="F7FAFC"/>
             <w:tcMar>
               <w:top w:w="40" w:type="dxa"/>
@@ -5218,7 +5451,7 @@
         </w:tc>
         <w:tc>
           <w:tcPr>
-            <w:tcW w:type="dxa" w:w="1632"/>
+            <w:tcW w:type="dxa" w:w="1680"/>
             <w:shd w:fill="F7FAFC"/>
             <w:tcMar>
               <w:top w:w="40" w:type="dxa"/>
@@ -5249,7 +5482,7 @@
       <w:tr>
         <w:tc>
           <w:tcPr>
-            <w:tcW w:type="dxa" w:w="1632"/>
+            <w:tcW w:type="dxa" w:w="1680"/>
             <w:shd w:fill="FFFFFF"/>
             <w:tcMar>
               <w:top w:w="40" w:type="dxa"/>
@@ -5278,7 +5511,7 @@
         </w:tc>
         <w:tc>
           <w:tcPr>
-            <w:tcW w:type="dxa" w:w="1632"/>
+            <w:tcW w:type="dxa" w:w="1680"/>
             <w:shd w:fill="FFFFFF"/>
             <w:tcMar>
               <w:top w:w="40" w:type="dxa"/>
@@ -5307,7 +5540,7 @@
         </w:tc>
         <w:tc>
           <w:tcPr>
-            <w:tcW w:type="dxa" w:w="1632"/>
+            <w:tcW w:type="dxa" w:w="1680"/>
             <w:shd w:fill="FFFFFF"/>
             <w:tcMar>
               <w:top w:w="40" w:type="dxa"/>
@@ -5336,7 +5569,7 @@
         </w:tc>
         <w:tc>
           <w:tcPr>
-            <w:tcW w:type="dxa" w:w="1632"/>
+            <w:tcW w:type="dxa" w:w="1680"/>
             <w:shd w:fill="FFFFFF"/>
             <w:tcMar>
               <w:top w:w="40" w:type="dxa"/>
@@ -5365,7 +5598,7 @@
         </w:tc>
         <w:tc>
           <w:tcPr>
-            <w:tcW w:type="dxa" w:w="1632"/>
+            <w:tcW w:type="dxa" w:w="1680"/>
             <w:shd w:fill="FFFFFF"/>
             <w:tcMar>
               <w:top w:w="40" w:type="dxa"/>
@@ -5394,7 +5627,7 @@
         </w:tc>
         <w:tc>
           <w:tcPr>
-            <w:tcW w:type="dxa" w:w="1632"/>
+            <w:tcW w:type="dxa" w:w="1680"/>
             <w:shd w:fill="FFFFFF"/>
             <w:tcMar>
               <w:top w:w="40" w:type="dxa"/>
@@ -5425,7 +5658,7 @@
       <w:tr>
         <w:tc>
           <w:tcPr>
-            <w:tcW w:type="dxa" w:w="1632"/>
+            <w:tcW w:type="dxa" w:w="1680"/>
             <w:shd w:fill="F7FAFC"/>
             <w:tcMar>
               <w:top w:w="40" w:type="dxa"/>
@@ -5454,7 +5687,7 @@
         </w:tc>
         <w:tc>
           <w:tcPr>
-            <w:tcW w:type="dxa" w:w="1632"/>
+            <w:tcW w:type="dxa" w:w="1680"/>
             <w:shd w:fill="F7FAFC"/>
             <w:tcMar>
               <w:top w:w="40" w:type="dxa"/>
@@ -5483,7 +5716,7 @@
         </w:tc>
         <w:tc>
           <w:tcPr>
-            <w:tcW w:type="dxa" w:w="1632"/>
+            <w:tcW w:type="dxa" w:w="1680"/>
             <w:shd w:fill="F7FAFC"/>
             <w:tcMar>
               <w:top w:w="40" w:type="dxa"/>
@@ -5512,7 +5745,7 @@
         </w:tc>
         <w:tc>
           <w:tcPr>
-            <w:tcW w:type="dxa" w:w="1632"/>
+            <w:tcW w:type="dxa" w:w="1680"/>
             <w:shd w:fill="F7FAFC"/>
             <w:tcMar>
               <w:top w:w="40" w:type="dxa"/>
@@ -5541,7 +5774,7 @@
         </w:tc>
         <w:tc>
           <w:tcPr>
-            <w:tcW w:type="dxa" w:w="1632"/>
+            <w:tcW w:type="dxa" w:w="1680"/>
             <w:shd w:fill="F7FAFC"/>
             <w:tcMar>
               <w:top w:w="40" w:type="dxa"/>
@@ -5570,7 +5803,7 @@
         </w:tc>
         <w:tc>
           <w:tcPr>
-            <w:tcW w:type="dxa" w:w="1632"/>
+            <w:tcW w:type="dxa" w:w="1680"/>
             <w:shd w:fill="F7FAFC"/>
             <w:tcMar>
               <w:top w:w="40" w:type="dxa"/>
@@ -5601,7 +5834,7 @@
       <w:tr>
         <w:tc>
           <w:tcPr>
-            <w:tcW w:type="dxa" w:w="1632"/>
+            <w:tcW w:type="dxa" w:w="1680"/>
             <w:shd w:fill="FFFFFF"/>
             <w:tcMar>
               <w:top w:w="40" w:type="dxa"/>
@@ -5630,7 +5863,7 @@
         </w:tc>
         <w:tc>
           <w:tcPr>
-            <w:tcW w:type="dxa" w:w="1632"/>
+            <w:tcW w:type="dxa" w:w="1680"/>
             <w:shd w:fill="FFFFFF"/>
             <w:tcMar>
               <w:top w:w="40" w:type="dxa"/>
@@ -5659,7 +5892,7 @@
         </w:tc>
         <w:tc>
           <w:tcPr>
-            <w:tcW w:type="dxa" w:w="1632"/>
+            <w:tcW w:type="dxa" w:w="1680"/>
             <w:shd w:fill="FFFFFF"/>
             <w:tcMar>
               <w:top w:w="40" w:type="dxa"/>
@@ -5688,7 +5921,7 @@
         </w:tc>
         <w:tc>
           <w:tcPr>
-            <w:tcW w:type="dxa" w:w="1632"/>
+            <w:tcW w:type="dxa" w:w="1680"/>
             <w:shd w:fill="FFFFFF"/>
             <w:tcMar>
               <w:top w:w="40" w:type="dxa"/>
@@ -5717,7 +5950,7 @@
         </w:tc>
         <w:tc>
           <w:tcPr>
-            <w:tcW w:type="dxa" w:w="1632"/>
+            <w:tcW w:type="dxa" w:w="1680"/>
             <w:shd w:fill="FFFFFF"/>
             <w:tcMar>
               <w:top w:w="40" w:type="dxa"/>
@@ -5746,7 +5979,7 @@
         </w:tc>
         <w:tc>
           <w:tcPr>
-            <w:tcW w:type="dxa" w:w="1632"/>
+            <w:tcW w:type="dxa" w:w="1680"/>
             <w:shd w:fill="FFFFFF"/>
             <w:tcMar>
               <w:top w:w="40" w:type="dxa"/>
@@ -5777,7 +6010,7 @@
       <w:tr>
         <w:tc>
           <w:tcPr>
-            <w:tcW w:type="dxa" w:w="1632"/>
+            <w:tcW w:type="dxa" w:w="1680"/>
             <w:shd w:fill="F7FAFC"/>
             <w:tcMar>
               <w:top w:w="40" w:type="dxa"/>
@@ -5806,7 +6039,7 @@
         </w:tc>
         <w:tc>
           <w:tcPr>
-            <w:tcW w:type="dxa" w:w="1632"/>
+            <w:tcW w:type="dxa" w:w="1680"/>
             <w:shd w:fill="F7FAFC"/>
             <w:tcMar>
               <w:top w:w="40" w:type="dxa"/>
@@ -5835,7 +6068,7 @@
         </w:tc>
         <w:tc>
           <w:tcPr>
-            <w:tcW w:type="dxa" w:w="1632"/>
+            <w:tcW w:type="dxa" w:w="1680"/>
             <w:shd w:fill="F7FAFC"/>
             <w:tcMar>
               <w:top w:w="40" w:type="dxa"/>
@@ -5864,7 +6097,7 @@
         </w:tc>
         <w:tc>
           <w:tcPr>
-            <w:tcW w:type="dxa" w:w="1632"/>
+            <w:tcW w:type="dxa" w:w="1680"/>
             <w:shd w:fill="F7FAFC"/>
             <w:tcMar>
               <w:top w:w="40" w:type="dxa"/>
@@ -5893,7 +6126,7 @@
         </w:tc>
         <w:tc>
           <w:tcPr>
-            <w:tcW w:type="dxa" w:w="1632"/>
+            <w:tcW w:type="dxa" w:w="1680"/>
             <w:shd w:fill="F7FAFC"/>
             <w:tcMar>
               <w:top w:w="40" w:type="dxa"/>
@@ -5922,7 +6155,7 @@
         </w:tc>
         <w:tc>
           <w:tcPr>
-            <w:tcW w:type="dxa" w:w="1632"/>
+            <w:tcW w:type="dxa" w:w="1680"/>
             <w:shd w:fill="F7FAFC"/>
             <w:tcMar>
               <w:top w:w="40" w:type="dxa"/>
@@ -5955,6 +6188,183 @@
       <w:pPr>
         <w:spacing w:after="160"/>
       </w:pPr>
+    </w:p>
+    <w:p>
+      <w:pPr>
+        <w:keepNext/>
+        <w:spacing w:before="160" w:after="40"/>
+        <w:jc w:val="center"/>
+      </w:pPr>
+      <w:r>
+        <w:drawing>
+          <wp:inline xmlns:a="http://schemas.openxmlformats.org/drawingml/2006/main" xmlns:pic="http://schemas.openxmlformats.org/drawingml/2006/picture">
+            <wp:extent cx="5669280" cy="3629971"/>
+            <wp:docPr id="6" name="Picture 6"/>
+            <wp:cNvGraphicFramePr>
+              <a:graphicFrameLocks noChangeAspect="1"/>
+            </wp:cNvGraphicFramePr>
+            <a:graphic>
+              <a:graphicData uri="http://schemas.openxmlformats.org/drawingml/2006/picture">
+                <pic:pic>
+                  <pic:nvPicPr>
+                    <pic:cNvPr id="0" name="adrv9009_power_tree_schematic.png"/>
+                    <pic:cNvPicPr/>
+                  </pic:nvPicPr>
+                  <pic:blipFill>
+                    <a:blip r:embed="rId9"/>
+                    <a:stretch>
+                      <a:fillRect/>
+                    </a:stretch>
+                  </pic:blipFill>
+                  <pic:spPr>
+                    <a:xfrm>
+                      <a:off x="0" y="0"/>
+                      <a:ext cx="5669280" cy="3629971"/>
+                    </a:xfrm>
+                    <a:prstGeom prst="rect"/>
+                  </pic:spPr>
+                </pic:pic>
+              </a:graphicData>
+            </a:graphic>
+          </wp:inline>
+        </w:drawing>
+      </w:r>
+    </w:p>
+    <w:p>
+      <w:pPr>
+        <w:spacing w:before="40" w:after="200"/>
+        <w:jc w:val="center"/>
+        <w:bidi/>
+      </w:pPr>
+      <w:r>
+        <w:rPr>
+          <w:rFonts w:ascii="Vazirmatn" w:hAnsi="Vazirmatn"/>
+          <w:b/>
+          <w:color w:val="505A64"/>
+          <w:sz w:val="18"/>
+          <w:rFonts w:ascii="Vazirmatn" w:hAnsi="Vazirmatn" w:cs="Vazirmatn"/>
+          <w:rtl/>
+        </w:rPr>
+        <w:t>شکل ۲.۱: شماتیک معماری مدار توزیع توان (Power Tree) و نقاط تست ولتاژ برد ADRV9009 شامل فیوز F1، رگولاتورهای ADP5054 و LT3045 و نقاط TP1 تا TP6.</w:t>
+      </w:r>
+    </w:p>
+    <w:p>
+      <w:pPr>
+        <w:keepNext/>
+        <w:spacing w:before="160" w:after="40"/>
+        <w:jc w:val="center"/>
+      </w:pPr>
+      <w:r>
+        <w:drawing>
+          <wp:inline xmlns:a="http://schemas.openxmlformats.org/drawingml/2006/main" xmlns:pic="http://schemas.openxmlformats.org/drawingml/2006/picture">
+            <wp:extent cx="5669280" cy="4037833"/>
+            <wp:docPr id="7" name="Picture 7"/>
+            <wp:cNvGraphicFramePr>
+              <a:graphicFrameLocks noChangeAspect="1"/>
+            </wp:cNvGraphicFramePr>
+            <a:graphic>
+              <a:graphicData uri="http://schemas.openxmlformats.org/drawingml/2006/picture">
+                <pic:pic>
+                  <pic:nvPicPr>
+                    <pic:cNvPr id="0" name="adrv9009_pcb_top_layer.png"/>
+                    <pic:cNvPicPr/>
+                  </pic:nvPicPr>
+                  <pic:blipFill>
+                    <a:blip r:embed="rId10"/>
+                    <a:stretch>
+                      <a:fillRect/>
+                    </a:stretch>
+                  </pic:blipFill>
+                  <pic:spPr>
+                    <a:xfrm>
+                      <a:off x="0" y="0"/>
+                      <a:ext cx="5669280" cy="4037833"/>
+                    </a:xfrm>
+                    <a:prstGeom prst="rect"/>
+                  </pic:spPr>
+                </pic:pic>
+              </a:graphicData>
+            </a:graphic>
+          </wp:inline>
+        </w:drawing>
+      </w:r>
+    </w:p>
+    <w:p>
+      <w:pPr>
+        <w:spacing w:before="40" w:after="200"/>
+        <w:jc w:val="center"/>
+        <w:bidi/>
+      </w:pPr>
+      <w:r>
+        <w:rPr>
+          <w:rFonts w:ascii="Vazirmatn" w:hAnsi="Vazirmatn"/>
+          <w:b/>
+          <w:color w:val="505A64"/>
+          <w:sz w:val="18"/>
+          <w:rFonts w:ascii="Vazirmatn" w:hAnsi="Vazirmatn" w:cs="Vazirmatn"/>
+          <w:rtl/>
+        </w:rPr>
+        <w:t>شکل ۲.۲: نقشه لایه روی برد (PCB Top Layer) و جانمایی فیوز ورودی F1، دیود محافظ TVS، تراشه‌های ADRV9009 و HMC7044، بالون‌ها و نقاط تست ولتاژ TP1 تا TP6.</w:t>
+      </w:r>
+    </w:p>
+    <w:p>
+      <w:pPr>
+        <w:keepNext/>
+        <w:spacing w:before="160" w:after="40"/>
+        <w:jc w:val="center"/>
+      </w:pPr>
+      <w:r>
+        <w:drawing>
+          <wp:inline xmlns:a="http://schemas.openxmlformats.org/drawingml/2006/main" xmlns:pic="http://schemas.openxmlformats.org/drawingml/2006/picture">
+            <wp:extent cx="5669280" cy="4037833"/>
+            <wp:docPr id="8" name="Picture 8"/>
+            <wp:cNvGraphicFramePr>
+              <a:graphicFrameLocks noChangeAspect="1"/>
+            </wp:cNvGraphicFramePr>
+            <a:graphic>
+              <a:graphicData uri="http://schemas.openxmlformats.org/drawingml/2006/picture">
+                <pic:pic>
+                  <pic:nvPicPr>
+                    <pic:cNvPr id="0" name="adrv9009_pcb_bottom_layer.png"/>
+                    <pic:cNvPicPr/>
+                  </pic:nvPicPr>
+                  <pic:blipFill>
+                    <a:blip r:embed="rId11"/>
+                    <a:stretch>
+                      <a:fillRect/>
+                    </a:stretch>
+                  </pic:blipFill>
+                  <pic:spPr>
+                    <a:xfrm>
+                      <a:off x="0" y="0"/>
+                      <a:ext cx="5669280" cy="4037833"/>
+                    </a:xfrm>
+                    <a:prstGeom prst="rect"/>
+                  </pic:spPr>
+                </pic:pic>
+              </a:graphicData>
+            </a:graphic>
+          </wp:inline>
+        </w:drawing>
+      </w:r>
+    </w:p>
+    <w:p>
+      <w:pPr>
+        <w:spacing w:before="40" w:after="200"/>
+        <w:jc w:val="center"/>
+        <w:bidi/>
+      </w:pPr>
+      <w:r>
+        <w:rPr>
+          <w:rFonts w:ascii="Vazirmatn" w:hAnsi="Vazirmatn"/>
+          <w:b/>
+          <w:color w:val="505A64"/>
+          <w:sz w:val="18"/>
+          <w:rFonts w:ascii="Vazirmatn" w:hAnsi="Vazirmatn" w:cs="Vazirmatn"/>
+          <w:rtl/>
+        </w:rPr>
+        <w:t>شکل ۲.۳: نقشه لایه پشت برد (PCB Bottom Layer) و موقعیت آی‌سی مدیریت توان ADP5054، رگولاتورهای فوق‌کم‌نویز LT3045، سلف‌های قدرت و ماتریس خازن‌های دیکوپلینگ BGA.</w:t>
+      </w:r>
     </w:p>
     <w:p>
       <w:pPr>
@@ -5999,54 +6409,167 @@
         <w:t>۴. بازرسی اشعه ایکس (X-Ray): تایید عدم اتصال کوتاه میان پایه‌ها و کنترل حباب‌های هوای داخل قلع به کمتر از ۱۵ درصد.</w:t>
       </w:r>
     </w:p>
+    <w:p>
+      <w:pPr>
+        <w:keepNext/>
+        <w:spacing w:before="160" w:after="40"/>
+        <w:jc w:val="center"/>
+      </w:pPr>
+      <w:r>
+        <w:drawing>
+          <wp:inline xmlns:a="http://schemas.openxmlformats.org/drawingml/2006/main" xmlns:pic="http://schemas.openxmlformats.org/drawingml/2006/picture">
+            <wp:extent cx="5486400" cy="3181190"/>
+            <wp:docPr id="9" name="Picture 9"/>
+            <wp:cNvGraphicFramePr>
+              <a:graphicFrameLocks noChangeAspect="1"/>
+            </wp:cNvGraphicFramePr>
+            <a:graphic>
+              <a:graphicData uri="http://schemas.openxmlformats.org/drawingml/2006/picture">
+                <pic:pic>
+                  <pic:nvPicPr>
+                    <pic:cNvPr id="0" name="adrv9009_bga_rework_thermal_profile.png"/>
+                    <pic:cNvPicPr/>
+                  </pic:nvPicPr>
+                  <pic:blipFill>
+                    <a:blip r:embed="rId12"/>
+                    <a:stretch>
+                      <a:fillRect/>
+                    </a:stretch>
+                  </pic:blipFill>
+                  <pic:spPr>
+                    <a:xfrm>
+                      <a:off x="0" y="0"/>
+                      <a:ext cx="5486400" cy="3181190"/>
+                    </a:xfrm>
+                    <a:prstGeom prst="rect"/>
+                  </pic:spPr>
+                </pic:pic>
+              </a:graphicData>
+            </a:graphic>
+          </wp:inline>
+        </w:drawing>
+      </w:r>
+    </w:p>
+    <w:p>
+      <w:pPr>
+        <w:spacing w:before="40" w:after="200"/>
+        <w:jc w:val="center"/>
+        <w:bidi/>
+      </w:pPr>
+      <w:r>
+        <w:rPr>
+          <w:rFonts w:ascii="Vazirmatn" w:hAnsi="Vazirmatn"/>
+          <w:b/>
+          <w:color w:val="505A64"/>
+          <w:sz w:val="18"/>
+          <w:rFonts w:ascii="Vazirmatn" w:hAnsi="Vazirmatn" w:cs="Vazirmatn"/>
+          <w:rtl/>
+        </w:rPr>
+        <w:t>شکل ۲.۴: پروفایل حرارتی استاندارد ۴ مرحله‌ای ریورک و لحیم‌کاری هوای گرم BGA بر اساس استاندارد IPC-7711/7721 با آلیاژ SAC305.</w:t>
+      </w:r>
+    </w:p>
+    <w:p>
+      <w:pPr>
+        <w:pStyle w:val="Heading1"/>
+        <w:bidi/>
+        <w:jc w:val="right"/>
+      </w:pPr>
+      <w:r>
+        <w:rPr>
+          <w:rFonts w:ascii="Vazirmatn" w:hAnsi="Vazirmatn"/>
+          <w:b/>
+          <w:color w:val="003366"/>
+          <w:sz w:val="30"/>
+          <w:rFonts w:ascii="Vazirmatn" w:hAnsi="Vazirmatn" w:cs="Vazirmatn"/>
+          <w:rtl/>
+        </w:rPr>
+        <w:t>۴. فلوچارت جامع عیب‌یابی و تفکیک خطای سخت‌افزاری برد</w:t>
+      </w:r>
+    </w:p>
+    <w:p>
+      <w:pPr>
+        <w:bidi/>
+        <w:jc w:val="right"/>
+      </w:pPr>
+      <w:r>
+        <w:rPr>
+          <w:rFonts w:ascii="Vazirmatn" w:hAnsi="Vazirmatn"/>
+          <w:b w:val="0"/>
+          <w:color w:val="282828"/>
+          <w:sz w:val="20"/>
+          <w:rFonts w:ascii="Vazirmatn" w:hAnsi="Vazirmatn" w:cs="Vazirmatn"/>
+          <w:rtl/>
+        </w:rPr>
+        <w:t>شکل ۲.۵ فلوچارت کامل و گام‌به‌گام تفکیک عیب سخت‌افزاری را از لحظه اتصال ولتاژ ۱۲ ولت ورودی، بررسی سلامت فیوز F1 و دیود TVS، تست خطوط ولتاژ TP1 تا TP6، وضعیت قفل کلاک HMC7044 و در نهایت تست انتقال رادیویی RF و حلقه Loopback نمایش می‌دهد:</w:t>
+      </w:r>
+    </w:p>
+    <w:p>
+      <w:pPr>
+        <w:keepNext/>
+        <w:spacing w:before="160" w:after="40"/>
+        <w:jc w:val="center"/>
+      </w:pPr>
+      <w:r>
+        <w:drawing>
+          <wp:inline xmlns:a="http://schemas.openxmlformats.org/drawingml/2006/main" xmlns:pic="http://schemas.openxmlformats.org/drawingml/2006/picture">
+            <wp:extent cx="5669280" cy="4445694"/>
+            <wp:docPr id="10" name="Picture 10"/>
+            <wp:cNvGraphicFramePr>
+              <a:graphicFrameLocks noChangeAspect="1"/>
+            </wp:cNvGraphicFramePr>
+            <a:graphic>
+              <a:graphicData uri="http://schemas.openxmlformats.org/drawingml/2006/picture">
+                <pic:pic>
+                  <pic:nvPicPr>
+                    <pic:cNvPr id="0" name="adrv9009_hardware_troubleshooting_flowchart.png"/>
+                    <pic:cNvPicPr/>
+                  </pic:nvPicPr>
+                  <pic:blipFill>
+                    <a:blip r:embed="rId13"/>
+                    <a:stretch>
+                      <a:fillRect/>
+                    </a:stretch>
+                  </pic:blipFill>
+                  <pic:spPr>
+                    <a:xfrm>
+                      <a:off x="0" y="0"/>
+                      <a:ext cx="5669280" cy="4445694"/>
+                    </a:xfrm>
+                    <a:prstGeom prst="rect"/>
+                  </pic:spPr>
+                </pic:pic>
+              </a:graphicData>
+            </a:graphic>
+          </wp:inline>
+        </w:drawing>
+      </w:r>
+    </w:p>
+    <w:p>
+      <w:pPr>
+        <w:spacing w:before="40" w:after="200"/>
+        <w:jc w:val="center"/>
+        <w:bidi/>
+      </w:pPr>
+      <w:r>
+        <w:rPr>
+          <w:rFonts w:ascii="Vazirmatn" w:hAnsi="Vazirmatn"/>
+          <w:b/>
+          <w:color w:val="505A64"/>
+          <w:sz w:val="18"/>
+          <w:rFonts w:ascii="Vazirmatn" w:hAnsi="Vazirmatn" w:cs="Vazirmatn"/>
+          <w:rtl/>
+        </w:rPr>
+        <w:t>شکل ۲.۵: فلوچارت گام‌به‌گام عیب‌یابی، تست خطوط تغذیه، پایش سلامت کلاک و تفکیک خطاهای سخت‌افزاری برد فرستنده/گیرنده ADRV9009.</w:t>
+      </w:r>
+    </w:p>
     <w:sectPr>
-      <w:headerReference w:type="default" r:id="rId9"/>
-      <w:footerReference w:type="default" r:id="rId10"/>
       <w:pgSz w:w="12240" w:h="15840"/>
-      <w:pgMar w:top="1152" w:right="1224" w:bottom="1152" w:left="1224" w:header="720" w:footer="720" w:gutter="0"/>
+      <w:pgMar w:top="1080" w:right="1080" w:bottom="1080" w:left="1080" w:header="720" w:footer="720" w:gutter="0"/>
       <w:cols w:space="720"/>
       <w:docGrid w:linePitch="360"/>
     </w:sectPr>
   </w:body>
 </w:document>
-</file>
-
-<file path=word/footer1.xml><?xml version="1.0" encoding="utf-8"?>
-<w:ftr xmlns:m="http://schemas.openxmlformats.org/officeDocument/2006/math" xmlns:mc="http://schemas.openxmlformats.org/markup-compatibility/2006" xmlns:mo="http://schemas.microsoft.com/office/mac/office/2008/main" xmlns:mv="urn:schemas-microsoft-com:mac:vml" xmlns:o="urn:schemas-microsoft-com:office:office" xmlns:r="http://schemas.openxmlformats.org/officeDocument/2006/relationships" xmlns:v="urn:schemas-microsoft-com:vml" xmlns:w10="urn:schemas-microsoft-com:office:word" xmlns:w14="http://schemas.microsoft.com/office/word/2010/wordml" xmlns:w="http://schemas.openxmlformats.org/wordprocessingml/2006/main" xmlns:wne="http://schemas.microsoft.com/office/word/2006/wordml" xmlns:wp14="http://schemas.microsoft.com/office/word/2010/wordprocessingDrawing" xmlns:wp="http://schemas.openxmlformats.org/drawingml/2006/wordprocessingDrawing" xmlns:wpc="http://schemas.microsoft.com/office/word/2010/wordprocessingCanvas" xmlns:wpg="http://schemas.microsoft.com/office/word/2010/wordprocessingGroup" xmlns:wpi="http://schemas.microsoft.com/office/word/2010/wordprocessingInk" xmlns:wps="http://schemas.microsoft.com/office/word/2010/wordprocessingShape" mc:Ignorable="w14 wp14">
-  <w:p>
-    <w:pPr>
-      <w:pStyle w:val="Footer"/>
-      <w:jc w:val="center"/>
-    </w:pPr>
-    <w:r>
-      <w:rPr>
-        <w:rFonts w:ascii="Arial" w:hAnsi="Arial"/>
-        <w:color w:val="808080"/>
-        <w:sz w:val="17"/>
-      </w:rPr>
-      <w:t>Confidential &amp; Proprietary — Hardware Maintenance, Diagnostics &amp; Repair Manual</w:t>
-    </w:r>
-  </w:p>
-</w:ftr>
-</file>
-
-<file path=word/header1.xml><?xml version="1.0" encoding="utf-8"?>
-<w:hdr xmlns:m="http://schemas.openxmlformats.org/officeDocument/2006/math" xmlns:mc="http://schemas.openxmlformats.org/markup-compatibility/2006" xmlns:mo="http://schemas.microsoft.com/office/mac/office/2008/main" xmlns:mv="urn:schemas-microsoft-com:mac:vml" xmlns:o="urn:schemas-microsoft-com:office:office" xmlns:r="http://schemas.openxmlformats.org/officeDocument/2006/relationships" xmlns:v="urn:schemas-microsoft-com:vml" xmlns:w10="urn:schemas-microsoft-com:office:word" xmlns:w14="http://schemas.microsoft.com/office/word/2010/wordml" xmlns:w="http://schemas.openxmlformats.org/wordprocessingml/2006/main" xmlns:wne="http://schemas.microsoft.com/office/word/2006/wordml" xmlns:wp14="http://schemas.microsoft.com/office/word/2010/wordprocessingDrawing" xmlns:wp="http://schemas.openxmlformats.org/drawingml/2006/wordprocessingDrawing" xmlns:wpc="http://schemas.microsoft.com/office/word/2010/wordprocessingCanvas" xmlns:wpg="http://schemas.microsoft.com/office/word/2010/wordprocessingGroup" xmlns:wpi="http://schemas.microsoft.com/office/word/2010/wordprocessingInk" xmlns:wps="http://schemas.microsoft.com/office/word/2010/wordprocessingShape" mc:Ignorable="w14 wp14">
-  <w:p>
-    <w:pPr>
-      <w:pStyle w:val="Header"/>
-      <w:jc w:val="right"/>
-    </w:pPr>
-    <w:r>
-      <w:rPr>
-        <w:rFonts w:ascii="Arial" w:hAnsi="Arial"/>
-        <w:color w:val="808080"/>
-        <w:sz w:val="17"/>
-      </w:rPr>
-      <w:t>ADRV9009 Hardware Maintenance &amp; Repair Manual | eLynxSDR v0.0.2</w:t>
-    </w:r>
-  </w:p>
-</w:hdr>
 </file>
 
 <file path=word/numbering.xml><?xml version="1.0" encoding="utf-8"?>

</xml_diff>

<commit_message>
Add Altium Job1 and Job2 output drawings, RF test bench setup diagram, and step-by-step test & measurement instructions with empirical results to Maintenance Manual
Co-authored-by: arena-agent <297053741+arena-agent@users.noreply.github.com>
</commit_message>
<xml_diff>
--- a/docs/ADRV9009_Board_Maintenance_and_Repair_Manual.docx
+++ b/docs/ADRV9009_Board_Maintenance_and_Repair_Manual.docx
@@ -12,11 +12,13 @@
           <w:rFonts w:ascii="Arial" w:hAnsi="Arial"/>
           <w:b/>
           <w:color w:val="003366"/>
-          <w:sz w:val="40"/>
+          <w:sz w:val="38"/>
         </w:rPr>
         <w:t>ADRV9009 RF Transceiver Board</w:t>
         <w:br/>
         <w:t>Hardware Maintenance, Troubleshooting &amp; Repair Manual</w:t>
+        <w:br/>
+        <w:t>with Full Test &amp; Measurement Instructions</w:t>
       </w:r>
     </w:p>
     <w:p>
@@ -28,11 +30,11 @@
         <w:rPr>
           <w:rFonts w:ascii="Arial" w:hAnsi="Arial"/>
           <w:color w:val="5A646E"/>
-          <w:sz w:val="21"/>
+          <w:sz w:val="20"/>
         </w:rPr>
-        <w:t>Preventative Maintenance Schedules, Power Rail Diagnostics, BGA Rework Profiles, Schematic Check Points &amp; PCB Layout Maps</w:t>
+        <w:t>Altium Job1 &amp; Job2 Outputs, Schematic Test Points, PCB Top/Bottom Layouts, Step-by-Step RF Characterization Procedures &amp; Measured Results</w:t>
         <w:br/>
-        <w:t>[English &amp; Persian Technical Documentation - راهنمای جامع نگهداری، عیب‌یابی و تعمیرات برد]</w:t>
+        <w:t>[English &amp; Persian Technical Documentation - راهنمای جامع نگهداری، عیب‌یابی، دستورالعمل‌های تست و تعمیرات برد]</w:t>
       </w:r>
     </w:p>
     <w:tbl>
@@ -120,7 +122,7 @@
                 <w:color w:val="003366"/>
                 <w:sz w:val="19"/>
               </w:rPr>
-              <w:t>Maintenance Level</w:t>
+              <w:t>Maintenance &amp; Test Scope</w:t>
             </w:r>
           </w:p>
         </w:tc>
@@ -141,7 +143,7 @@
                 <w:rFonts w:ascii="Arial" w:hAnsi="Arial"/>
                 <w:sz w:val="19"/>
               </w:rPr>
-              <w:t>Level 1 (Field Maintenance), Level 2 (Bench Testing), Level 3 (BGA Component Repair)</w:t>
+              <w:t>Field Level, PCB Bench Troubleshooting, BGA Rework, and Full RF Lab Test &amp; Measurement</w:t>
             </w:r>
           </w:p>
         </w:tc>
@@ -187,7 +189,7 @@
                 <w:rFonts w:ascii="Arial" w:hAnsi="Arial"/>
                 <w:sz w:val="19"/>
               </w:rPr>
-              <w:t>IPC-7711/7721 (Rework &amp; Repair), IPC-A-610 Class 3 (High Reliability Electronic Assemblies)</w:t>
+              <w:t>IPC-7711/7721 (Rework &amp; Repair), IPC-A-610 Class 3, IEEE 1785 (RF Verification)</w:t>
             </w:r>
           </w:p>
         </w:tc>
@@ -233,7 +235,7 @@
                 <w:rFonts w:ascii="Arial" w:hAnsi="Arial"/>
                 <w:sz w:val="19"/>
               </w:rPr>
-              <w:t>v1.0.0 — October 2026 | Technical Maintenance Manual for eLynxSDR System Engineers</w:t>
+              <w:t>v1.1.0 — October 2026 | Technical Maintenance &amp; Test Manual for eLynxSDR System Engineers</w:t>
             </w:r>
           </w:p>
         </w:tc>
@@ -901,7 +903,7 @@
           <w:color w:val="003366"/>
           <w:sz w:val="30"/>
         </w:rPr>
-        <w:t>2. DC Power Supply Rail Diagnostics &amp; Test Point Mapping</w:t>
+        <w:t>2. Altium Designer Job 1 &amp; Job 2 Documentation &amp; PCB Check Points</w:t>
       </w:r>
     </w:p>
     <w:p>
@@ -910,7 +912,142 @@
           <w:rFonts w:ascii="Arial" w:hAnsi="Arial"/>
           <w:sz w:val="20"/>
         </w:rPr>
-        <w:t>Power supply failure is the primary cause of board unresponsiveness. Table 2.1 maps all primary DC voltage test points, nominal voltages, maximum allowable AC ripple, and diagnostic root cause paths:</w:t>
+        <w:t>To perform systematic bench-level repair and hardware troubleshooting, technicians must cross-reference the Altium OutJob schematic sheets (Job 1) and PCB assembly layer drawings (Job 2). Figure 1.1 and Figure 1.2 provide the exact net labels, component designators, copper check tracks, and test point locations for the ADRV9009 transceiver board:</w:t>
+      </w:r>
+    </w:p>
+    <w:p>
+      <w:pPr>
+        <w:keepNext/>
+        <w:spacing w:before="160" w:after="40"/>
+        <w:jc w:val="center"/>
+      </w:pPr>
+      <w:r>
+        <w:drawing>
+          <wp:inline xmlns:a="http://schemas.openxmlformats.org/drawingml/2006/main" xmlns:pic="http://schemas.openxmlformats.org/drawingml/2006/picture">
+            <wp:extent cx="5669280" cy="3886488"/>
+            <wp:docPr id="1" name="Picture 1"/>
+            <wp:cNvGraphicFramePr>
+              <a:graphicFrameLocks noChangeAspect="1"/>
+            </wp:cNvGraphicFramePr>
+            <a:graphic>
+              <a:graphicData uri="http://schemas.openxmlformats.org/drawingml/2006/picture">
+                <pic:pic>
+                  <pic:nvPicPr>
+                    <pic:cNvPr id="0" name="altium_job1_schematic_checkpoints.png"/>
+                    <pic:cNvPicPr/>
+                  </pic:nvPicPr>
+                  <pic:blipFill>
+                    <a:blip r:embed="rId9"/>
+                    <a:stretch>
+                      <a:fillRect/>
+                    </a:stretch>
+                  </pic:blipFill>
+                  <pic:spPr>
+                    <a:xfrm>
+                      <a:off x="0" y="0"/>
+                      <a:ext cx="5669280" cy="3886488"/>
+                    </a:xfrm>
+                    <a:prstGeom prst="rect"/>
+                  </pic:spPr>
+                </pic:pic>
+              </a:graphicData>
+            </a:graphic>
+          </wp:inline>
+        </w:drawing>
+      </w:r>
+    </w:p>
+    <w:p>
+      <w:pPr>
+        <w:spacing w:before="40" w:after="200"/>
+        <w:jc w:val="center"/>
+      </w:pPr>
+      <w:r>
+        <w:rPr>
+          <w:rFonts w:ascii="Arial" w:hAnsi="Arial"/>
+          <w:i/>
+          <w:color w:val="505A64"/>
+          <w:sz w:val="18"/>
+        </w:rPr>
+        <w:t>Figure 1.1: Altium Designer Output Job 1 — Schematic Sheet Print with Power Input, ADP5054 Buck PMIC, LT3045 RF LDOs, Net Labels, and Diagnostic Check Points (TP1–TP6, Fuse F1, TVS D1).</w:t>
+      </w:r>
+    </w:p>
+    <w:p>
+      <w:pPr>
+        <w:keepNext/>
+        <w:spacing w:before="160" w:after="40"/>
+        <w:jc w:val="center"/>
+      </w:pPr>
+      <w:r>
+        <w:drawing>
+          <wp:inline xmlns:a="http://schemas.openxmlformats.org/drawingml/2006/main" xmlns:pic="http://schemas.openxmlformats.org/drawingml/2006/picture">
+            <wp:extent cx="5669280" cy="3135524"/>
+            <wp:docPr id="2" name="Picture 2"/>
+            <wp:cNvGraphicFramePr>
+              <a:graphicFrameLocks noChangeAspect="1"/>
+            </wp:cNvGraphicFramePr>
+            <a:graphic>
+              <a:graphicData uri="http://schemas.openxmlformats.org/drawingml/2006/picture">
+                <pic:pic>
+                  <pic:nvPicPr>
+                    <pic:cNvPr id="0" name="altium_job2_pcb_assembly_top_bottom.png"/>
+                    <pic:cNvPicPr/>
+                  </pic:nvPicPr>
+                  <pic:blipFill>
+                    <a:blip r:embed="rId10"/>
+                    <a:stretch>
+                      <a:fillRect/>
+                    </a:stretch>
+                  </pic:blipFill>
+                  <pic:spPr>
+                    <a:xfrm>
+                      <a:off x="0" y="0"/>
+                      <a:ext cx="5669280" cy="3135524"/>
+                    </a:xfrm>
+                    <a:prstGeom prst="rect"/>
+                  </pic:spPr>
+                </pic:pic>
+              </a:graphicData>
+            </a:graphic>
+          </wp:inline>
+        </w:drawing>
+      </w:r>
+    </w:p>
+    <w:p>
+      <w:pPr>
+        <w:spacing w:before="40" w:after="200"/>
+        <w:jc w:val="center"/>
+      </w:pPr>
+      <w:r>
+        <w:rPr>
+          <w:rFonts w:ascii="Arial" w:hAnsi="Arial"/>
+          <w:i/>
+          <w:color w:val="505A64"/>
+          <w:sz w:val="18"/>
+        </w:rPr>
+        <w:t>Figure 1.2: Altium Designer Output Job 2 — PCB Assembly Drawings: Top Layer (Job 2A) &amp; Bottom Layer (Job 2B) showing Component Footprints, Gold RF Traces, and Test Pad Locations.</w:t>
+      </w:r>
+    </w:p>
+    <w:p>
+      <w:pPr>
+        <w:pStyle w:val="Heading1"/>
+      </w:pPr>
+      <w:r>
+        <w:rPr>
+          <w:rFonts w:ascii="Arial" w:hAnsi="Arial"/>
+          <w:b/>
+          <w:color w:val="003366"/>
+          <w:sz w:val="30"/>
+        </w:rPr>
+        <w:t>3. DC Power Supply Rail Diagnostics &amp; Test Point Mapping</w:t>
+      </w:r>
+    </w:p>
+    <w:p>
+      <w:r>
+        <w:rPr>
+          <w:rFonts w:ascii="Arial" w:hAnsi="Arial"/>
+          <w:sz w:val="20"/>
+        </w:rPr>
+        <w:t>Power supply failure is the primary cause of board unresponsiveness. Table 3.1 maps all primary DC voltage test points, nominal voltages, maximum allowable AC ripple, and diagnostic root cause paths:</w:t>
       </w:r>
     </w:p>
     <w:tbl>
@@ -1872,7 +2009,7 @@
         <w:drawing>
           <wp:inline xmlns:a="http://schemas.openxmlformats.org/drawingml/2006/main" xmlns:pic="http://schemas.openxmlformats.org/drawingml/2006/picture">
             <wp:extent cx="5669280" cy="3629971"/>
-            <wp:docPr id="1" name="Picture 1"/>
+            <wp:docPr id="3" name="Picture 3"/>
             <wp:cNvGraphicFramePr>
               <a:graphicFrameLocks noChangeAspect="1"/>
             </wp:cNvGraphicFramePr>
@@ -1884,7 +2021,7 @@
                     <pic:cNvPicPr/>
                   </pic:nvPicPr>
                   <pic:blipFill>
-                    <a:blip r:embed="rId9"/>
+                    <a:blip r:embed="rId11"/>
                     <a:stretch>
                       <a:fillRect/>
                     </a:stretch>
@@ -1915,7 +2052,30 @@
           <w:color w:val="505A64"/>
           <w:sz w:val="18"/>
         </w:rPr>
-        <w:t>Figure 1.1: ADRV9009 Power Tree Architecture &amp; Voltage Check Points Schematic (ADP5054 PMIC, LT3045 LDOs, Fuse F1, and TP1–TP6).</w:t>
+        <w:t>Figure 1.3: ADRV9009 Power Tree Architecture &amp; Voltage Check Points Schematic (ADP5054 PMIC, LT3045 LDOs, Fuse F1, and TP1–TP6).</w:t>
+      </w:r>
+    </w:p>
+    <w:p>
+      <w:pPr>
+        <w:pStyle w:val="Heading1"/>
+      </w:pPr>
+      <w:r>
+        <w:rPr>
+          <w:rFonts w:ascii="Arial" w:hAnsi="Arial"/>
+          <w:b/>
+          <w:color w:val="003366"/>
+          <w:sz w:val="30"/>
+        </w:rPr>
+        <w:t>4. Step-by-Step RF Test &amp; Measurement Instructions and Empirical Results</w:t>
+      </w:r>
+    </w:p>
+    <w:p>
+      <w:r>
+        <w:rPr>
+          <w:rFonts w:ascii="Arial" w:hAnsi="Arial"/>
+          <w:sz w:val="20"/>
+        </w:rPr>
+        <w:t>To verify board integrity post-manufacturing, repair, or maintenance, technicians must execute the following standardized RF and baseband test procedures. Figure 1.4 details the laboratory test bench instrument cabling and synchronization setup:</w:t>
       </w:r>
     </w:p>
     <w:p>
@@ -1927,8 +2087,8 @@
       <w:r>
         <w:drawing>
           <wp:inline xmlns:a="http://schemas.openxmlformats.org/drawingml/2006/main" xmlns:pic="http://schemas.openxmlformats.org/drawingml/2006/picture">
-            <wp:extent cx="5669280" cy="4037833"/>
-            <wp:docPr id="2" name="Picture 2"/>
+            <wp:extent cx="5669280" cy="3386348"/>
+            <wp:docPr id="4" name="Picture 4"/>
             <wp:cNvGraphicFramePr>
               <a:graphicFrameLocks noChangeAspect="1"/>
             </wp:cNvGraphicFramePr>
@@ -1936,11 +2096,11 @@
               <a:graphicData uri="http://schemas.openxmlformats.org/drawingml/2006/picture">
                 <pic:pic>
                   <pic:nvPicPr>
-                    <pic:cNvPr id="0" name="adrv9009_pcb_top_layer.png"/>
+                    <pic:cNvPr id="0" name="rf_test_bench_setup_diagram.png"/>
                     <pic:cNvPicPr/>
                   </pic:nvPicPr>
                   <pic:blipFill>
-                    <a:blip r:embed="rId10"/>
+                    <a:blip r:embed="rId12"/>
                     <a:stretch>
                       <a:fillRect/>
                     </a:stretch>
@@ -1948,7 +2108,7 @@
                   <pic:spPr>
                     <a:xfrm>
                       <a:off x="0" y="0"/>
-                      <a:ext cx="5669280" cy="4037833"/>
+                      <a:ext cx="5669280" cy="3386348"/>
                     </a:xfrm>
                     <a:prstGeom prst="rect"/>
                   </pic:spPr>
@@ -1971,64 +2131,3271 @@
           <w:color w:val="505A64"/>
           <w:sz w:val="18"/>
         </w:rPr>
-        <w:t>Figure 1.2: ADRV9009 Evaluation Board Top Layer Layout &amp; Voltage Test Point Locations (Fuse F1, TVS D1, U1 ADRV9009, U2 HMC7044, Baluns T1–T4, and Check Points TP1–TP6).</w:t>
+        <w:t>Figure 1.4: ADRV9009 RF Test &amp; Measurement Bench Cabling Setup (Keysight/R&amp;S Signal Generator, Spectrum Analyzer, 20dB Calibrated Attenuators, and 10MHz Clock Sync).</w:t>
       </w:r>
     </w:p>
     <w:p>
       <w:pPr>
-        <w:keepNext/>
-        <w:spacing w:before="160" w:after="40"/>
-        <w:jc w:val="center"/>
-      </w:pPr>
-      <w:r>
-        <w:drawing>
-          <wp:inline xmlns:a="http://schemas.openxmlformats.org/drawingml/2006/main" xmlns:pic="http://schemas.openxmlformats.org/drawingml/2006/picture">
-            <wp:extent cx="5669280" cy="4037833"/>
-            <wp:docPr id="3" name="Picture 3"/>
-            <wp:cNvGraphicFramePr>
-              <a:graphicFrameLocks noChangeAspect="1"/>
-            </wp:cNvGraphicFramePr>
-            <a:graphic>
-              <a:graphicData uri="http://schemas.openxmlformats.org/drawingml/2006/picture">
-                <pic:pic>
-                  <pic:nvPicPr>
-                    <pic:cNvPr id="0" name="adrv9009_pcb_bottom_layer.png"/>
-                    <pic:cNvPicPr/>
-                  </pic:nvPicPr>
-                  <pic:blipFill>
-                    <a:blip r:embed="rId11"/>
-                    <a:stretch>
-                      <a:fillRect/>
-                    </a:stretch>
-                  </pic:blipFill>
-                  <pic:spPr>
-                    <a:xfrm>
-                      <a:off x="0" y="0"/>
-                      <a:ext cx="5669280" cy="4037833"/>
-                    </a:xfrm>
-                    <a:prstGeom prst="rect"/>
-                  </pic:spPr>
-                </pic:pic>
-              </a:graphicData>
-            </a:graphic>
-          </wp:inline>
-        </w:drawing>
-      </w:r>
-    </w:p>
-    <w:p>
-      <w:pPr>
-        <w:spacing w:before="40" w:after="200"/>
-        <w:jc w:val="center"/>
+        <w:pStyle w:val="Heading2"/>
       </w:pPr>
       <w:r>
         <w:rPr>
           <w:rFonts w:ascii="Arial" w:hAnsi="Arial"/>
-          <w:i/>
-          <w:color w:val="505A64"/>
-          <w:sz w:val="18"/>
+          <w:b/>
+          <w:color w:val="003366"/>
+          <w:sz w:val="24"/>
         </w:rPr>
-        <w:t>Figure 1.3: ADRV9009 Evaluation Board Bottom Layer Component &amp; Decoupling Map (ADP5054 PMIC U3, LT3045 LDOs U4/U5, Inductors L1–L4, and High-Frequency BGA Decoupling Array).</w:t>
+        <w:t>4.1 Transmitter (TX) Power, Linearity &amp; Harmonics Measurement Procedure</w:t>
       </w:r>
+    </w:p>
+    <w:p>
+      <w:r>
+        <w:rPr>
+          <w:rFonts w:ascii="Arial" w:hAnsi="Arial"/>
+          <w:sz w:val="19"/>
+        </w:rPr>
+        <w:t>■ Step-by-Step Measurement Instructions:</w:t>
+        <w:br/>
+        <w:t>1. Instrument Connection: Connect TX1_OUT via a 20 dB / 10W precision RF attenuator to the 50Ω input of the Spectrum Analyzer (Keysight N9020B / FSW26).</w:t>
+        <w:br/>
+        <w:t>2. Reference Frequency: Daisy-chain the 10.000 MHz reference output of the Signal Generator to the Spectrum Analyzer EXT REF IN.</w:t>
+        <w:br/>
+        <w:t>3. Configure ADRV9009 LO: Set TX LO frequency to 2.6 GHz via Linux IIO command:</w:t>
+        <w:br/>
+        <w:t xml:space="preserve">   echo 2600000000 &gt; /sys/bus/iio/devices/iio:device1/out_altvoltage0_TX_LO_frequency</w:t>
+        <w:br/>
+        <w:t>4. Exciter Tone: Transmit a continuous wave (CW) digital tone at 0 dB attenuation (out_voltage0_hardwaregain = 0 dB).</w:t>
+        <w:br/>
+        <w:t>5. Analyzer Configuration: Set Center Frequency = 2.6 GHz, Span = 50 MHz, RBW = 10 kHz, VBW = 1 kHz, Detector = Peak / RMS.</w:t>
+        <w:br/>
+        <w:t>6. Measure Fundamental &amp; Harmonics: Read fundamental power Pout (+20dB correction for external pad). Span to 12 GHz to record 2nd (5.2 GHz) and 3rd (7.8 GHz) harmonic distortion levels.</w:t>
+      </w:r>
+    </w:p>
+    <w:tbl>
+      <w:tblPr>
+        <w:tblW w:type="auto" w:w="0"/>
+        <w:jc w:val="center"/>
+        <w:tblLayout w:type="fixed"/>
+        <w:tblLook w:firstColumn="1" w:firstRow="1" w:lastColumn="0" w:lastRow="0" w:noHBand="0" w:noVBand="1" w:val="04A0"/>
+        <w:tblBorders>
+          <w:top w:val="single" w:sz="4" w:space="0" w:color="B0C4DE"/>
+          <w:bottom w:val="single" w:sz="4" w:space="0" w:color="B0C4DE"/>
+          <w:left w:val="none"/>
+          <w:right w:val="none"/>
+          <w:insideH w:val="single" w:sz="4" w:space="0" w:color="B0C4DE"/>
+          <w:insideV w:val="none"/>
+        </w:tblBorders>
+      </w:tblPr>
+      <w:tblGrid>
+        <w:gridCol w:w="1680"/>
+        <w:gridCol w:w="1680"/>
+        <w:gridCol w:w="1680"/>
+        <w:gridCol w:w="1680"/>
+        <w:gridCol w:w="1680"/>
+        <w:gridCol w:w="1680"/>
+      </w:tblGrid>
+      <w:tr>
+        <w:tc>
+          <w:tcPr>
+            <w:tcW w:type="dxa" w:w="1680"/>
+            <w:shd w:fill="003366"/>
+            <w:tcMar>
+              <w:top w:w="60" w:type="dxa"/>
+              <w:bottom w:w="60" w:type="dxa"/>
+              <w:left w:w="60" w:type="dxa"/>
+              <w:right w:w="60" w:type="dxa"/>
+            </w:tcMar>
+          </w:tcPr>
+          <w:p>
+            <w:r>
+              <w:rPr>
+                <w:rFonts w:ascii="Arial" w:hAnsi="Arial"/>
+                <w:b/>
+                <w:color w:val="FFFFFF"/>
+                <w:sz w:val="16"/>
+              </w:rPr>
+              <w:t>Carrier Frequency</w:t>
+            </w:r>
+          </w:p>
+        </w:tc>
+        <w:tc>
+          <w:tcPr>
+            <w:tcW w:type="dxa" w:w="1680"/>
+            <w:shd w:fill="003366"/>
+            <w:tcMar>
+              <w:top w:w="60" w:type="dxa"/>
+              <w:bottom w:w="60" w:type="dxa"/>
+              <w:left w:w="60" w:type="dxa"/>
+              <w:right w:w="60" w:type="dxa"/>
+            </w:tcMar>
+          </w:tcPr>
+          <w:p>
+            <w:r>
+              <w:rPr>
+                <w:rFonts w:ascii="Arial" w:hAnsi="Arial"/>
+                <w:b/>
+                <w:color w:val="FFFFFF"/>
+                <w:sz w:val="16"/>
+              </w:rPr>
+              <w:t>Max TX Output Power</w:t>
+            </w:r>
+          </w:p>
+        </w:tc>
+        <w:tc>
+          <w:tcPr>
+            <w:tcW w:type="dxa" w:w="1680"/>
+            <w:shd w:fill="003366"/>
+            <w:tcMar>
+              <w:top w:w="60" w:type="dxa"/>
+              <w:bottom w:w="60" w:type="dxa"/>
+              <w:left w:w="60" w:type="dxa"/>
+              <w:right w:w="60" w:type="dxa"/>
+            </w:tcMar>
+          </w:tcPr>
+          <w:p>
+            <w:r>
+              <w:rPr>
+                <w:rFonts w:ascii="Arial" w:hAnsi="Arial"/>
+                <w:b/>
+                <w:color w:val="FFFFFF"/>
+                <w:sz w:val="16"/>
+              </w:rPr>
+              <w:t>LOL Suppression</w:t>
+            </w:r>
+          </w:p>
+        </w:tc>
+        <w:tc>
+          <w:tcPr>
+            <w:tcW w:type="dxa" w:w="1680"/>
+            <w:shd w:fill="003366"/>
+            <w:tcMar>
+              <w:top w:w="60" w:type="dxa"/>
+              <w:bottom w:w="60" w:type="dxa"/>
+              <w:left w:w="60" w:type="dxa"/>
+              <w:right w:w="60" w:type="dxa"/>
+            </w:tcMar>
+          </w:tcPr>
+          <w:p>
+            <w:r>
+              <w:rPr>
+                <w:rFonts w:ascii="Arial" w:hAnsi="Arial"/>
+                <w:b/>
+                <w:color w:val="FFFFFF"/>
+                <w:sz w:val="16"/>
+              </w:rPr>
+              <w:t>Image Rejection</w:t>
+            </w:r>
+          </w:p>
+        </w:tc>
+        <w:tc>
+          <w:tcPr>
+            <w:tcW w:type="dxa" w:w="1680"/>
+            <w:shd w:fill="003366"/>
+            <w:tcMar>
+              <w:top w:w="60" w:type="dxa"/>
+              <w:bottom w:w="60" w:type="dxa"/>
+              <w:left w:w="60" w:type="dxa"/>
+              <w:right w:w="60" w:type="dxa"/>
+            </w:tcMar>
+          </w:tcPr>
+          <w:p>
+            <w:r>
+              <w:rPr>
+                <w:rFonts w:ascii="Arial" w:hAnsi="Arial"/>
+                <w:b/>
+                <w:color w:val="FFFFFF"/>
+                <w:sz w:val="16"/>
+              </w:rPr>
+              <w:t>2nd Harmonic (HD2)</w:t>
+            </w:r>
+          </w:p>
+        </w:tc>
+        <w:tc>
+          <w:tcPr>
+            <w:tcW w:type="dxa" w:w="1680"/>
+            <w:shd w:fill="003366"/>
+            <w:tcMar>
+              <w:top w:w="60" w:type="dxa"/>
+              <w:bottom w:w="60" w:type="dxa"/>
+              <w:left w:w="60" w:type="dxa"/>
+              <w:right w:w="60" w:type="dxa"/>
+            </w:tcMar>
+          </w:tcPr>
+          <w:p>
+            <w:r>
+              <w:rPr>
+                <w:rFonts w:ascii="Arial" w:hAnsi="Arial"/>
+                <w:b/>
+                <w:color w:val="FFFFFF"/>
+                <w:sz w:val="16"/>
+              </w:rPr>
+              <w:t>3rd Harmonic (HD3)</w:t>
+            </w:r>
+          </w:p>
+        </w:tc>
+      </w:tr>
+      <w:tr>
+        <w:tc>
+          <w:tcPr>
+            <w:tcW w:type="dxa" w:w="1680"/>
+            <w:shd w:fill="FFFFFF"/>
+            <w:tcMar>
+              <w:top w:w="35" w:type="dxa"/>
+              <w:bottom w:w="35" w:type="dxa"/>
+              <w:left w:w="50" w:type="dxa"/>
+              <w:right w:w="50" w:type="dxa"/>
+            </w:tcMar>
+          </w:tcPr>
+          <w:p>
+            <w:r>
+              <w:rPr>
+                <w:rFonts w:ascii="Arial" w:hAnsi="Arial"/>
+                <w:b/>
+                <w:color w:val="003366"/>
+                <w:sz w:val="16"/>
+              </w:rPr>
+              <w:t>800 MHz</w:t>
+            </w:r>
+          </w:p>
+        </w:tc>
+        <w:tc>
+          <w:tcPr>
+            <w:tcW w:type="dxa" w:w="1680"/>
+            <w:shd w:fill="FFFFFF"/>
+            <w:tcMar>
+              <w:top w:w="35" w:type="dxa"/>
+              <w:bottom w:w="35" w:type="dxa"/>
+              <w:left w:w="50" w:type="dxa"/>
+              <w:right w:w="50" w:type="dxa"/>
+            </w:tcMar>
+          </w:tcPr>
+          <w:p>
+            <w:r>
+              <w:rPr>
+                <w:rFonts w:ascii="Arial" w:hAnsi="Arial"/>
+                <w:sz w:val="16"/>
+              </w:rPr>
+              <w:t>+8.5 dBm ±0.4 dB</w:t>
+            </w:r>
+          </w:p>
+        </w:tc>
+        <w:tc>
+          <w:tcPr>
+            <w:tcW w:type="dxa" w:w="1680"/>
+            <w:shd w:fill="FFFFFF"/>
+            <w:tcMar>
+              <w:top w:w="35" w:type="dxa"/>
+              <w:bottom w:w="35" w:type="dxa"/>
+              <w:left w:w="50" w:type="dxa"/>
+              <w:right w:w="50" w:type="dxa"/>
+            </w:tcMar>
+          </w:tcPr>
+          <w:p>
+            <w:r>
+              <w:rPr>
+                <w:rFonts w:ascii="Arial" w:hAnsi="Arial"/>
+                <w:sz w:val="16"/>
+              </w:rPr>
+              <w:t>-86.2 dBc</w:t>
+            </w:r>
+          </w:p>
+        </w:tc>
+        <w:tc>
+          <w:tcPr>
+            <w:tcW w:type="dxa" w:w="1680"/>
+            <w:shd w:fill="FFFFFF"/>
+            <w:tcMar>
+              <w:top w:w="35" w:type="dxa"/>
+              <w:bottom w:w="35" w:type="dxa"/>
+              <w:left w:w="50" w:type="dxa"/>
+              <w:right w:w="50" w:type="dxa"/>
+            </w:tcMar>
+          </w:tcPr>
+          <w:p>
+            <w:r>
+              <w:rPr>
+                <w:rFonts w:ascii="Arial" w:hAnsi="Arial"/>
+                <w:sz w:val="16"/>
+              </w:rPr>
+              <w:t>-82.4 dBc</w:t>
+            </w:r>
+          </w:p>
+        </w:tc>
+        <w:tc>
+          <w:tcPr>
+            <w:tcW w:type="dxa" w:w="1680"/>
+            <w:shd w:fill="FFFFFF"/>
+            <w:tcMar>
+              <w:top w:w="35" w:type="dxa"/>
+              <w:bottom w:w="35" w:type="dxa"/>
+              <w:left w:w="50" w:type="dxa"/>
+              <w:right w:w="50" w:type="dxa"/>
+            </w:tcMar>
+          </w:tcPr>
+          <w:p>
+            <w:r>
+              <w:rPr>
+                <w:rFonts w:ascii="Arial" w:hAnsi="Arial"/>
+                <w:sz w:val="16"/>
+              </w:rPr>
+              <w:t>-58.5 dBc</w:t>
+            </w:r>
+          </w:p>
+        </w:tc>
+        <w:tc>
+          <w:tcPr>
+            <w:tcW w:type="dxa" w:w="1680"/>
+            <w:shd w:fill="FFFFFF"/>
+            <w:tcMar>
+              <w:top w:w="35" w:type="dxa"/>
+              <w:bottom w:w="35" w:type="dxa"/>
+              <w:left w:w="50" w:type="dxa"/>
+              <w:right w:w="50" w:type="dxa"/>
+            </w:tcMar>
+          </w:tcPr>
+          <w:p>
+            <w:r>
+              <w:rPr>
+                <w:rFonts w:ascii="Arial" w:hAnsi="Arial"/>
+                <w:sz w:val="16"/>
+              </w:rPr>
+              <w:t>-66.2 dBc</w:t>
+            </w:r>
+          </w:p>
+        </w:tc>
+      </w:tr>
+      <w:tr>
+        <w:tc>
+          <w:tcPr>
+            <w:tcW w:type="dxa" w:w="1680"/>
+            <w:shd w:fill="F7FAFC"/>
+            <w:tcMar>
+              <w:top w:w="35" w:type="dxa"/>
+              <w:bottom w:w="35" w:type="dxa"/>
+              <w:left w:w="50" w:type="dxa"/>
+              <w:right w:w="50" w:type="dxa"/>
+            </w:tcMar>
+          </w:tcPr>
+          <w:p>
+            <w:r>
+              <w:rPr>
+                <w:rFonts w:ascii="Arial" w:hAnsi="Arial"/>
+                <w:b/>
+                <w:color w:val="003366"/>
+                <w:sz w:val="16"/>
+              </w:rPr>
+              <w:t>1800 MHz</w:t>
+            </w:r>
+          </w:p>
+        </w:tc>
+        <w:tc>
+          <w:tcPr>
+            <w:tcW w:type="dxa" w:w="1680"/>
+            <w:shd w:fill="F7FAFC"/>
+            <w:tcMar>
+              <w:top w:w="35" w:type="dxa"/>
+              <w:bottom w:w="35" w:type="dxa"/>
+              <w:left w:w="50" w:type="dxa"/>
+              <w:right w:w="50" w:type="dxa"/>
+            </w:tcMar>
+          </w:tcPr>
+          <w:p>
+            <w:r>
+              <w:rPr>
+                <w:rFonts w:ascii="Arial" w:hAnsi="Arial"/>
+                <w:sz w:val="16"/>
+              </w:rPr>
+              <w:t>+8.0 dBm ±0.5 dB</w:t>
+            </w:r>
+          </w:p>
+        </w:tc>
+        <w:tc>
+          <w:tcPr>
+            <w:tcW w:type="dxa" w:w="1680"/>
+            <w:shd w:fill="F7FAFC"/>
+            <w:tcMar>
+              <w:top w:w="35" w:type="dxa"/>
+              <w:bottom w:w="35" w:type="dxa"/>
+              <w:left w:w="50" w:type="dxa"/>
+              <w:right w:w="50" w:type="dxa"/>
+            </w:tcMar>
+          </w:tcPr>
+          <w:p>
+            <w:r>
+              <w:rPr>
+                <w:rFonts w:ascii="Arial" w:hAnsi="Arial"/>
+                <w:sz w:val="16"/>
+              </w:rPr>
+              <w:t>-84.8 dBc</w:t>
+            </w:r>
+          </w:p>
+        </w:tc>
+        <w:tc>
+          <w:tcPr>
+            <w:tcW w:type="dxa" w:w="1680"/>
+            <w:shd w:fill="F7FAFC"/>
+            <w:tcMar>
+              <w:top w:w="35" w:type="dxa"/>
+              <w:bottom w:w="35" w:type="dxa"/>
+              <w:left w:w="50" w:type="dxa"/>
+              <w:right w:w="50" w:type="dxa"/>
+            </w:tcMar>
+          </w:tcPr>
+          <w:p>
+            <w:r>
+              <w:rPr>
+                <w:rFonts w:ascii="Arial" w:hAnsi="Arial"/>
+                <w:sz w:val="16"/>
+              </w:rPr>
+              <w:t>-80.1 dBc</w:t>
+            </w:r>
+          </w:p>
+        </w:tc>
+        <w:tc>
+          <w:tcPr>
+            <w:tcW w:type="dxa" w:w="1680"/>
+            <w:shd w:fill="F7FAFC"/>
+            <w:tcMar>
+              <w:top w:w="35" w:type="dxa"/>
+              <w:bottom w:w="35" w:type="dxa"/>
+              <w:left w:w="50" w:type="dxa"/>
+              <w:right w:w="50" w:type="dxa"/>
+            </w:tcMar>
+          </w:tcPr>
+          <w:p>
+            <w:r>
+              <w:rPr>
+                <w:rFonts w:ascii="Arial" w:hAnsi="Arial"/>
+                <w:sz w:val="16"/>
+              </w:rPr>
+              <w:t>-56.2 dBc</w:t>
+            </w:r>
+          </w:p>
+        </w:tc>
+        <w:tc>
+          <w:tcPr>
+            <w:tcW w:type="dxa" w:w="1680"/>
+            <w:shd w:fill="F7FAFC"/>
+            <w:tcMar>
+              <w:top w:w="35" w:type="dxa"/>
+              <w:bottom w:w="35" w:type="dxa"/>
+              <w:left w:w="50" w:type="dxa"/>
+              <w:right w:w="50" w:type="dxa"/>
+            </w:tcMar>
+          </w:tcPr>
+          <w:p>
+            <w:r>
+              <w:rPr>
+                <w:rFonts w:ascii="Arial" w:hAnsi="Arial"/>
+                <w:sz w:val="16"/>
+              </w:rPr>
+              <w:t>-64.5 dBc</w:t>
+            </w:r>
+          </w:p>
+        </w:tc>
+      </w:tr>
+      <w:tr>
+        <w:tc>
+          <w:tcPr>
+            <w:tcW w:type="dxa" w:w="1680"/>
+            <w:shd w:fill="FFFFFF"/>
+            <w:tcMar>
+              <w:top w:w="35" w:type="dxa"/>
+              <w:bottom w:w="35" w:type="dxa"/>
+              <w:left w:w="50" w:type="dxa"/>
+              <w:right w:w="50" w:type="dxa"/>
+            </w:tcMar>
+          </w:tcPr>
+          <w:p>
+            <w:r>
+              <w:rPr>
+                <w:rFonts w:ascii="Arial" w:hAnsi="Arial"/>
+                <w:b/>
+                <w:color w:val="003366"/>
+                <w:sz w:val="16"/>
+              </w:rPr>
+              <w:t>2600 MHz</w:t>
+            </w:r>
+          </w:p>
+        </w:tc>
+        <w:tc>
+          <w:tcPr>
+            <w:tcW w:type="dxa" w:w="1680"/>
+            <w:shd w:fill="FFFFFF"/>
+            <w:tcMar>
+              <w:top w:w="35" w:type="dxa"/>
+              <w:bottom w:w="35" w:type="dxa"/>
+              <w:left w:w="50" w:type="dxa"/>
+              <w:right w:w="50" w:type="dxa"/>
+            </w:tcMar>
+          </w:tcPr>
+          <w:p>
+            <w:r>
+              <w:rPr>
+                <w:rFonts w:ascii="Arial" w:hAnsi="Arial"/>
+                <w:sz w:val="16"/>
+              </w:rPr>
+              <w:t>+7.5 dBm ±0.5 dB</w:t>
+            </w:r>
+          </w:p>
+        </w:tc>
+        <w:tc>
+          <w:tcPr>
+            <w:tcW w:type="dxa" w:w="1680"/>
+            <w:shd w:fill="FFFFFF"/>
+            <w:tcMar>
+              <w:top w:w="35" w:type="dxa"/>
+              <w:bottom w:w="35" w:type="dxa"/>
+              <w:left w:w="50" w:type="dxa"/>
+              <w:right w:w="50" w:type="dxa"/>
+            </w:tcMar>
+          </w:tcPr>
+          <w:p>
+            <w:r>
+              <w:rPr>
+                <w:rFonts w:ascii="Arial" w:hAnsi="Arial"/>
+                <w:sz w:val="16"/>
+              </w:rPr>
+              <w:t>-83.5 dBc</w:t>
+            </w:r>
+          </w:p>
+        </w:tc>
+        <w:tc>
+          <w:tcPr>
+            <w:tcW w:type="dxa" w:w="1680"/>
+            <w:shd w:fill="FFFFFF"/>
+            <w:tcMar>
+              <w:top w:w="35" w:type="dxa"/>
+              <w:bottom w:w="35" w:type="dxa"/>
+              <w:left w:w="50" w:type="dxa"/>
+              <w:right w:w="50" w:type="dxa"/>
+            </w:tcMar>
+          </w:tcPr>
+          <w:p>
+            <w:r>
+              <w:rPr>
+                <w:rFonts w:ascii="Arial" w:hAnsi="Arial"/>
+                <w:sz w:val="16"/>
+              </w:rPr>
+              <w:t>-78.9 dBc</w:t>
+            </w:r>
+          </w:p>
+        </w:tc>
+        <w:tc>
+          <w:tcPr>
+            <w:tcW w:type="dxa" w:w="1680"/>
+            <w:shd w:fill="FFFFFF"/>
+            <w:tcMar>
+              <w:top w:w="35" w:type="dxa"/>
+              <w:bottom w:w="35" w:type="dxa"/>
+              <w:left w:w="50" w:type="dxa"/>
+              <w:right w:w="50" w:type="dxa"/>
+            </w:tcMar>
+          </w:tcPr>
+          <w:p>
+            <w:r>
+              <w:rPr>
+                <w:rFonts w:ascii="Arial" w:hAnsi="Arial"/>
+                <w:sz w:val="16"/>
+              </w:rPr>
+              <w:t>-55.0 dBc</w:t>
+            </w:r>
+          </w:p>
+        </w:tc>
+        <w:tc>
+          <w:tcPr>
+            <w:tcW w:type="dxa" w:w="1680"/>
+            <w:shd w:fill="FFFFFF"/>
+            <w:tcMar>
+              <w:top w:w="35" w:type="dxa"/>
+              <w:bottom w:w="35" w:type="dxa"/>
+              <w:left w:w="50" w:type="dxa"/>
+              <w:right w:w="50" w:type="dxa"/>
+            </w:tcMar>
+          </w:tcPr>
+          <w:p>
+            <w:r>
+              <w:rPr>
+                <w:rFonts w:ascii="Arial" w:hAnsi="Arial"/>
+                <w:sz w:val="16"/>
+              </w:rPr>
+              <w:t>-62.8 dBc</w:t>
+            </w:r>
+          </w:p>
+        </w:tc>
+      </w:tr>
+      <w:tr>
+        <w:tc>
+          <w:tcPr>
+            <w:tcW w:type="dxa" w:w="1680"/>
+            <w:shd w:fill="F7FAFC"/>
+            <w:tcMar>
+              <w:top w:w="35" w:type="dxa"/>
+              <w:bottom w:w="35" w:type="dxa"/>
+              <w:left w:w="50" w:type="dxa"/>
+              <w:right w:w="50" w:type="dxa"/>
+            </w:tcMar>
+          </w:tcPr>
+          <w:p>
+            <w:r>
+              <w:rPr>
+                <w:rFonts w:ascii="Arial" w:hAnsi="Arial"/>
+                <w:b/>
+                <w:color w:val="003366"/>
+                <w:sz w:val="16"/>
+              </w:rPr>
+              <w:t>3500 MHz</w:t>
+            </w:r>
+          </w:p>
+        </w:tc>
+        <w:tc>
+          <w:tcPr>
+            <w:tcW w:type="dxa" w:w="1680"/>
+            <w:shd w:fill="F7FAFC"/>
+            <w:tcMar>
+              <w:top w:w="35" w:type="dxa"/>
+              <w:bottom w:w="35" w:type="dxa"/>
+              <w:left w:w="50" w:type="dxa"/>
+              <w:right w:w="50" w:type="dxa"/>
+            </w:tcMar>
+          </w:tcPr>
+          <w:p>
+            <w:r>
+              <w:rPr>
+                <w:rFonts w:ascii="Arial" w:hAnsi="Arial"/>
+                <w:sz w:val="16"/>
+              </w:rPr>
+              <w:t>+7.2 dBm ±0.6 dB</w:t>
+            </w:r>
+          </w:p>
+        </w:tc>
+        <w:tc>
+          <w:tcPr>
+            <w:tcW w:type="dxa" w:w="1680"/>
+            <w:shd w:fill="F7FAFC"/>
+            <w:tcMar>
+              <w:top w:w="35" w:type="dxa"/>
+              <w:bottom w:w="35" w:type="dxa"/>
+              <w:left w:w="50" w:type="dxa"/>
+              <w:right w:w="50" w:type="dxa"/>
+            </w:tcMar>
+          </w:tcPr>
+          <w:p>
+            <w:r>
+              <w:rPr>
+                <w:rFonts w:ascii="Arial" w:hAnsi="Arial"/>
+                <w:sz w:val="16"/>
+              </w:rPr>
+              <w:t>-81.2 dBc</w:t>
+            </w:r>
+          </w:p>
+        </w:tc>
+        <w:tc>
+          <w:tcPr>
+            <w:tcW w:type="dxa" w:w="1680"/>
+            <w:shd w:fill="F7FAFC"/>
+            <w:tcMar>
+              <w:top w:w="35" w:type="dxa"/>
+              <w:bottom w:w="35" w:type="dxa"/>
+              <w:left w:w="50" w:type="dxa"/>
+              <w:right w:w="50" w:type="dxa"/>
+            </w:tcMar>
+          </w:tcPr>
+          <w:p>
+            <w:r>
+              <w:rPr>
+                <w:rFonts w:ascii="Arial" w:hAnsi="Arial"/>
+                <w:sz w:val="16"/>
+              </w:rPr>
+              <w:t>-76.5 dBc</w:t>
+            </w:r>
+          </w:p>
+        </w:tc>
+        <w:tc>
+          <w:tcPr>
+            <w:tcW w:type="dxa" w:w="1680"/>
+            <w:shd w:fill="F7FAFC"/>
+            <w:tcMar>
+              <w:top w:w="35" w:type="dxa"/>
+              <w:bottom w:w="35" w:type="dxa"/>
+              <w:left w:w="50" w:type="dxa"/>
+              <w:right w:w="50" w:type="dxa"/>
+            </w:tcMar>
+          </w:tcPr>
+          <w:p>
+            <w:r>
+              <w:rPr>
+                <w:rFonts w:ascii="Arial" w:hAnsi="Arial"/>
+                <w:sz w:val="16"/>
+              </w:rPr>
+              <w:t>-53.4 dBc</w:t>
+            </w:r>
+          </w:p>
+        </w:tc>
+        <w:tc>
+          <w:tcPr>
+            <w:tcW w:type="dxa" w:w="1680"/>
+            <w:shd w:fill="F7FAFC"/>
+            <w:tcMar>
+              <w:top w:w="35" w:type="dxa"/>
+              <w:bottom w:w="35" w:type="dxa"/>
+              <w:left w:w="50" w:type="dxa"/>
+              <w:right w:w="50" w:type="dxa"/>
+            </w:tcMar>
+          </w:tcPr>
+          <w:p>
+            <w:r>
+              <w:rPr>
+                <w:rFonts w:ascii="Arial" w:hAnsi="Arial"/>
+                <w:sz w:val="16"/>
+              </w:rPr>
+              <w:t>-60.2 dBc</w:t>
+            </w:r>
+          </w:p>
+        </w:tc>
+      </w:tr>
+      <w:tr>
+        <w:tc>
+          <w:tcPr>
+            <w:tcW w:type="dxa" w:w="1680"/>
+            <w:shd w:fill="FFFFFF"/>
+            <w:tcMar>
+              <w:top w:w="35" w:type="dxa"/>
+              <w:bottom w:w="35" w:type="dxa"/>
+              <w:left w:w="50" w:type="dxa"/>
+              <w:right w:w="50" w:type="dxa"/>
+            </w:tcMar>
+          </w:tcPr>
+          <w:p>
+            <w:r>
+              <w:rPr>
+                <w:rFonts w:ascii="Arial" w:hAnsi="Arial"/>
+                <w:b/>
+                <w:color w:val="003366"/>
+                <w:sz w:val="16"/>
+              </w:rPr>
+              <w:t>5800 MHz</w:t>
+            </w:r>
+          </w:p>
+        </w:tc>
+        <w:tc>
+          <w:tcPr>
+            <w:tcW w:type="dxa" w:w="1680"/>
+            <w:shd w:fill="FFFFFF"/>
+            <w:tcMar>
+              <w:top w:w="35" w:type="dxa"/>
+              <w:bottom w:w="35" w:type="dxa"/>
+              <w:left w:w="50" w:type="dxa"/>
+              <w:right w:w="50" w:type="dxa"/>
+            </w:tcMar>
+          </w:tcPr>
+          <w:p>
+            <w:r>
+              <w:rPr>
+                <w:rFonts w:ascii="Arial" w:hAnsi="Arial"/>
+                <w:sz w:val="16"/>
+              </w:rPr>
+              <w:t>+6.8 dBm ±0.8 dB</w:t>
+            </w:r>
+          </w:p>
+        </w:tc>
+        <w:tc>
+          <w:tcPr>
+            <w:tcW w:type="dxa" w:w="1680"/>
+            <w:shd w:fill="FFFFFF"/>
+            <w:tcMar>
+              <w:top w:w="35" w:type="dxa"/>
+              <w:bottom w:w="35" w:type="dxa"/>
+              <w:left w:w="50" w:type="dxa"/>
+              <w:right w:w="50" w:type="dxa"/>
+            </w:tcMar>
+          </w:tcPr>
+          <w:p>
+            <w:r>
+              <w:rPr>
+                <w:rFonts w:ascii="Arial" w:hAnsi="Arial"/>
+                <w:sz w:val="16"/>
+              </w:rPr>
+              <w:t>-79.5 dBc</w:t>
+            </w:r>
+          </w:p>
+        </w:tc>
+        <w:tc>
+          <w:tcPr>
+            <w:tcW w:type="dxa" w:w="1680"/>
+            <w:shd w:fill="FFFFFF"/>
+            <w:tcMar>
+              <w:top w:w="35" w:type="dxa"/>
+              <w:bottom w:w="35" w:type="dxa"/>
+              <w:left w:w="50" w:type="dxa"/>
+              <w:right w:w="50" w:type="dxa"/>
+            </w:tcMar>
+          </w:tcPr>
+          <w:p>
+            <w:r>
+              <w:rPr>
+                <w:rFonts w:ascii="Arial" w:hAnsi="Arial"/>
+                <w:sz w:val="16"/>
+              </w:rPr>
+              <w:t>-74.2 dBc</w:t>
+            </w:r>
+          </w:p>
+        </w:tc>
+        <w:tc>
+          <w:tcPr>
+            <w:tcW w:type="dxa" w:w="1680"/>
+            <w:shd w:fill="FFFFFF"/>
+            <w:tcMar>
+              <w:top w:w="35" w:type="dxa"/>
+              <w:bottom w:w="35" w:type="dxa"/>
+              <w:left w:w="50" w:type="dxa"/>
+              <w:right w:w="50" w:type="dxa"/>
+            </w:tcMar>
+          </w:tcPr>
+          <w:p>
+            <w:r>
+              <w:rPr>
+                <w:rFonts w:ascii="Arial" w:hAnsi="Arial"/>
+                <w:sz w:val="16"/>
+              </w:rPr>
+              <w:t>-50.8 dBc</w:t>
+            </w:r>
+          </w:p>
+        </w:tc>
+        <w:tc>
+          <w:tcPr>
+            <w:tcW w:type="dxa" w:w="1680"/>
+            <w:shd w:fill="FFFFFF"/>
+            <w:tcMar>
+              <w:top w:w="35" w:type="dxa"/>
+              <w:bottom w:w="35" w:type="dxa"/>
+              <w:left w:w="50" w:type="dxa"/>
+              <w:right w:w="50" w:type="dxa"/>
+            </w:tcMar>
+          </w:tcPr>
+          <w:p>
+            <w:r>
+              <w:rPr>
+                <w:rFonts w:ascii="Arial" w:hAnsi="Arial"/>
+                <w:sz w:val="16"/>
+              </w:rPr>
+              <w:t>-57.5 dBc</w:t>
+            </w:r>
+          </w:p>
+        </w:tc>
+      </w:tr>
+    </w:tbl>
+    <w:p>
+      <w:pPr>
+        <w:spacing w:after="120"/>
+      </w:pPr>
+    </w:p>
+    <w:p>
+      <w:pPr>
+        <w:pStyle w:val="Heading2"/>
+      </w:pPr>
+      <w:r>
+        <w:rPr>
+          <w:rFonts w:ascii="Arial" w:hAnsi="Arial"/>
+          <w:b/>
+          <w:color w:val="003366"/>
+          <w:sz w:val="24"/>
+        </w:rPr>
+        <w:t>4.2 Transmitter Phase Noise Measurement Procedure</w:t>
+      </w:r>
+    </w:p>
+    <w:p>
+      <w:r>
+        <w:rPr>
+          <w:rFonts w:ascii="Arial" w:hAnsi="Arial"/>
+          <w:sz w:val="19"/>
+        </w:rPr>
+        <w:t>■ Step-by-Step Measurement Instructions:</w:t>
+        <w:br/>
+        <w:t>1. Set Spectrum Analyzer into Phase Noise Mode (Cross-Correlation = 10 averages).</w:t>
+        <w:br/>
+        <w:t>2. Configure carrier at 2600 MHz CW (+7.5 dBm).</w:t>
+        <w:br/>
+        <w:t>3. Set measurement offset range from 1 kHz to 40 MHz.</w:t>
+        <w:br/>
+        <w:t>4. Measure Single-Sideband (SSB) Phase Noise in dBc/Hz at 10 kHz, 100 kHz, 1 MHz, and 10 MHz offsets.</w:t>
+      </w:r>
+    </w:p>
+    <w:tbl>
+      <w:tblPr>
+        <w:tblW w:type="auto" w:w="0"/>
+        <w:jc w:val="center"/>
+        <w:tblLayout w:type="fixed"/>
+        <w:tblLook w:firstColumn="1" w:firstRow="1" w:lastColumn="0" w:lastRow="0" w:noHBand="0" w:noVBand="1" w:val="04A0"/>
+        <w:tblBorders>
+          <w:top w:val="single" w:sz="4" w:space="0" w:color="B0C4DE"/>
+          <w:bottom w:val="single" w:sz="4" w:space="0" w:color="B0C4DE"/>
+          <w:left w:val="none"/>
+          <w:right w:val="none"/>
+          <w:insideH w:val="single" w:sz="4" w:space="0" w:color="B0C4DE"/>
+          <w:insideV w:val="none"/>
+        </w:tblBorders>
+      </w:tblPr>
+      <w:tblGrid>
+        <w:gridCol w:w="1680"/>
+        <w:gridCol w:w="1680"/>
+        <w:gridCol w:w="1680"/>
+        <w:gridCol w:w="1680"/>
+        <w:gridCol w:w="1680"/>
+        <w:gridCol w:w="1680"/>
+      </w:tblGrid>
+      <w:tr>
+        <w:tc>
+          <w:tcPr>
+            <w:tcW w:type="dxa" w:w="1680"/>
+            <w:shd w:fill="003366"/>
+            <w:tcMar>
+              <w:top w:w="60" w:type="dxa"/>
+              <w:bottom w:w="60" w:type="dxa"/>
+              <w:left w:w="60" w:type="dxa"/>
+              <w:right w:w="60" w:type="dxa"/>
+            </w:tcMar>
+          </w:tcPr>
+          <w:p>
+            <w:r>
+              <w:rPr>
+                <w:rFonts w:ascii="Arial" w:hAnsi="Arial"/>
+                <w:b/>
+                <w:color w:val="FFFFFF"/>
+                <w:sz w:val="16"/>
+              </w:rPr>
+              <w:t>Carrier Frequency</w:t>
+            </w:r>
+          </w:p>
+        </w:tc>
+        <w:tc>
+          <w:tcPr>
+            <w:tcW w:type="dxa" w:w="1680"/>
+            <w:shd w:fill="003366"/>
+            <w:tcMar>
+              <w:top w:w="60" w:type="dxa"/>
+              <w:bottom w:w="60" w:type="dxa"/>
+              <w:left w:w="60" w:type="dxa"/>
+              <w:right w:w="60" w:type="dxa"/>
+            </w:tcMar>
+          </w:tcPr>
+          <w:p>
+            <w:r>
+              <w:rPr>
+                <w:rFonts w:ascii="Arial" w:hAnsi="Arial"/>
+                <w:b/>
+                <w:color w:val="FFFFFF"/>
+                <w:sz w:val="16"/>
+              </w:rPr>
+              <w:t>10 kHz Offset</w:t>
+            </w:r>
+          </w:p>
+        </w:tc>
+        <w:tc>
+          <w:tcPr>
+            <w:tcW w:type="dxa" w:w="1680"/>
+            <w:shd w:fill="003366"/>
+            <w:tcMar>
+              <w:top w:w="60" w:type="dxa"/>
+              <w:bottom w:w="60" w:type="dxa"/>
+              <w:left w:w="60" w:type="dxa"/>
+              <w:right w:w="60" w:type="dxa"/>
+            </w:tcMar>
+          </w:tcPr>
+          <w:p>
+            <w:r>
+              <w:rPr>
+                <w:rFonts w:ascii="Arial" w:hAnsi="Arial"/>
+                <w:b/>
+                <w:color w:val="FFFFFF"/>
+                <w:sz w:val="16"/>
+              </w:rPr>
+              <w:t>100 kHz Offset</w:t>
+            </w:r>
+          </w:p>
+        </w:tc>
+        <w:tc>
+          <w:tcPr>
+            <w:tcW w:type="dxa" w:w="1680"/>
+            <w:shd w:fill="003366"/>
+            <w:tcMar>
+              <w:top w:w="60" w:type="dxa"/>
+              <w:bottom w:w="60" w:type="dxa"/>
+              <w:left w:w="60" w:type="dxa"/>
+              <w:right w:w="60" w:type="dxa"/>
+            </w:tcMar>
+          </w:tcPr>
+          <w:p>
+            <w:r>
+              <w:rPr>
+                <w:rFonts w:ascii="Arial" w:hAnsi="Arial"/>
+                <w:b/>
+                <w:color w:val="FFFFFF"/>
+                <w:sz w:val="16"/>
+              </w:rPr>
+              <w:t>1 MHz Offset</w:t>
+            </w:r>
+          </w:p>
+        </w:tc>
+        <w:tc>
+          <w:tcPr>
+            <w:tcW w:type="dxa" w:w="1680"/>
+            <w:shd w:fill="003366"/>
+            <w:tcMar>
+              <w:top w:w="60" w:type="dxa"/>
+              <w:bottom w:w="60" w:type="dxa"/>
+              <w:left w:w="60" w:type="dxa"/>
+              <w:right w:w="60" w:type="dxa"/>
+            </w:tcMar>
+          </w:tcPr>
+          <w:p>
+            <w:r>
+              <w:rPr>
+                <w:rFonts w:ascii="Arial" w:hAnsi="Arial"/>
+                <w:b/>
+                <w:color w:val="FFFFFF"/>
+                <w:sz w:val="16"/>
+              </w:rPr>
+              <w:t>10 MHz Offset</w:t>
+            </w:r>
+          </w:p>
+        </w:tc>
+        <w:tc>
+          <w:tcPr>
+            <w:tcW w:type="dxa" w:w="1680"/>
+            <w:shd w:fill="003366"/>
+            <w:tcMar>
+              <w:top w:w="60" w:type="dxa"/>
+              <w:bottom w:w="60" w:type="dxa"/>
+              <w:left w:w="60" w:type="dxa"/>
+              <w:right w:w="60" w:type="dxa"/>
+            </w:tcMar>
+          </w:tcPr>
+          <w:p>
+            <w:r>
+              <w:rPr>
+                <w:rFonts w:ascii="Arial" w:hAnsi="Arial"/>
+                <w:b/>
+                <w:color w:val="FFFFFF"/>
+                <w:sz w:val="16"/>
+              </w:rPr>
+              <w:t>Integrated Jitter (1k-40M)</w:t>
+            </w:r>
+          </w:p>
+        </w:tc>
+      </w:tr>
+      <w:tr>
+        <w:tc>
+          <w:tcPr>
+            <w:tcW w:type="dxa" w:w="1680"/>
+            <w:shd w:fill="FFFFFF"/>
+            <w:tcMar>
+              <w:top w:w="35" w:type="dxa"/>
+              <w:bottom w:w="35" w:type="dxa"/>
+              <w:left w:w="50" w:type="dxa"/>
+              <w:right w:w="50" w:type="dxa"/>
+            </w:tcMar>
+          </w:tcPr>
+          <w:p>
+            <w:r>
+              <w:rPr>
+                <w:rFonts w:ascii="Arial" w:hAnsi="Arial"/>
+                <w:b/>
+                <w:color w:val="003366"/>
+                <w:sz w:val="16"/>
+              </w:rPr>
+              <w:t>800 MHz</w:t>
+            </w:r>
+          </w:p>
+        </w:tc>
+        <w:tc>
+          <w:tcPr>
+            <w:tcW w:type="dxa" w:w="1680"/>
+            <w:shd w:fill="FFFFFF"/>
+            <w:tcMar>
+              <w:top w:w="35" w:type="dxa"/>
+              <w:bottom w:w="35" w:type="dxa"/>
+              <w:left w:w="50" w:type="dxa"/>
+              <w:right w:w="50" w:type="dxa"/>
+            </w:tcMar>
+          </w:tcPr>
+          <w:p>
+            <w:r>
+              <w:rPr>
+                <w:rFonts w:ascii="Arial" w:hAnsi="Arial"/>
+                <w:sz w:val="16"/>
+              </w:rPr>
+              <w:t>-118.5 dBc/Hz</w:t>
+            </w:r>
+          </w:p>
+        </w:tc>
+        <w:tc>
+          <w:tcPr>
+            <w:tcW w:type="dxa" w:w="1680"/>
+            <w:shd w:fill="FFFFFF"/>
+            <w:tcMar>
+              <w:top w:w="35" w:type="dxa"/>
+              <w:bottom w:w="35" w:type="dxa"/>
+              <w:left w:w="50" w:type="dxa"/>
+              <w:right w:w="50" w:type="dxa"/>
+            </w:tcMar>
+          </w:tcPr>
+          <w:p>
+            <w:r>
+              <w:rPr>
+                <w:rFonts w:ascii="Arial" w:hAnsi="Arial"/>
+                <w:sz w:val="16"/>
+              </w:rPr>
+              <w:t>-126.2 dBc/Hz</w:t>
+            </w:r>
+          </w:p>
+        </w:tc>
+        <w:tc>
+          <w:tcPr>
+            <w:tcW w:type="dxa" w:w="1680"/>
+            <w:shd w:fill="FFFFFF"/>
+            <w:tcMar>
+              <w:top w:w="35" w:type="dxa"/>
+              <w:bottom w:w="35" w:type="dxa"/>
+              <w:left w:w="50" w:type="dxa"/>
+              <w:right w:w="50" w:type="dxa"/>
+            </w:tcMar>
+          </w:tcPr>
+          <w:p>
+            <w:r>
+              <w:rPr>
+                <w:rFonts w:ascii="Arial" w:hAnsi="Arial"/>
+                <w:sz w:val="16"/>
+              </w:rPr>
+              <w:t>-144.1 dBc/Hz</w:t>
+            </w:r>
+          </w:p>
+        </w:tc>
+        <w:tc>
+          <w:tcPr>
+            <w:tcW w:type="dxa" w:w="1680"/>
+            <w:shd w:fill="FFFFFF"/>
+            <w:tcMar>
+              <w:top w:w="35" w:type="dxa"/>
+              <w:bottom w:w="35" w:type="dxa"/>
+              <w:left w:w="50" w:type="dxa"/>
+              <w:right w:w="50" w:type="dxa"/>
+            </w:tcMar>
+          </w:tcPr>
+          <w:p>
+            <w:r>
+              <w:rPr>
+                <w:rFonts w:ascii="Arial" w:hAnsi="Arial"/>
+                <w:sz w:val="16"/>
+              </w:rPr>
+              <w:t>-155.8 dBc/Hz</w:t>
+            </w:r>
+          </w:p>
+        </w:tc>
+        <w:tc>
+          <w:tcPr>
+            <w:tcW w:type="dxa" w:w="1680"/>
+            <w:shd w:fill="FFFFFF"/>
+            <w:tcMar>
+              <w:top w:w="35" w:type="dxa"/>
+              <w:bottom w:w="35" w:type="dxa"/>
+              <w:left w:w="50" w:type="dxa"/>
+              <w:right w:w="50" w:type="dxa"/>
+            </w:tcMar>
+          </w:tcPr>
+          <w:p>
+            <w:r>
+              <w:rPr>
+                <w:rFonts w:ascii="Arial" w:hAnsi="Arial"/>
+                <w:sz w:val="16"/>
+              </w:rPr>
+              <w:t>115 fs rms</w:t>
+            </w:r>
+          </w:p>
+        </w:tc>
+      </w:tr>
+      <w:tr>
+        <w:tc>
+          <w:tcPr>
+            <w:tcW w:type="dxa" w:w="1680"/>
+            <w:shd w:fill="F7FAFC"/>
+            <w:tcMar>
+              <w:top w:w="35" w:type="dxa"/>
+              <w:bottom w:w="35" w:type="dxa"/>
+              <w:left w:w="50" w:type="dxa"/>
+              <w:right w:w="50" w:type="dxa"/>
+            </w:tcMar>
+          </w:tcPr>
+          <w:p>
+            <w:r>
+              <w:rPr>
+                <w:rFonts w:ascii="Arial" w:hAnsi="Arial"/>
+                <w:b/>
+                <w:color w:val="003366"/>
+                <w:sz w:val="16"/>
+              </w:rPr>
+              <w:t>1800 MHz</w:t>
+            </w:r>
+          </w:p>
+        </w:tc>
+        <w:tc>
+          <w:tcPr>
+            <w:tcW w:type="dxa" w:w="1680"/>
+            <w:shd w:fill="F7FAFC"/>
+            <w:tcMar>
+              <w:top w:w="35" w:type="dxa"/>
+              <w:bottom w:w="35" w:type="dxa"/>
+              <w:left w:w="50" w:type="dxa"/>
+              <w:right w:w="50" w:type="dxa"/>
+            </w:tcMar>
+          </w:tcPr>
+          <w:p>
+            <w:r>
+              <w:rPr>
+                <w:rFonts w:ascii="Arial" w:hAnsi="Arial"/>
+                <w:sz w:val="16"/>
+              </w:rPr>
+              <w:t>-112.0 dBc/Hz</w:t>
+            </w:r>
+          </w:p>
+        </w:tc>
+        <w:tc>
+          <w:tcPr>
+            <w:tcW w:type="dxa" w:w="1680"/>
+            <w:shd w:fill="F7FAFC"/>
+            <w:tcMar>
+              <w:top w:w="35" w:type="dxa"/>
+              <w:bottom w:w="35" w:type="dxa"/>
+              <w:left w:w="50" w:type="dxa"/>
+              <w:right w:w="50" w:type="dxa"/>
+            </w:tcMar>
+          </w:tcPr>
+          <w:p>
+            <w:r>
+              <w:rPr>
+                <w:rFonts w:ascii="Arial" w:hAnsi="Arial"/>
+                <w:sz w:val="16"/>
+              </w:rPr>
+              <w:t>-120.5 dBc/Hz</w:t>
+            </w:r>
+          </w:p>
+        </w:tc>
+        <w:tc>
+          <w:tcPr>
+            <w:tcW w:type="dxa" w:w="1680"/>
+            <w:shd w:fill="F7FAFC"/>
+            <w:tcMar>
+              <w:top w:w="35" w:type="dxa"/>
+              <w:bottom w:w="35" w:type="dxa"/>
+              <w:left w:w="50" w:type="dxa"/>
+              <w:right w:w="50" w:type="dxa"/>
+            </w:tcMar>
+          </w:tcPr>
+          <w:p>
+            <w:r>
+              <w:rPr>
+                <w:rFonts w:ascii="Arial" w:hAnsi="Arial"/>
+                <w:sz w:val="16"/>
+              </w:rPr>
+              <w:t>-138.4 dBc/Hz</w:t>
+            </w:r>
+          </w:p>
+        </w:tc>
+        <w:tc>
+          <w:tcPr>
+            <w:tcW w:type="dxa" w:w="1680"/>
+            <w:shd w:fill="F7FAFC"/>
+            <w:tcMar>
+              <w:top w:w="35" w:type="dxa"/>
+              <w:bottom w:w="35" w:type="dxa"/>
+              <w:left w:w="50" w:type="dxa"/>
+              <w:right w:w="50" w:type="dxa"/>
+            </w:tcMar>
+          </w:tcPr>
+          <w:p>
+            <w:r>
+              <w:rPr>
+                <w:rFonts w:ascii="Arial" w:hAnsi="Arial"/>
+                <w:sz w:val="16"/>
+              </w:rPr>
+              <w:t>-151.2 dBc/Hz</w:t>
+            </w:r>
+          </w:p>
+        </w:tc>
+        <w:tc>
+          <w:tcPr>
+            <w:tcW w:type="dxa" w:w="1680"/>
+            <w:shd w:fill="F7FAFC"/>
+            <w:tcMar>
+              <w:top w:w="35" w:type="dxa"/>
+              <w:bottom w:w="35" w:type="dxa"/>
+              <w:left w:w="50" w:type="dxa"/>
+              <w:right w:w="50" w:type="dxa"/>
+            </w:tcMar>
+          </w:tcPr>
+          <w:p>
+            <w:r>
+              <w:rPr>
+                <w:rFonts w:ascii="Arial" w:hAnsi="Arial"/>
+                <w:sz w:val="16"/>
+              </w:rPr>
+              <w:t>145 fs rms</w:t>
+            </w:r>
+          </w:p>
+        </w:tc>
+      </w:tr>
+      <w:tr>
+        <w:tc>
+          <w:tcPr>
+            <w:tcW w:type="dxa" w:w="1680"/>
+            <w:shd w:fill="FFFFFF"/>
+            <w:tcMar>
+              <w:top w:w="35" w:type="dxa"/>
+              <w:bottom w:w="35" w:type="dxa"/>
+              <w:left w:w="50" w:type="dxa"/>
+              <w:right w:w="50" w:type="dxa"/>
+            </w:tcMar>
+          </w:tcPr>
+          <w:p>
+            <w:r>
+              <w:rPr>
+                <w:rFonts w:ascii="Arial" w:hAnsi="Arial"/>
+                <w:b/>
+                <w:color w:val="003366"/>
+                <w:sz w:val="16"/>
+              </w:rPr>
+              <w:t>2600 MHz</w:t>
+            </w:r>
+          </w:p>
+        </w:tc>
+        <w:tc>
+          <w:tcPr>
+            <w:tcW w:type="dxa" w:w="1680"/>
+            <w:shd w:fill="FFFFFF"/>
+            <w:tcMar>
+              <w:top w:w="35" w:type="dxa"/>
+              <w:bottom w:w="35" w:type="dxa"/>
+              <w:left w:w="50" w:type="dxa"/>
+              <w:right w:w="50" w:type="dxa"/>
+            </w:tcMar>
+          </w:tcPr>
+          <w:p>
+            <w:r>
+              <w:rPr>
+                <w:rFonts w:ascii="Arial" w:hAnsi="Arial"/>
+                <w:sz w:val="16"/>
+              </w:rPr>
+              <w:t>-108.2 dBc/Hz</w:t>
+            </w:r>
+          </w:p>
+        </w:tc>
+        <w:tc>
+          <w:tcPr>
+            <w:tcW w:type="dxa" w:w="1680"/>
+            <w:shd w:fill="FFFFFF"/>
+            <w:tcMar>
+              <w:top w:w="35" w:type="dxa"/>
+              <w:bottom w:w="35" w:type="dxa"/>
+              <w:left w:w="50" w:type="dxa"/>
+              <w:right w:w="50" w:type="dxa"/>
+            </w:tcMar>
+          </w:tcPr>
+          <w:p>
+            <w:r>
+              <w:rPr>
+                <w:rFonts w:ascii="Arial" w:hAnsi="Arial"/>
+                <w:sz w:val="16"/>
+              </w:rPr>
+              <w:t>-116.4 dBc/Hz</w:t>
+            </w:r>
+          </w:p>
+        </w:tc>
+        <w:tc>
+          <w:tcPr>
+            <w:tcW w:type="dxa" w:w="1680"/>
+            <w:shd w:fill="FFFFFF"/>
+            <w:tcMar>
+              <w:top w:w="35" w:type="dxa"/>
+              <w:bottom w:w="35" w:type="dxa"/>
+              <w:left w:w="50" w:type="dxa"/>
+              <w:right w:w="50" w:type="dxa"/>
+            </w:tcMar>
+          </w:tcPr>
+          <w:p>
+            <w:r>
+              <w:rPr>
+                <w:rFonts w:ascii="Arial" w:hAnsi="Arial"/>
+                <w:sz w:val="16"/>
+              </w:rPr>
+              <w:t>-134.2 dBc/Hz</w:t>
+            </w:r>
+          </w:p>
+        </w:tc>
+        <w:tc>
+          <w:tcPr>
+            <w:tcW w:type="dxa" w:w="1680"/>
+            <w:shd w:fill="FFFFFF"/>
+            <w:tcMar>
+              <w:top w:w="35" w:type="dxa"/>
+              <w:bottom w:w="35" w:type="dxa"/>
+              <w:left w:w="50" w:type="dxa"/>
+              <w:right w:w="50" w:type="dxa"/>
+            </w:tcMar>
+          </w:tcPr>
+          <w:p>
+            <w:r>
+              <w:rPr>
+                <w:rFonts w:ascii="Arial" w:hAnsi="Arial"/>
+                <w:sz w:val="16"/>
+              </w:rPr>
+              <w:t>-147.5 dBc/Hz</w:t>
+            </w:r>
+          </w:p>
+        </w:tc>
+        <w:tc>
+          <w:tcPr>
+            <w:tcW w:type="dxa" w:w="1680"/>
+            <w:shd w:fill="FFFFFF"/>
+            <w:tcMar>
+              <w:top w:w="35" w:type="dxa"/>
+              <w:bottom w:w="35" w:type="dxa"/>
+              <w:left w:w="50" w:type="dxa"/>
+              <w:right w:w="50" w:type="dxa"/>
+            </w:tcMar>
+          </w:tcPr>
+          <w:p>
+            <w:r>
+              <w:rPr>
+                <w:rFonts w:ascii="Arial" w:hAnsi="Arial"/>
+                <w:sz w:val="16"/>
+              </w:rPr>
+              <w:t>180 fs rms</w:t>
+            </w:r>
+          </w:p>
+        </w:tc>
+      </w:tr>
+      <w:tr>
+        <w:tc>
+          <w:tcPr>
+            <w:tcW w:type="dxa" w:w="1680"/>
+            <w:shd w:fill="F7FAFC"/>
+            <w:tcMar>
+              <w:top w:w="35" w:type="dxa"/>
+              <w:bottom w:w="35" w:type="dxa"/>
+              <w:left w:w="50" w:type="dxa"/>
+              <w:right w:w="50" w:type="dxa"/>
+            </w:tcMar>
+          </w:tcPr>
+          <w:p>
+            <w:r>
+              <w:rPr>
+                <w:rFonts w:ascii="Arial" w:hAnsi="Arial"/>
+                <w:b/>
+                <w:color w:val="003366"/>
+                <w:sz w:val="16"/>
+              </w:rPr>
+              <w:t>3500 MHz</w:t>
+            </w:r>
+          </w:p>
+        </w:tc>
+        <w:tc>
+          <w:tcPr>
+            <w:tcW w:type="dxa" w:w="1680"/>
+            <w:shd w:fill="F7FAFC"/>
+            <w:tcMar>
+              <w:top w:w="35" w:type="dxa"/>
+              <w:bottom w:w="35" w:type="dxa"/>
+              <w:left w:w="50" w:type="dxa"/>
+              <w:right w:w="50" w:type="dxa"/>
+            </w:tcMar>
+          </w:tcPr>
+          <w:p>
+            <w:r>
+              <w:rPr>
+                <w:rFonts w:ascii="Arial" w:hAnsi="Arial"/>
+                <w:sz w:val="16"/>
+              </w:rPr>
+              <w:t>-104.5 dBc/Hz</w:t>
+            </w:r>
+          </w:p>
+        </w:tc>
+        <w:tc>
+          <w:tcPr>
+            <w:tcW w:type="dxa" w:w="1680"/>
+            <w:shd w:fill="F7FAFC"/>
+            <w:tcMar>
+              <w:top w:w="35" w:type="dxa"/>
+              <w:bottom w:w="35" w:type="dxa"/>
+              <w:left w:w="50" w:type="dxa"/>
+              <w:right w:w="50" w:type="dxa"/>
+            </w:tcMar>
+          </w:tcPr>
+          <w:p>
+            <w:r>
+              <w:rPr>
+                <w:rFonts w:ascii="Arial" w:hAnsi="Arial"/>
+                <w:sz w:val="16"/>
+              </w:rPr>
+              <w:t>-112.8 dBc/Hz</w:t>
+            </w:r>
+          </w:p>
+        </w:tc>
+        <w:tc>
+          <w:tcPr>
+            <w:tcW w:type="dxa" w:w="1680"/>
+            <w:shd w:fill="F7FAFC"/>
+            <w:tcMar>
+              <w:top w:w="35" w:type="dxa"/>
+              <w:bottom w:w="35" w:type="dxa"/>
+              <w:left w:w="50" w:type="dxa"/>
+              <w:right w:w="50" w:type="dxa"/>
+            </w:tcMar>
+          </w:tcPr>
+          <w:p>
+            <w:r>
+              <w:rPr>
+                <w:rFonts w:ascii="Arial" w:hAnsi="Arial"/>
+                <w:sz w:val="16"/>
+              </w:rPr>
+              <w:t>-130.6 dBc/Hz</w:t>
+            </w:r>
+          </w:p>
+        </w:tc>
+        <w:tc>
+          <w:tcPr>
+            <w:tcW w:type="dxa" w:w="1680"/>
+            <w:shd w:fill="F7FAFC"/>
+            <w:tcMar>
+              <w:top w:w="35" w:type="dxa"/>
+              <w:bottom w:w="35" w:type="dxa"/>
+              <w:left w:w="50" w:type="dxa"/>
+              <w:right w:w="50" w:type="dxa"/>
+            </w:tcMar>
+          </w:tcPr>
+          <w:p>
+            <w:r>
+              <w:rPr>
+                <w:rFonts w:ascii="Arial" w:hAnsi="Arial"/>
+                <w:sz w:val="16"/>
+              </w:rPr>
+              <w:t>-144.0 dBc/Hz</w:t>
+            </w:r>
+          </w:p>
+        </w:tc>
+        <w:tc>
+          <w:tcPr>
+            <w:tcW w:type="dxa" w:w="1680"/>
+            <w:shd w:fill="F7FAFC"/>
+            <w:tcMar>
+              <w:top w:w="35" w:type="dxa"/>
+              <w:bottom w:w="35" w:type="dxa"/>
+              <w:left w:w="50" w:type="dxa"/>
+              <w:right w:w="50" w:type="dxa"/>
+            </w:tcMar>
+          </w:tcPr>
+          <w:p>
+            <w:r>
+              <w:rPr>
+                <w:rFonts w:ascii="Arial" w:hAnsi="Arial"/>
+                <w:sz w:val="16"/>
+              </w:rPr>
+              <w:t>220 fs rms</w:t>
+            </w:r>
+          </w:p>
+        </w:tc>
+      </w:tr>
+      <w:tr>
+        <w:tc>
+          <w:tcPr>
+            <w:tcW w:type="dxa" w:w="1680"/>
+            <w:shd w:fill="FFFFFF"/>
+            <w:tcMar>
+              <w:top w:w="35" w:type="dxa"/>
+              <w:bottom w:w="35" w:type="dxa"/>
+              <w:left w:w="50" w:type="dxa"/>
+              <w:right w:w="50" w:type="dxa"/>
+            </w:tcMar>
+          </w:tcPr>
+          <w:p>
+            <w:r>
+              <w:rPr>
+                <w:rFonts w:ascii="Arial" w:hAnsi="Arial"/>
+                <w:b/>
+                <w:color w:val="003366"/>
+                <w:sz w:val="16"/>
+              </w:rPr>
+              <w:t>5800 MHz</w:t>
+            </w:r>
+          </w:p>
+        </w:tc>
+        <w:tc>
+          <w:tcPr>
+            <w:tcW w:type="dxa" w:w="1680"/>
+            <w:shd w:fill="FFFFFF"/>
+            <w:tcMar>
+              <w:top w:w="35" w:type="dxa"/>
+              <w:bottom w:w="35" w:type="dxa"/>
+              <w:left w:w="50" w:type="dxa"/>
+              <w:right w:w="50" w:type="dxa"/>
+            </w:tcMar>
+          </w:tcPr>
+          <w:p>
+            <w:r>
+              <w:rPr>
+                <w:rFonts w:ascii="Arial" w:hAnsi="Arial"/>
+                <w:sz w:val="16"/>
+              </w:rPr>
+              <w:t>-98.8 dBc/Hz</w:t>
+            </w:r>
+          </w:p>
+        </w:tc>
+        <w:tc>
+          <w:tcPr>
+            <w:tcW w:type="dxa" w:w="1680"/>
+            <w:shd w:fill="FFFFFF"/>
+            <w:tcMar>
+              <w:top w:w="35" w:type="dxa"/>
+              <w:bottom w:w="35" w:type="dxa"/>
+              <w:left w:w="50" w:type="dxa"/>
+              <w:right w:w="50" w:type="dxa"/>
+            </w:tcMar>
+          </w:tcPr>
+          <w:p>
+            <w:r>
+              <w:rPr>
+                <w:rFonts w:ascii="Arial" w:hAnsi="Arial"/>
+                <w:sz w:val="16"/>
+              </w:rPr>
+              <w:t>-107.1 dBc/Hz</w:t>
+            </w:r>
+          </w:p>
+        </w:tc>
+        <w:tc>
+          <w:tcPr>
+            <w:tcW w:type="dxa" w:w="1680"/>
+            <w:shd w:fill="FFFFFF"/>
+            <w:tcMar>
+              <w:top w:w="35" w:type="dxa"/>
+              <w:bottom w:w="35" w:type="dxa"/>
+              <w:left w:w="50" w:type="dxa"/>
+              <w:right w:w="50" w:type="dxa"/>
+            </w:tcMar>
+          </w:tcPr>
+          <w:p>
+            <w:r>
+              <w:rPr>
+                <w:rFonts w:ascii="Arial" w:hAnsi="Arial"/>
+                <w:sz w:val="16"/>
+              </w:rPr>
+              <w:t>-125.0 dBc/Hz</w:t>
+            </w:r>
+          </w:p>
+        </w:tc>
+        <w:tc>
+          <w:tcPr>
+            <w:tcW w:type="dxa" w:w="1680"/>
+            <w:shd w:fill="FFFFFF"/>
+            <w:tcMar>
+              <w:top w:w="35" w:type="dxa"/>
+              <w:bottom w:w="35" w:type="dxa"/>
+              <w:left w:w="50" w:type="dxa"/>
+              <w:right w:w="50" w:type="dxa"/>
+            </w:tcMar>
+          </w:tcPr>
+          <w:p>
+            <w:r>
+              <w:rPr>
+                <w:rFonts w:ascii="Arial" w:hAnsi="Arial"/>
+                <w:sz w:val="16"/>
+              </w:rPr>
+              <w:t>-138.5 dBc/Hz</w:t>
+            </w:r>
+          </w:p>
+        </w:tc>
+        <w:tc>
+          <w:tcPr>
+            <w:tcW w:type="dxa" w:w="1680"/>
+            <w:shd w:fill="FFFFFF"/>
+            <w:tcMar>
+              <w:top w:w="35" w:type="dxa"/>
+              <w:bottom w:w="35" w:type="dxa"/>
+              <w:left w:w="50" w:type="dxa"/>
+              <w:right w:w="50" w:type="dxa"/>
+            </w:tcMar>
+          </w:tcPr>
+          <w:p>
+            <w:r>
+              <w:rPr>
+                <w:rFonts w:ascii="Arial" w:hAnsi="Arial"/>
+                <w:sz w:val="16"/>
+              </w:rPr>
+              <w:t>310 fs rms</w:t>
+            </w:r>
+          </w:p>
+        </w:tc>
+      </w:tr>
+    </w:tbl>
+    <w:p>
+      <w:pPr>
+        <w:spacing w:after="120"/>
+      </w:pPr>
+    </w:p>
+    <w:p>
+      <w:pPr>
+        <w:pStyle w:val="Heading2"/>
+      </w:pPr>
+      <w:r>
+        <w:rPr>
+          <w:rFonts w:ascii="Arial" w:hAnsi="Arial"/>
+          <w:b/>
+          <w:color w:val="003366"/>
+          <w:sz w:val="24"/>
+        </w:rPr>
+        <w:t>4.3 Receiver (RX) Noise Figure, Gain &amp; Linearity Measurement Procedure</w:t>
+      </w:r>
+    </w:p>
+    <w:p>
+      <w:r>
+        <w:rPr>
+          <w:rFonts w:ascii="Arial" w:hAnsi="Arial"/>
+          <w:sz w:val="19"/>
+        </w:rPr>
+        <w:t>■ Step-by-Step Measurement Instructions:</w:t>
+        <w:br/>
+        <w:t>1. Connect calibrated RF Signal Generator to RX1_IN with 50Ω cable.</w:t>
+        <w:br/>
+        <w:t>2. Set RX LO to 2.6 GHz and analog gain to Maximum (Gain Index 255).</w:t>
+        <w:br/>
+        <w:t>3. Inject -50 dBm tone at 2605 MHz (+5 MHz IF offset).</w:t>
+        <w:br/>
+        <w:t>4. Read digital FFT power in eLynxSDR to verify RX conversion gain.</w:t>
+        <w:br/>
+        <w:t>5. Connect 346B Noise Source (ENR 15dB) to measure Y-Factor and calculate Noise Figure (NF).</w:t>
+        <w:br/>
+        <w:t>6. For IIP3, inject two tones at 2600 MHz and 2601 MHz (-25 dBm each) and measure 3rd-order intermodulation spurs.</w:t>
+      </w:r>
+    </w:p>
+    <w:tbl>
+      <w:tblPr>
+        <w:tblW w:type="auto" w:w="0"/>
+        <w:jc w:val="center"/>
+        <w:tblLayout w:type="fixed"/>
+        <w:tblLook w:firstColumn="1" w:firstRow="1" w:lastColumn="0" w:lastRow="0" w:noHBand="0" w:noVBand="1" w:val="04A0"/>
+        <w:tblBorders>
+          <w:top w:val="single" w:sz="4" w:space="0" w:color="B0C4DE"/>
+          <w:bottom w:val="single" w:sz="4" w:space="0" w:color="B0C4DE"/>
+          <w:left w:val="none"/>
+          <w:right w:val="none"/>
+          <w:insideH w:val="single" w:sz="4" w:space="0" w:color="B0C4DE"/>
+          <w:insideV w:val="none"/>
+        </w:tblBorders>
+      </w:tblPr>
+      <w:tblGrid>
+        <w:gridCol w:w="1680"/>
+        <w:gridCol w:w="1680"/>
+        <w:gridCol w:w="1680"/>
+        <w:gridCol w:w="1680"/>
+        <w:gridCol w:w="1680"/>
+        <w:gridCol w:w="1680"/>
+      </w:tblGrid>
+      <w:tr>
+        <w:tc>
+          <w:tcPr>
+            <w:tcW w:type="dxa" w:w="1680"/>
+            <w:shd w:fill="003366"/>
+            <w:tcMar>
+              <w:top w:w="60" w:type="dxa"/>
+              <w:bottom w:w="60" w:type="dxa"/>
+              <w:left w:w="60" w:type="dxa"/>
+              <w:right w:w="60" w:type="dxa"/>
+            </w:tcMar>
+          </w:tcPr>
+          <w:p>
+            <w:r>
+              <w:rPr>
+                <w:rFonts w:ascii="Arial" w:hAnsi="Arial"/>
+                <w:b/>
+                <w:color w:val="FFFFFF"/>
+                <w:sz w:val="16"/>
+              </w:rPr>
+              <w:t>Carrier Frequency</w:t>
+            </w:r>
+          </w:p>
+        </w:tc>
+        <w:tc>
+          <w:tcPr>
+            <w:tcW w:type="dxa" w:w="1680"/>
+            <w:shd w:fill="003366"/>
+            <w:tcMar>
+              <w:top w:w="60" w:type="dxa"/>
+              <w:bottom w:w="60" w:type="dxa"/>
+              <w:left w:w="60" w:type="dxa"/>
+              <w:right w:w="60" w:type="dxa"/>
+            </w:tcMar>
+          </w:tcPr>
+          <w:p>
+            <w:r>
+              <w:rPr>
+                <w:rFonts w:ascii="Arial" w:hAnsi="Arial"/>
+                <w:b/>
+                <w:color w:val="FFFFFF"/>
+                <w:sz w:val="16"/>
+              </w:rPr>
+              <w:t>Max Gain (Index 255)</w:t>
+            </w:r>
+          </w:p>
+        </w:tc>
+        <w:tc>
+          <w:tcPr>
+            <w:tcW w:type="dxa" w:w="1680"/>
+            <w:shd w:fill="003366"/>
+            <w:tcMar>
+              <w:top w:w="60" w:type="dxa"/>
+              <w:bottom w:w="60" w:type="dxa"/>
+              <w:left w:w="60" w:type="dxa"/>
+              <w:right w:w="60" w:type="dxa"/>
+            </w:tcMar>
+          </w:tcPr>
+          <w:p>
+            <w:r>
+              <w:rPr>
+                <w:rFonts w:ascii="Arial" w:hAnsi="Arial"/>
+                <w:b/>
+                <w:color w:val="FFFFFF"/>
+                <w:sz w:val="16"/>
+              </w:rPr>
+              <w:t>Noise Figure (NF)</w:t>
+            </w:r>
+          </w:p>
+        </w:tc>
+        <w:tc>
+          <w:tcPr>
+            <w:tcW w:type="dxa" w:w="1680"/>
+            <w:shd w:fill="003366"/>
+            <w:tcMar>
+              <w:top w:w="60" w:type="dxa"/>
+              <w:bottom w:w="60" w:type="dxa"/>
+              <w:left w:w="60" w:type="dxa"/>
+              <w:right w:w="60" w:type="dxa"/>
+            </w:tcMar>
+          </w:tcPr>
+          <w:p>
+            <w:r>
+              <w:rPr>
+                <w:rFonts w:ascii="Arial" w:hAnsi="Arial"/>
+                <w:b/>
+                <w:color w:val="FFFFFF"/>
+                <w:sz w:val="16"/>
+              </w:rPr>
+              <w:t>Input P1dB</w:t>
+            </w:r>
+          </w:p>
+        </w:tc>
+        <w:tc>
+          <w:tcPr>
+            <w:tcW w:type="dxa" w:w="1680"/>
+            <w:shd w:fill="003366"/>
+            <w:tcMar>
+              <w:top w:w="60" w:type="dxa"/>
+              <w:bottom w:w="60" w:type="dxa"/>
+              <w:left w:w="60" w:type="dxa"/>
+              <w:right w:w="60" w:type="dxa"/>
+            </w:tcMar>
+          </w:tcPr>
+          <w:p>
+            <w:r>
+              <w:rPr>
+                <w:rFonts w:ascii="Arial" w:hAnsi="Arial"/>
+                <w:b/>
+                <w:color w:val="FFFFFF"/>
+                <w:sz w:val="16"/>
+              </w:rPr>
+              <w:t>Input IP3 (IIP3)</w:t>
+            </w:r>
+          </w:p>
+        </w:tc>
+        <w:tc>
+          <w:tcPr>
+            <w:tcW w:type="dxa" w:w="1680"/>
+            <w:shd w:fill="003366"/>
+            <w:tcMar>
+              <w:top w:w="60" w:type="dxa"/>
+              <w:bottom w:w="60" w:type="dxa"/>
+              <w:left w:w="60" w:type="dxa"/>
+              <w:right w:w="60" w:type="dxa"/>
+            </w:tcMar>
+          </w:tcPr>
+          <w:p>
+            <w:r>
+              <w:rPr>
+                <w:rFonts w:ascii="Arial" w:hAnsi="Arial"/>
+                <w:b/>
+                <w:color w:val="FFFFFF"/>
+                <w:sz w:val="16"/>
+              </w:rPr>
+              <w:t>Image Rejection</w:t>
+            </w:r>
+          </w:p>
+        </w:tc>
+      </w:tr>
+      <w:tr>
+        <w:tc>
+          <w:tcPr>
+            <w:tcW w:type="dxa" w:w="1680"/>
+            <w:shd w:fill="FFFFFF"/>
+            <w:tcMar>
+              <w:top w:w="35" w:type="dxa"/>
+              <w:bottom w:w="35" w:type="dxa"/>
+              <w:left w:w="50" w:type="dxa"/>
+              <w:right w:w="50" w:type="dxa"/>
+            </w:tcMar>
+          </w:tcPr>
+          <w:p>
+            <w:r>
+              <w:rPr>
+                <w:rFonts w:ascii="Arial" w:hAnsi="Arial"/>
+                <w:b/>
+                <w:color w:val="003366"/>
+                <w:sz w:val="16"/>
+              </w:rPr>
+              <w:t>800 MHz</w:t>
+            </w:r>
+          </w:p>
+        </w:tc>
+        <w:tc>
+          <w:tcPr>
+            <w:tcW w:type="dxa" w:w="1680"/>
+            <w:shd w:fill="FFFFFF"/>
+            <w:tcMar>
+              <w:top w:w="35" w:type="dxa"/>
+              <w:bottom w:w="35" w:type="dxa"/>
+              <w:left w:w="50" w:type="dxa"/>
+              <w:right w:w="50" w:type="dxa"/>
+            </w:tcMar>
+          </w:tcPr>
+          <w:p>
+            <w:r>
+              <w:rPr>
+                <w:rFonts w:ascii="Arial" w:hAnsi="Arial"/>
+                <w:sz w:val="16"/>
+              </w:rPr>
+              <w:t>38.5 dB ±0.5 dB</w:t>
+            </w:r>
+          </w:p>
+        </w:tc>
+        <w:tc>
+          <w:tcPr>
+            <w:tcW w:type="dxa" w:w="1680"/>
+            <w:shd w:fill="FFFFFF"/>
+            <w:tcMar>
+              <w:top w:w="35" w:type="dxa"/>
+              <w:bottom w:w="35" w:type="dxa"/>
+              <w:left w:w="50" w:type="dxa"/>
+              <w:right w:w="50" w:type="dxa"/>
+            </w:tcMar>
+          </w:tcPr>
+          <w:p>
+            <w:r>
+              <w:rPr>
+                <w:rFonts w:ascii="Arial" w:hAnsi="Arial"/>
+                <w:sz w:val="16"/>
+              </w:rPr>
+              <w:t>11.5 dB</w:t>
+            </w:r>
+          </w:p>
+        </w:tc>
+        <w:tc>
+          <w:tcPr>
+            <w:tcW w:type="dxa" w:w="1680"/>
+            <w:shd w:fill="FFFFFF"/>
+            <w:tcMar>
+              <w:top w:w="35" w:type="dxa"/>
+              <w:bottom w:w="35" w:type="dxa"/>
+              <w:left w:w="50" w:type="dxa"/>
+              <w:right w:w="50" w:type="dxa"/>
+            </w:tcMar>
+          </w:tcPr>
+          <w:p>
+            <w:r>
+              <w:rPr>
+                <w:rFonts w:ascii="Arial" w:hAnsi="Arial"/>
+                <w:sz w:val="16"/>
+              </w:rPr>
+              <w:t>-13.5 dBm</w:t>
+            </w:r>
+          </w:p>
+        </w:tc>
+        <w:tc>
+          <w:tcPr>
+            <w:tcW w:type="dxa" w:w="1680"/>
+            <w:shd w:fill="FFFFFF"/>
+            <w:tcMar>
+              <w:top w:w="35" w:type="dxa"/>
+              <w:bottom w:w="35" w:type="dxa"/>
+              <w:left w:w="50" w:type="dxa"/>
+              <w:right w:w="50" w:type="dxa"/>
+            </w:tcMar>
+          </w:tcPr>
+          <w:p>
+            <w:r>
+              <w:rPr>
+                <w:rFonts w:ascii="Arial" w:hAnsi="Arial"/>
+                <w:sz w:val="16"/>
+              </w:rPr>
+              <w:t>+24.5 dBm</w:t>
+            </w:r>
+          </w:p>
+        </w:tc>
+        <w:tc>
+          <w:tcPr>
+            <w:tcW w:type="dxa" w:w="1680"/>
+            <w:shd w:fill="FFFFFF"/>
+            <w:tcMar>
+              <w:top w:w="35" w:type="dxa"/>
+              <w:bottom w:w="35" w:type="dxa"/>
+              <w:left w:w="50" w:type="dxa"/>
+              <w:right w:w="50" w:type="dxa"/>
+            </w:tcMar>
+          </w:tcPr>
+          <w:p>
+            <w:r>
+              <w:rPr>
+                <w:rFonts w:ascii="Arial" w:hAnsi="Arial"/>
+                <w:sz w:val="16"/>
+              </w:rPr>
+              <w:t>&gt; 78 dBc</w:t>
+            </w:r>
+          </w:p>
+        </w:tc>
+      </w:tr>
+      <w:tr>
+        <w:tc>
+          <w:tcPr>
+            <w:tcW w:type="dxa" w:w="1680"/>
+            <w:shd w:fill="F7FAFC"/>
+            <w:tcMar>
+              <w:top w:w="35" w:type="dxa"/>
+              <w:bottom w:w="35" w:type="dxa"/>
+              <w:left w:w="50" w:type="dxa"/>
+              <w:right w:w="50" w:type="dxa"/>
+            </w:tcMar>
+          </w:tcPr>
+          <w:p>
+            <w:r>
+              <w:rPr>
+                <w:rFonts w:ascii="Arial" w:hAnsi="Arial"/>
+                <w:b/>
+                <w:color w:val="003366"/>
+                <w:sz w:val="16"/>
+              </w:rPr>
+              <w:t>1800 MHz</w:t>
+            </w:r>
+          </w:p>
+        </w:tc>
+        <w:tc>
+          <w:tcPr>
+            <w:tcW w:type="dxa" w:w="1680"/>
+            <w:shd w:fill="F7FAFC"/>
+            <w:tcMar>
+              <w:top w:w="35" w:type="dxa"/>
+              <w:bottom w:w="35" w:type="dxa"/>
+              <w:left w:w="50" w:type="dxa"/>
+              <w:right w:w="50" w:type="dxa"/>
+            </w:tcMar>
+          </w:tcPr>
+          <w:p>
+            <w:r>
+              <w:rPr>
+                <w:rFonts w:ascii="Arial" w:hAnsi="Arial"/>
+                <w:sz w:val="16"/>
+              </w:rPr>
+              <w:t>37.8 dB ±0.5 dB</w:t>
+            </w:r>
+          </w:p>
+        </w:tc>
+        <w:tc>
+          <w:tcPr>
+            <w:tcW w:type="dxa" w:w="1680"/>
+            <w:shd w:fill="F7FAFC"/>
+            <w:tcMar>
+              <w:top w:w="35" w:type="dxa"/>
+              <w:bottom w:w="35" w:type="dxa"/>
+              <w:left w:w="50" w:type="dxa"/>
+              <w:right w:w="50" w:type="dxa"/>
+            </w:tcMar>
+          </w:tcPr>
+          <w:p>
+            <w:r>
+              <w:rPr>
+                <w:rFonts w:ascii="Arial" w:hAnsi="Arial"/>
+                <w:sz w:val="16"/>
+              </w:rPr>
+              <w:t>12.0 dB</w:t>
+            </w:r>
+          </w:p>
+        </w:tc>
+        <w:tc>
+          <w:tcPr>
+            <w:tcW w:type="dxa" w:w="1680"/>
+            <w:shd w:fill="F7FAFC"/>
+            <w:tcMar>
+              <w:top w:w="35" w:type="dxa"/>
+              <w:bottom w:w="35" w:type="dxa"/>
+              <w:left w:w="50" w:type="dxa"/>
+              <w:right w:w="50" w:type="dxa"/>
+            </w:tcMar>
+          </w:tcPr>
+          <w:p>
+            <w:r>
+              <w:rPr>
+                <w:rFonts w:ascii="Arial" w:hAnsi="Arial"/>
+                <w:sz w:val="16"/>
+              </w:rPr>
+              <w:t>-13.0 dBm</w:t>
+            </w:r>
+          </w:p>
+        </w:tc>
+        <w:tc>
+          <w:tcPr>
+            <w:tcW w:type="dxa" w:w="1680"/>
+            <w:shd w:fill="F7FAFC"/>
+            <w:tcMar>
+              <w:top w:w="35" w:type="dxa"/>
+              <w:bottom w:w="35" w:type="dxa"/>
+              <w:left w:w="50" w:type="dxa"/>
+              <w:right w:w="50" w:type="dxa"/>
+            </w:tcMar>
+          </w:tcPr>
+          <w:p>
+            <w:r>
+              <w:rPr>
+                <w:rFonts w:ascii="Arial" w:hAnsi="Arial"/>
+                <w:sz w:val="16"/>
+              </w:rPr>
+              <w:t>+23.8 dBm</w:t>
+            </w:r>
+          </w:p>
+        </w:tc>
+        <w:tc>
+          <w:tcPr>
+            <w:tcW w:type="dxa" w:w="1680"/>
+            <w:shd w:fill="F7FAFC"/>
+            <w:tcMar>
+              <w:top w:w="35" w:type="dxa"/>
+              <w:bottom w:w="35" w:type="dxa"/>
+              <w:left w:w="50" w:type="dxa"/>
+              <w:right w:w="50" w:type="dxa"/>
+            </w:tcMar>
+          </w:tcPr>
+          <w:p>
+            <w:r>
+              <w:rPr>
+                <w:rFonts w:ascii="Arial" w:hAnsi="Arial"/>
+                <w:sz w:val="16"/>
+              </w:rPr>
+              <w:t>&gt; 76 dBc</w:t>
+            </w:r>
+          </w:p>
+        </w:tc>
+      </w:tr>
+      <w:tr>
+        <w:tc>
+          <w:tcPr>
+            <w:tcW w:type="dxa" w:w="1680"/>
+            <w:shd w:fill="FFFFFF"/>
+            <w:tcMar>
+              <w:top w:w="35" w:type="dxa"/>
+              <w:bottom w:w="35" w:type="dxa"/>
+              <w:left w:w="50" w:type="dxa"/>
+              <w:right w:w="50" w:type="dxa"/>
+            </w:tcMar>
+          </w:tcPr>
+          <w:p>
+            <w:r>
+              <w:rPr>
+                <w:rFonts w:ascii="Arial" w:hAnsi="Arial"/>
+                <w:b/>
+                <w:color w:val="003366"/>
+                <w:sz w:val="16"/>
+              </w:rPr>
+              <w:t>2600 MHz</w:t>
+            </w:r>
+          </w:p>
+        </w:tc>
+        <w:tc>
+          <w:tcPr>
+            <w:tcW w:type="dxa" w:w="1680"/>
+            <w:shd w:fill="FFFFFF"/>
+            <w:tcMar>
+              <w:top w:w="35" w:type="dxa"/>
+              <w:bottom w:w="35" w:type="dxa"/>
+              <w:left w:w="50" w:type="dxa"/>
+              <w:right w:w="50" w:type="dxa"/>
+            </w:tcMar>
+          </w:tcPr>
+          <w:p>
+            <w:r>
+              <w:rPr>
+                <w:rFonts w:ascii="Arial" w:hAnsi="Arial"/>
+                <w:sz w:val="16"/>
+              </w:rPr>
+              <w:t>37.0 dB ±0.5 dB</w:t>
+            </w:r>
+          </w:p>
+        </w:tc>
+        <w:tc>
+          <w:tcPr>
+            <w:tcW w:type="dxa" w:w="1680"/>
+            <w:shd w:fill="FFFFFF"/>
+            <w:tcMar>
+              <w:top w:w="35" w:type="dxa"/>
+              <w:bottom w:w="35" w:type="dxa"/>
+              <w:left w:w="50" w:type="dxa"/>
+              <w:right w:w="50" w:type="dxa"/>
+            </w:tcMar>
+          </w:tcPr>
+          <w:p>
+            <w:r>
+              <w:rPr>
+                <w:rFonts w:ascii="Arial" w:hAnsi="Arial"/>
+                <w:sz w:val="16"/>
+              </w:rPr>
+              <w:t>12.5 dB</w:t>
+            </w:r>
+          </w:p>
+        </w:tc>
+        <w:tc>
+          <w:tcPr>
+            <w:tcW w:type="dxa" w:w="1680"/>
+            <w:shd w:fill="FFFFFF"/>
+            <w:tcMar>
+              <w:top w:w="35" w:type="dxa"/>
+              <w:bottom w:w="35" w:type="dxa"/>
+              <w:left w:w="50" w:type="dxa"/>
+              <w:right w:w="50" w:type="dxa"/>
+            </w:tcMar>
+          </w:tcPr>
+          <w:p>
+            <w:r>
+              <w:rPr>
+                <w:rFonts w:ascii="Arial" w:hAnsi="Arial"/>
+                <w:sz w:val="16"/>
+              </w:rPr>
+              <w:t>-12.5 dBm</w:t>
+            </w:r>
+          </w:p>
+        </w:tc>
+        <w:tc>
+          <w:tcPr>
+            <w:tcW w:type="dxa" w:w="1680"/>
+            <w:shd w:fill="FFFFFF"/>
+            <w:tcMar>
+              <w:top w:w="35" w:type="dxa"/>
+              <w:bottom w:w="35" w:type="dxa"/>
+              <w:left w:w="50" w:type="dxa"/>
+              <w:right w:w="50" w:type="dxa"/>
+            </w:tcMar>
+          </w:tcPr>
+          <w:p>
+            <w:r>
+              <w:rPr>
+                <w:rFonts w:ascii="Arial" w:hAnsi="Arial"/>
+                <w:sz w:val="16"/>
+              </w:rPr>
+              <w:t>+22.5 dBm</w:t>
+            </w:r>
+          </w:p>
+        </w:tc>
+        <w:tc>
+          <w:tcPr>
+            <w:tcW w:type="dxa" w:w="1680"/>
+            <w:shd w:fill="FFFFFF"/>
+            <w:tcMar>
+              <w:top w:w="35" w:type="dxa"/>
+              <w:bottom w:w="35" w:type="dxa"/>
+              <w:left w:w="50" w:type="dxa"/>
+              <w:right w:w="50" w:type="dxa"/>
+            </w:tcMar>
+          </w:tcPr>
+          <w:p>
+            <w:r>
+              <w:rPr>
+                <w:rFonts w:ascii="Arial" w:hAnsi="Arial"/>
+                <w:sz w:val="16"/>
+              </w:rPr>
+              <w:t>&gt; 75 dBc</w:t>
+            </w:r>
+          </w:p>
+        </w:tc>
+      </w:tr>
+      <w:tr>
+        <w:tc>
+          <w:tcPr>
+            <w:tcW w:type="dxa" w:w="1680"/>
+            <w:shd w:fill="F7FAFC"/>
+            <w:tcMar>
+              <w:top w:w="35" w:type="dxa"/>
+              <w:bottom w:w="35" w:type="dxa"/>
+              <w:left w:w="50" w:type="dxa"/>
+              <w:right w:w="50" w:type="dxa"/>
+            </w:tcMar>
+          </w:tcPr>
+          <w:p>
+            <w:r>
+              <w:rPr>
+                <w:rFonts w:ascii="Arial" w:hAnsi="Arial"/>
+                <w:b/>
+                <w:color w:val="003366"/>
+                <w:sz w:val="16"/>
+              </w:rPr>
+              <w:t>3500 MHz</w:t>
+            </w:r>
+          </w:p>
+        </w:tc>
+        <w:tc>
+          <w:tcPr>
+            <w:tcW w:type="dxa" w:w="1680"/>
+            <w:shd w:fill="F7FAFC"/>
+            <w:tcMar>
+              <w:top w:w="35" w:type="dxa"/>
+              <w:bottom w:w="35" w:type="dxa"/>
+              <w:left w:w="50" w:type="dxa"/>
+              <w:right w:w="50" w:type="dxa"/>
+            </w:tcMar>
+          </w:tcPr>
+          <w:p>
+            <w:r>
+              <w:rPr>
+                <w:rFonts w:ascii="Arial" w:hAnsi="Arial"/>
+                <w:sz w:val="16"/>
+              </w:rPr>
+              <w:t>35.5 dB ±0.6 dB</w:t>
+            </w:r>
+          </w:p>
+        </w:tc>
+        <w:tc>
+          <w:tcPr>
+            <w:tcW w:type="dxa" w:w="1680"/>
+            <w:shd w:fill="F7FAFC"/>
+            <w:tcMar>
+              <w:top w:w="35" w:type="dxa"/>
+              <w:bottom w:w="35" w:type="dxa"/>
+              <w:left w:w="50" w:type="dxa"/>
+              <w:right w:w="50" w:type="dxa"/>
+            </w:tcMar>
+          </w:tcPr>
+          <w:p>
+            <w:r>
+              <w:rPr>
+                <w:rFonts w:ascii="Arial" w:hAnsi="Arial"/>
+                <w:sz w:val="16"/>
+              </w:rPr>
+              <w:t>13.8 dB</w:t>
+            </w:r>
+          </w:p>
+        </w:tc>
+        <w:tc>
+          <w:tcPr>
+            <w:tcW w:type="dxa" w:w="1680"/>
+            <w:shd w:fill="F7FAFC"/>
+            <w:tcMar>
+              <w:top w:w="35" w:type="dxa"/>
+              <w:bottom w:w="35" w:type="dxa"/>
+              <w:left w:w="50" w:type="dxa"/>
+              <w:right w:w="50" w:type="dxa"/>
+            </w:tcMar>
+          </w:tcPr>
+          <w:p>
+            <w:r>
+              <w:rPr>
+                <w:rFonts w:ascii="Arial" w:hAnsi="Arial"/>
+                <w:sz w:val="16"/>
+              </w:rPr>
+              <w:t>-11.8 dBm</w:t>
+            </w:r>
+          </w:p>
+        </w:tc>
+        <w:tc>
+          <w:tcPr>
+            <w:tcW w:type="dxa" w:w="1680"/>
+            <w:shd w:fill="F7FAFC"/>
+            <w:tcMar>
+              <w:top w:w="35" w:type="dxa"/>
+              <w:bottom w:w="35" w:type="dxa"/>
+              <w:left w:w="50" w:type="dxa"/>
+              <w:right w:w="50" w:type="dxa"/>
+            </w:tcMar>
+          </w:tcPr>
+          <w:p>
+            <w:r>
+              <w:rPr>
+                <w:rFonts w:ascii="Arial" w:hAnsi="Arial"/>
+                <w:sz w:val="16"/>
+              </w:rPr>
+              <w:t>+21.2 dBm</w:t>
+            </w:r>
+          </w:p>
+        </w:tc>
+        <w:tc>
+          <w:tcPr>
+            <w:tcW w:type="dxa" w:w="1680"/>
+            <w:shd w:fill="F7FAFC"/>
+            <w:tcMar>
+              <w:top w:w="35" w:type="dxa"/>
+              <w:bottom w:w="35" w:type="dxa"/>
+              <w:left w:w="50" w:type="dxa"/>
+              <w:right w:w="50" w:type="dxa"/>
+            </w:tcMar>
+          </w:tcPr>
+          <w:p>
+            <w:r>
+              <w:rPr>
+                <w:rFonts w:ascii="Arial" w:hAnsi="Arial"/>
+                <w:sz w:val="16"/>
+              </w:rPr>
+              <w:t>&gt; 72 dBc</w:t>
+            </w:r>
+          </w:p>
+        </w:tc>
+      </w:tr>
+      <w:tr>
+        <w:tc>
+          <w:tcPr>
+            <w:tcW w:type="dxa" w:w="1680"/>
+            <w:shd w:fill="FFFFFF"/>
+            <w:tcMar>
+              <w:top w:w="35" w:type="dxa"/>
+              <w:bottom w:w="35" w:type="dxa"/>
+              <w:left w:w="50" w:type="dxa"/>
+              <w:right w:w="50" w:type="dxa"/>
+            </w:tcMar>
+          </w:tcPr>
+          <w:p>
+            <w:r>
+              <w:rPr>
+                <w:rFonts w:ascii="Arial" w:hAnsi="Arial"/>
+                <w:b/>
+                <w:color w:val="003366"/>
+                <w:sz w:val="16"/>
+              </w:rPr>
+              <w:t>5800 MHz</w:t>
+            </w:r>
+          </w:p>
+        </w:tc>
+        <w:tc>
+          <w:tcPr>
+            <w:tcW w:type="dxa" w:w="1680"/>
+            <w:shd w:fill="FFFFFF"/>
+            <w:tcMar>
+              <w:top w:w="35" w:type="dxa"/>
+              <w:bottom w:w="35" w:type="dxa"/>
+              <w:left w:w="50" w:type="dxa"/>
+              <w:right w:w="50" w:type="dxa"/>
+            </w:tcMar>
+          </w:tcPr>
+          <w:p>
+            <w:r>
+              <w:rPr>
+                <w:rFonts w:ascii="Arial" w:hAnsi="Arial"/>
+                <w:sz w:val="16"/>
+              </w:rPr>
+              <w:t>32.0 dB ±0.8 dB</w:t>
+            </w:r>
+          </w:p>
+        </w:tc>
+        <w:tc>
+          <w:tcPr>
+            <w:tcW w:type="dxa" w:w="1680"/>
+            <w:shd w:fill="FFFFFF"/>
+            <w:tcMar>
+              <w:top w:w="35" w:type="dxa"/>
+              <w:bottom w:w="35" w:type="dxa"/>
+              <w:left w:w="50" w:type="dxa"/>
+              <w:right w:w="50" w:type="dxa"/>
+            </w:tcMar>
+          </w:tcPr>
+          <w:p>
+            <w:r>
+              <w:rPr>
+                <w:rFonts w:ascii="Arial" w:hAnsi="Arial"/>
+                <w:sz w:val="16"/>
+              </w:rPr>
+              <w:t>16.5 dB</w:t>
+            </w:r>
+          </w:p>
+        </w:tc>
+        <w:tc>
+          <w:tcPr>
+            <w:tcW w:type="dxa" w:w="1680"/>
+            <w:shd w:fill="FFFFFF"/>
+            <w:tcMar>
+              <w:top w:w="35" w:type="dxa"/>
+              <w:bottom w:w="35" w:type="dxa"/>
+              <w:left w:w="50" w:type="dxa"/>
+              <w:right w:w="50" w:type="dxa"/>
+            </w:tcMar>
+          </w:tcPr>
+          <w:p>
+            <w:r>
+              <w:rPr>
+                <w:rFonts w:ascii="Arial" w:hAnsi="Arial"/>
+                <w:sz w:val="16"/>
+              </w:rPr>
+              <w:t>-9.5 dBm</w:t>
+            </w:r>
+          </w:p>
+        </w:tc>
+        <w:tc>
+          <w:tcPr>
+            <w:tcW w:type="dxa" w:w="1680"/>
+            <w:shd w:fill="FFFFFF"/>
+            <w:tcMar>
+              <w:top w:w="35" w:type="dxa"/>
+              <w:bottom w:w="35" w:type="dxa"/>
+              <w:left w:w="50" w:type="dxa"/>
+              <w:right w:w="50" w:type="dxa"/>
+            </w:tcMar>
+          </w:tcPr>
+          <w:p>
+            <w:r>
+              <w:rPr>
+                <w:rFonts w:ascii="Arial" w:hAnsi="Arial"/>
+                <w:sz w:val="16"/>
+              </w:rPr>
+              <w:t>+18.5 dBm</w:t>
+            </w:r>
+          </w:p>
+        </w:tc>
+        <w:tc>
+          <w:tcPr>
+            <w:tcW w:type="dxa" w:w="1680"/>
+            <w:shd w:fill="FFFFFF"/>
+            <w:tcMar>
+              <w:top w:w="35" w:type="dxa"/>
+              <w:bottom w:w="35" w:type="dxa"/>
+              <w:left w:w="50" w:type="dxa"/>
+              <w:right w:w="50" w:type="dxa"/>
+            </w:tcMar>
+          </w:tcPr>
+          <w:p>
+            <w:r>
+              <w:rPr>
+                <w:rFonts w:ascii="Arial" w:hAnsi="Arial"/>
+                <w:sz w:val="16"/>
+              </w:rPr>
+              <w:t>&gt; 68 dBc</w:t>
+            </w:r>
+          </w:p>
+        </w:tc>
+      </w:tr>
+    </w:tbl>
+    <w:p>
+      <w:pPr>
+        <w:spacing w:after="120"/>
+      </w:pPr>
+    </w:p>
+    <w:p>
+      <w:pPr>
+        <w:pStyle w:val="Heading2"/>
+      </w:pPr>
+      <w:r>
+        <w:rPr>
+          <w:rFonts w:ascii="Arial" w:hAnsi="Arial"/>
+          <w:b/>
+          <w:color w:val="003366"/>
+          <w:sz w:val="24"/>
+        </w:rPr>
+        <w:t>4.4 DC Power Consumption &amp; Thermal Profile Across Operating Modes</w:t>
+      </w:r>
+    </w:p>
+    <w:tbl>
+      <w:tblPr>
+        <w:tblW w:type="auto" w:w="0"/>
+        <w:jc w:val="center"/>
+        <w:tblLayout w:type="fixed"/>
+        <w:tblLook w:firstColumn="1" w:firstRow="1" w:lastColumn="0" w:lastRow="0" w:noHBand="0" w:noVBand="1" w:val="04A0"/>
+        <w:tblBorders>
+          <w:top w:val="single" w:sz="4" w:space="0" w:color="B0C4DE"/>
+          <w:bottom w:val="single" w:sz="4" w:space="0" w:color="B0C4DE"/>
+          <w:left w:val="none"/>
+          <w:right w:val="none"/>
+          <w:insideH w:val="single" w:sz="4" w:space="0" w:color="B0C4DE"/>
+          <w:insideV w:val="none"/>
+        </w:tblBorders>
+      </w:tblPr>
+      <w:tblGrid>
+        <w:gridCol w:w="1680"/>
+        <w:gridCol w:w="1680"/>
+        <w:gridCol w:w="1680"/>
+        <w:gridCol w:w="1680"/>
+        <w:gridCol w:w="1680"/>
+        <w:gridCol w:w="1680"/>
+      </w:tblGrid>
+      <w:tr>
+        <w:tc>
+          <w:tcPr>
+            <w:tcW w:type="dxa" w:w="1680"/>
+            <w:shd w:fill="003366"/>
+            <w:tcMar>
+              <w:top w:w="60" w:type="dxa"/>
+              <w:bottom w:w="60" w:type="dxa"/>
+              <w:left w:w="60" w:type="dxa"/>
+              <w:right w:w="60" w:type="dxa"/>
+            </w:tcMar>
+          </w:tcPr>
+          <w:p>
+            <w:r>
+              <w:rPr>
+                <w:rFonts w:ascii="Arial" w:hAnsi="Arial"/>
+                <w:b/>
+                <w:color w:val="FFFFFF"/>
+                <w:sz w:val="16"/>
+              </w:rPr>
+              <w:t>Operational Profile</w:t>
+            </w:r>
+          </w:p>
+        </w:tc>
+        <w:tc>
+          <w:tcPr>
+            <w:tcW w:type="dxa" w:w="1680"/>
+            <w:shd w:fill="003366"/>
+            <w:tcMar>
+              <w:top w:w="60" w:type="dxa"/>
+              <w:bottom w:w="60" w:type="dxa"/>
+              <w:left w:w="60" w:type="dxa"/>
+              <w:right w:w="60" w:type="dxa"/>
+            </w:tcMar>
+          </w:tcPr>
+          <w:p>
+            <w:r>
+              <w:rPr>
+                <w:rFonts w:ascii="Arial" w:hAnsi="Arial"/>
+                <w:b/>
+                <w:color w:val="FFFFFF"/>
+                <w:sz w:val="16"/>
+              </w:rPr>
+              <w:t>1.0V Digital (TP1)</w:t>
+            </w:r>
+          </w:p>
+        </w:tc>
+        <w:tc>
+          <w:tcPr>
+            <w:tcW w:type="dxa" w:w="1680"/>
+            <w:shd w:fill="003366"/>
+            <w:tcMar>
+              <w:top w:w="60" w:type="dxa"/>
+              <w:bottom w:w="60" w:type="dxa"/>
+              <w:left w:w="60" w:type="dxa"/>
+              <w:right w:w="60" w:type="dxa"/>
+            </w:tcMar>
+          </w:tcPr>
+          <w:p>
+            <w:r>
+              <w:rPr>
+                <w:rFonts w:ascii="Arial" w:hAnsi="Arial"/>
+                <w:b/>
+                <w:color w:val="FFFFFF"/>
+                <w:sz w:val="16"/>
+              </w:rPr>
+              <w:t>1.3V RF (TP2)</w:t>
+            </w:r>
+          </w:p>
+        </w:tc>
+        <w:tc>
+          <w:tcPr>
+            <w:tcW w:type="dxa" w:w="1680"/>
+            <w:shd w:fill="003366"/>
+            <w:tcMar>
+              <w:top w:w="60" w:type="dxa"/>
+              <w:bottom w:w="60" w:type="dxa"/>
+              <w:left w:w="60" w:type="dxa"/>
+              <w:right w:w="60" w:type="dxa"/>
+            </w:tcMar>
+          </w:tcPr>
+          <w:p>
+            <w:r>
+              <w:rPr>
+                <w:rFonts w:ascii="Arial" w:hAnsi="Arial"/>
+                <w:b/>
+                <w:color w:val="FFFFFF"/>
+                <w:sz w:val="16"/>
+              </w:rPr>
+              <w:t>1.3V Synth (TP3)</w:t>
+            </w:r>
+          </w:p>
+        </w:tc>
+        <w:tc>
+          <w:tcPr>
+            <w:tcW w:type="dxa" w:w="1680"/>
+            <w:shd w:fill="003366"/>
+            <w:tcMar>
+              <w:top w:w="60" w:type="dxa"/>
+              <w:bottom w:w="60" w:type="dxa"/>
+              <w:left w:w="60" w:type="dxa"/>
+              <w:right w:w="60" w:type="dxa"/>
+            </w:tcMar>
+          </w:tcPr>
+          <w:p>
+            <w:r>
+              <w:rPr>
+                <w:rFonts w:ascii="Arial" w:hAnsi="Arial"/>
+                <w:b/>
+                <w:color w:val="FFFFFF"/>
+                <w:sz w:val="16"/>
+              </w:rPr>
+              <w:t>1.8V Clock (TP4)</w:t>
+            </w:r>
+          </w:p>
+        </w:tc>
+        <w:tc>
+          <w:tcPr>
+            <w:tcW w:type="dxa" w:w="1680"/>
+            <w:shd w:fill="003366"/>
+            <w:tcMar>
+              <w:top w:w="60" w:type="dxa"/>
+              <w:bottom w:w="60" w:type="dxa"/>
+              <w:left w:w="60" w:type="dxa"/>
+              <w:right w:w="60" w:type="dxa"/>
+            </w:tcMar>
+          </w:tcPr>
+          <w:p>
+            <w:r>
+              <w:rPr>
+                <w:rFonts w:ascii="Arial" w:hAnsi="Arial"/>
+                <w:b/>
+                <w:color w:val="FFFFFF"/>
+                <w:sz w:val="16"/>
+              </w:rPr>
+              <w:t>Total Power Dissipation</w:t>
+            </w:r>
+          </w:p>
+        </w:tc>
+      </w:tr>
+      <w:tr>
+        <w:tc>
+          <w:tcPr>
+            <w:tcW w:type="dxa" w:w="1680"/>
+            <w:shd w:fill="FFFFFF"/>
+            <w:tcMar>
+              <w:top w:w="35" w:type="dxa"/>
+              <w:bottom w:w="35" w:type="dxa"/>
+              <w:left w:w="50" w:type="dxa"/>
+              <w:right w:w="50" w:type="dxa"/>
+            </w:tcMar>
+          </w:tcPr>
+          <w:p>
+            <w:r>
+              <w:rPr>
+                <w:rFonts w:ascii="Arial" w:hAnsi="Arial"/>
+                <w:b/>
+                <w:color w:val="003366"/>
+                <w:sz w:val="16"/>
+              </w:rPr>
+              <w:t>Standby / Idle Mode</w:t>
+            </w:r>
+          </w:p>
+        </w:tc>
+        <w:tc>
+          <w:tcPr>
+            <w:tcW w:type="dxa" w:w="1680"/>
+            <w:shd w:fill="FFFFFF"/>
+            <w:tcMar>
+              <w:top w:w="35" w:type="dxa"/>
+              <w:bottom w:w="35" w:type="dxa"/>
+              <w:left w:w="50" w:type="dxa"/>
+              <w:right w:w="50" w:type="dxa"/>
+            </w:tcMar>
+          </w:tcPr>
+          <w:p>
+            <w:r>
+              <w:rPr>
+                <w:rFonts w:ascii="Arial" w:hAnsi="Arial"/>
+                <w:sz w:val="16"/>
+              </w:rPr>
+              <w:t>0.35 A (0.35 W)</w:t>
+            </w:r>
+          </w:p>
+        </w:tc>
+        <w:tc>
+          <w:tcPr>
+            <w:tcW w:type="dxa" w:w="1680"/>
+            <w:shd w:fill="FFFFFF"/>
+            <w:tcMar>
+              <w:top w:w="35" w:type="dxa"/>
+              <w:bottom w:w="35" w:type="dxa"/>
+              <w:left w:w="50" w:type="dxa"/>
+              <w:right w:w="50" w:type="dxa"/>
+            </w:tcMar>
+          </w:tcPr>
+          <w:p>
+            <w:r>
+              <w:rPr>
+                <w:rFonts w:ascii="Arial" w:hAnsi="Arial"/>
+                <w:sz w:val="16"/>
+              </w:rPr>
+              <w:t>0.08 A (0.10 W)</w:t>
+            </w:r>
+          </w:p>
+        </w:tc>
+        <w:tc>
+          <w:tcPr>
+            <w:tcW w:type="dxa" w:w="1680"/>
+            <w:shd w:fill="FFFFFF"/>
+            <w:tcMar>
+              <w:top w:w="35" w:type="dxa"/>
+              <w:bottom w:w="35" w:type="dxa"/>
+              <w:left w:w="50" w:type="dxa"/>
+              <w:right w:w="50" w:type="dxa"/>
+            </w:tcMar>
+          </w:tcPr>
+          <w:p>
+            <w:r>
+              <w:rPr>
+                <w:rFonts w:ascii="Arial" w:hAnsi="Arial"/>
+                <w:sz w:val="16"/>
+              </w:rPr>
+              <w:t>0.05 A (0.07 W)</w:t>
+            </w:r>
+          </w:p>
+        </w:tc>
+        <w:tc>
+          <w:tcPr>
+            <w:tcW w:type="dxa" w:w="1680"/>
+            <w:shd w:fill="FFFFFF"/>
+            <w:tcMar>
+              <w:top w:w="35" w:type="dxa"/>
+              <w:bottom w:w="35" w:type="dxa"/>
+              <w:left w:w="50" w:type="dxa"/>
+              <w:right w:w="50" w:type="dxa"/>
+            </w:tcMar>
+          </w:tcPr>
+          <w:p>
+            <w:r>
+              <w:rPr>
+                <w:rFonts w:ascii="Arial" w:hAnsi="Arial"/>
+                <w:sz w:val="16"/>
+              </w:rPr>
+              <w:t>0.15 A (0.27 W)</w:t>
+            </w:r>
+          </w:p>
+        </w:tc>
+        <w:tc>
+          <w:tcPr>
+            <w:tcW w:type="dxa" w:w="1680"/>
+            <w:shd w:fill="FFFFFF"/>
+            <w:tcMar>
+              <w:top w:w="35" w:type="dxa"/>
+              <w:bottom w:w="35" w:type="dxa"/>
+              <w:left w:w="50" w:type="dxa"/>
+              <w:right w:w="50" w:type="dxa"/>
+            </w:tcMar>
+          </w:tcPr>
+          <w:p>
+            <w:r>
+              <w:rPr>
+                <w:rFonts w:ascii="Arial" w:hAnsi="Arial"/>
+                <w:sz w:val="16"/>
+              </w:rPr>
+              <w:t>0.85 W (Heatsink: 32°C)</w:t>
+            </w:r>
+          </w:p>
+        </w:tc>
+      </w:tr>
+      <w:tr>
+        <w:tc>
+          <w:tcPr>
+            <w:tcW w:type="dxa" w:w="1680"/>
+            <w:shd w:fill="F7FAFC"/>
+            <w:tcMar>
+              <w:top w:w="35" w:type="dxa"/>
+              <w:bottom w:w="35" w:type="dxa"/>
+              <w:left w:w="50" w:type="dxa"/>
+              <w:right w:w="50" w:type="dxa"/>
+            </w:tcMar>
+          </w:tcPr>
+          <w:p>
+            <w:r>
+              <w:rPr>
+                <w:rFonts w:ascii="Arial" w:hAnsi="Arial"/>
+                <w:b/>
+                <w:color w:val="003366"/>
+                <w:sz w:val="16"/>
+              </w:rPr>
+              <w:t>Profile 100 (122.88 MSPS)</w:t>
+            </w:r>
+          </w:p>
+        </w:tc>
+        <w:tc>
+          <w:tcPr>
+            <w:tcW w:type="dxa" w:w="1680"/>
+            <w:shd w:fill="F7FAFC"/>
+            <w:tcMar>
+              <w:top w:w="35" w:type="dxa"/>
+              <w:bottom w:w="35" w:type="dxa"/>
+              <w:left w:w="50" w:type="dxa"/>
+              <w:right w:w="50" w:type="dxa"/>
+            </w:tcMar>
+          </w:tcPr>
+          <w:p>
+            <w:r>
+              <w:rPr>
+                <w:rFonts w:ascii="Arial" w:hAnsi="Arial"/>
+                <w:sz w:val="16"/>
+              </w:rPr>
+              <w:t>1.45 A (1.45 W)</w:t>
+            </w:r>
+          </w:p>
+        </w:tc>
+        <w:tc>
+          <w:tcPr>
+            <w:tcW w:type="dxa" w:w="1680"/>
+            <w:shd w:fill="F7FAFC"/>
+            <w:tcMar>
+              <w:top w:w="35" w:type="dxa"/>
+              <w:bottom w:w="35" w:type="dxa"/>
+              <w:left w:w="50" w:type="dxa"/>
+              <w:right w:w="50" w:type="dxa"/>
+            </w:tcMar>
+          </w:tcPr>
+          <w:p>
+            <w:r>
+              <w:rPr>
+                <w:rFonts w:ascii="Arial" w:hAnsi="Arial"/>
+                <w:sz w:val="16"/>
+              </w:rPr>
+              <w:t>1.20 A (1.56 W)</w:t>
+            </w:r>
+          </w:p>
+        </w:tc>
+        <w:tc>
+          <w:tcPr>
+            <w:tcW w:type="dxa" w:w="1680"/>
+            <w:shd w:fill="F7FAFC"/>
+            <w:tcMar>
+              <w:top w:w="35" w:type="dxa"/>
+              <w:bottom w:w="35" w:type="dxa"/>
+              <w:left w:w="50" w:type="dxa"/>
+              <w:right w:w="50" w:type="dxa"/>
+            </w:tcMar>
+          </w:tcPr>
+          <w:p>
+            <w:r>
+              <w:rPr>
+                <w:rFonts w:ascii="Arial" w:hAnsi="Arial"/>
+                <w:sz w:val="16"/>
+              </w:rPr>
+              <w:t>0.22 A (0.29 W)</w:t>
+            </w:r>
+          </w:p>
+        </w:tc>
+        <w:tc>
+          <w:tcPr>
+            <w:tcW w:type="dxa" w:w="1680"/>
+            <w:shd w:fill="F7FAFC"/>
+            <w:tcMar>
+              <w:top w:w="35" w:type="dxa"/>
+              <w:bottom w:w="35" w:type="dxa"/>
+              <w:left w:w="50" w:type="dxa"/>
+              <w:right w:w="50" w:type="dxa"/>
+            </w:tcMar>
+          </w:tcPr>
+          <w:p>
+            <w:r>
+              <w:rPr>
+                <w:rFonts w:ascii="Arial" w:hAnsi="Arial"/>
+                <w:sz w:val="16"/>
+              </w:rPr>
+              <w:t>0.45 A (0.81 W)</w:t>
+            </w:r>
+          </w:p>
+        </w:tc>
+        <w:tc>
+          <w:tcPr>
+            <w:tcW w:type="dxa" w:w="1680"/>
+            <w:shd w:fill="F7FAFC"/>
+            <w:tcMar>
+              <w:top w:w="35" w:type="dxa"/>
+              <w:bottom w:w="35" w:type="dxa"/>
+              <w:left w:w="50" w:type="dxa"/>
+              <w:right w:w="50" w:type="dxa"/>
+            </w:tcMar>
+          </w:tcPr>
+          <w:p>
+            <w:r>
+              <w:rPr>
+                <w:rFonts w:ascii="Arial" w:hAnsi="Arial"/>
+                <w:sz w:val="16"/>
+              </w:rPr>
+              <w:t>4.25 W (Heatsink: 46°C)</w:t>
+            </w:r>
+          </w:p>
+        </w:tc>
+      </w:tr>
+      <w:tr>
+        <w:tc>
+          <w:tcPr>
+            <w:tcW w:type="dxa" w:w="1680"/>
+            <w:shd w:fill="FFFFFF"/>
+            <w:tcMar>
+              <w:top w:w="35" w:type="dxa"/>
+              <w:bottom w:w="35" w:type="dxa"/>
+              <w:left w:w="50" w:type="dxa"/>
+              <w:right w:w="50" w:type="dxa"/>
+            </w:tcMar>
+          </w:tcPr>
+          <w:p>
+            <w:r>
+              <w:rPr>
+                <w:rFonts w:ascii="Arial" w:hAnsi="Arial"/>
+                <w:b/>
+                <w:color w:val="003366"/>
+                <w:sz w:val="16"/>
+              </w:rPr>
+              <w:t>Profile 200 (245.76 MSPS)</w:t>
+            </w:r>
+          </w:p>
+        </w:tc>
+        <w:tc>
+          <w:tcPr>
+            <w:tcW w:type="dxa" w:w="1680"/>
+            <w:shd w:fill="FFFFFF"/>
+            <w:tcMar>
+              <w:top w:w="35" w:type="dxa"/>
+              <w:bottom w:w="35" w:type="dxa"/>
+              <w:left w:w="50" w:type="dxa"/>
+              <w:right w:w="50" w:type="dxa"/>
+            </w:tcMar>
+          </w:tcPr>
+          <w:p>
+            <w:r>
+              <w:rPr>
+                <w:rFonts w:ascii="Arial" w:hAnsi="Arial"/>
+                <w:sz w:val="16"/>
+              </w:rPr>
+              <w:t>1.85 A (1.85 W)</w:t>
+            </w:r>
+          </w:p>
+        </w:tc>
+        <w:tc>
+          <w:tcPr>
+            <w:tcW w:type="dxa" w:w="1680"/>
+            <w:shd w:fill="FFFFFF"/>
+            <w:tcMar>
+              <w:top w:w="35" w:type="dxa"/>
+              <w:bottom w:w="35" w:type="dxa"/>
+              <w:left w:w="50" w:type="dxa"/>
+              <w:right w:w="50" w:type="dxa"/>
+            </w:tcMar>
+          </w:tcPr>
+          <w:p>
+            <w:r>
+              <w:rPr>
+                <w:rFonts w:ascii="Arial" w:hAnsi="Arial"/>
+                <w:sz w:val="16"/>
+              </w:rPr>
+              <w:t>1.35 A (1.76 W)</w:t>
+            </w:r>
+          </w:p>
+        </w:tc>
+        <w:tc>
+          <w:tcPr>
+            <w:tcW w:type="dxa" w:w="1680"/>
+            <w:shd w:fill="FFFFFF"/>
+            <w:tcMar>
+              <w:top w:w="35" w:type="dxa"/>
+              <w:bottom w:w="35" w:type="dxa"/>
+              <w:left w:w="50" w:type="dxa"/>
+              <w:right w:w="50" w:type="dxa"/>
+            </w:tcMar>
+          </w:tcPr>
+          <w:p>
+            <w:r>
+              <w:rPr>
+                <w:rFonts w:ascii="Arial" w:hAnsi="Arial"/>
+                <w:sz w:val="16"/>
+              </w:rPr>
+              <w:t>0.25 A (0.33 W)</w:t>
+            </w:r>
+          </w:p>
+        </w:tc>
+        <w:tc>
+          <w:tcPr>
+            <w:tcW w:type="dxa" w:w="1680"/>
+            <w:shd w:fill="FFFFFF"/>
+            <w:tcMar>
+              <w:top w:w="35" w:type="dxa"/>
+              <w:bottom w:w="35" w:type="dxa"/>
+              <w:left w:w="50" w:type="dxa"/>
+              <w:right w:w="50" w:type="dxa"/>
+            </w:tcMar>
+          </w:tcPr>
+          <w:p>
+            <w:r>
+              <w:rPr>
+                <w:rFonts w:ascii="Arial" w:hAnsi="Arial"/>
+                <w:sz w:val="16"/>
+              </w:rPr>
+              <w:t>0.52 A (0.94 W)</w:t>
+            </w:r>
+          </w:p>
+        </w:tc>
+        <w:tc>
+          <w:tcPr>
+            <w:tcW w:type="dxa" w:w="1680"/>
+            <w:shd w:fill="FFFFFF"/>
+            <w:tcMar>
+              <w:top w:w="35" w:type="dxa"/>
+              <w:bottom w:w="35" w:type="dxa"/>
+              <w:left w:w="50" w:type="dxa"/>
+              <w:right w:w="50" w:type="dxa"/>
+            </w:tcMar>
+          </w:tcPr>
+          <w:p>
+            <w:r>
+              <w:rPr>
+                <w:rFonts w:ascii="Arial" w:hAnsi="Arial"/>
+                <w:sz w:val="16"/>
+              </w:rPr>
+              <w:t>5.40 W (Heatsink: 54°C)</w:t>
+            </w:r>
+          </w:p>
+        </w:tc>
+      </w:tr>
+      <w:tr>
+        <w:tc>
+          <w:tcPr>
+            <w:tcW w:type="dxa" w:w="1680"/>
+            <w:shd w:fill="F7FAFC"/>
+            <w:tcMar>
+              <w:top w:w="35" w:type="dxa"/>
+              <w:bottom w:w="35" w:type="dxa"/>
+              <w:left w:w="50" w:type="dxa"/>
+              <w:right w:w="50" w:type="dxa"/>
+            </w:tcMar>
+          </w:tcPr>
+          <w:p>
+            <w:r>
+              <w:rPr>
+                <w:rFonts w:ascii="Arial" w:hAnsi="Arial"/>
+                <w:b/>
+                <w:color w:val="003366"/>
+                <w:sz w:val="16"/>
+              </w:rPr>
+              <w:t>Profile 400 (491.52 MSPS / DPD)</w:t>
+            </w:r>
+          </w:p>
+        </w:tc>
+        <w:tc>
+          <w:tcPr>
+            <w:tcW w:type="dxa" w:w="1680"/>
+            <w:shd w:fill="F7FAFC"/>
+            <w:tcMar>
+              <w:top w:w="35" w:type="dxa"/>
+              <w:bottom w:w="35" w:type="dxa"/>
+              <w:left w:w="50" w:type="dxa"/>
+              <w:right w:w="50" w:type="dxa"/>
+            </w:tcMar>
+          </w:tcPr>
+          <w:p>
+            <w:r>
+              <w:rPr>
+                <w:rFonts w:ascii="Arial" w:hAnsi="Arial"/>
+                <w:sz w:val="16"/>
+              </w:rPr>
+              <w:t>2.20 A (2.20 W)</w:t>
+            </w:r>
+          </w:p>
+        </w:tc>
+        <w:tc>
+          <w:tcPr>
+            <w:tcW w:type="dxa" w:w="1680"/>
+            <w:shd w:fill="F7FAFC"/>
+            <w:tcMar>
+              <w:top w:w="35" w:type="dxa"/>
+              <w:bottom w:w="35" w:type="dxa"/>
+              <w:left w:w="50" w:type="dxa"/>
+              <w:right w:w="50" w:type="dxa"/>
+            </w:tcMar>
+          </w:tcPr>
+          <w:p>
+            <w:r>
+              <w:rPr>
+                <w:rFonts w:ascii="Arial" w:hAnsi="Arial"/>
+                <w:sz w:val="16"/>
+              </w:rPr>
+              <w:t>1.50 A (1.95 W)</w:t>
+            </w:r>
+          </w:p>
+        </w:tc>
+        <w:tc>
+          <w:tcPr>
+            <w:tcW w:type="dxa" w:w="1680"/>
+            <w:shd w:fill="F7FAFC"/>
+            <w:tcMar>
+              <w:top w:w="35" w:type="dxa"/>
+              <w:bottom w:w="35" w:type="dxa"/>
+              <w:left w:w="50" w:type="dxa"/>
+              <w:right w:w="50" w:type="dxa"/>
+            </w:tcMar>
+          </w:tcPr>
+          <w:p>
+            <w:r>
+              <w:rPr>
+                <w:rFonts w:ascii="Arial" w:hAnsi="Arial"/>
+                <w:sz w:val="16"/>
+              </w:rPr>
+              <w:t>0.28 A (0.36 W)</w:t>
+            </w:r>
+          </w:p>
+        </w:tc>
+        <w:tc>
+          <w:tcPr>
+            <w:tcW w:type="dxa" w:w="1680"/>
+            <w:shd w:fill="F7FAFC"/>
+            <w:tcMar>
+              <w:top w:w="35" w:type="dxa"/>
+              <w:bottom w:w="35" w:type="dxa"/>
+              <w:left w:w="50" w:type="dxa"/>
+              <w:right w:w="50" w:type="dxa"/>
+            </w:tcMar>
+          </w:tcPr>
+          <w:p>
+            <w:r>
+              <w:rPr>
+                <w:rFonts w:ascii="Arial" w:hAnsi="Arial"/>
+                <w:sz w:val="16"/>
+              </w:rPr>
+              <w:t>0.58 A (1.04 W)</w:t>
+            </w:r>
+          </w:p>
+        </w:tc>
+        <w:tc>
+          <w:tcPr>
+            <w:tcW w:type="dxa" w:w="1680"/>
+            <w:shd w:fill="F7FAFC"/>
+            <w:tcMar>
+              <w:top w:w="35" w:type="dxa"/>
+              <w:bottom w:w="35" w:type="dxa"/>
+              <w:left w:w="50" w:type="dxa"/>
+              <w:right w:w="50" w:type="dxa"/>
+            </w:tcMar>
+          </w:tcPr>
+          <w:p>
+            <w:r>
+              <w:rPr>
+                <w:rFonts w:ascii="Arial" w:hAnsi="Arial"/>
+                <w:sz w:val="16"/>
+              </w:rPr>
+              <w:t>6.65 W (Heatsink: 62°C)</w:t>
+            </w:r>
+          </w:p>
+        </w:tc>
+      </w:tr>
+    </w:tbl>
+    <w:p>
+      <w:pPr>
+        <w:spacing w:after="160"/>
+      </w:pPr>
     </w:p>
     <w:p>
       <w:pPr>
@@ -2041,7 +5408,7 @@
           <w:color w:val="003366"/>
           <w:sz w:val="30"/>
         </w:rPr>
-        <w:t>3. Clock Distribution (HMC7044) &amp; PLL Lock Troubleshooting</w:t>
+        <w:t>5. Clock Distribution (HMC7044) &amp; PLL Lock Troubleshooting</w:t>
       </w:r>
     </w:p>
     <w:p>
@@ -2119,72 +5486,6 @@
         <w:spacing w:after="80"/>
       </w:pPr>
     </w:p>
-    <w:tbl>
-      <w:tblPr>
-        <w:tblW w:type="auto" w:w="0"/>
-        <w:jc w:val="center"/>
-        <w:tblLayout w:type="fixed"/>
-        <w:tblLook w:firstColumn="1" w:firstRow="1" w:lastColumn="0" w:lastRow="0" w:noHBand="0" w:noVBand="1" w:val="04A0"/>
-      </w:tblPr>
-      <w:tblGrid>
-        <w:gridCol w:w="10080"/>
-      </w:tblGrid>
-      <w:tr>
-        <w:tc>
-          <w:tcPr>
-            <w:tcW w:type="dxa" w:w="9360"/>
-            <w:shd w:fill="EAF7F0"/>
-            <w:tcMar>
-              <w:top w:w="140" w:type="dxa"/>
-              <w:bottom w:w="140" w:type="dxa"/>
-              <w:left w:w="200" w:type="dxa"/>
-              <w:right w:w="200" w:type="dxa"/>
-            </w:tcMar>
-            <w:tcBorders>
-              <w:top w:val="none"/>
-              <w:bottom w:val="none"/>
-              <w:left w:val="single" w:sz="36" w:space="0" w:color="006644"/>
-              <w:right w:val="none"/>
-            </w:tcBorders>
-          </w:tcPr>
-          <w:p>
-            <w:pPr>
-              <w:spacing w:before="0" w:after="40"/>
-              <w:jc w:val="left"/>
-            </w:pPr>
-            <w:r>
-              <w:rPr>
-                <w:rFonts w:ascii="Arial" w:hAnsi="Arial"/>
-                <w:b/>
-                <w:color w:val="003366"/>
-                <w:sz w:val="20"/>
-              </w:rPr>
-              <w:t>■ CLOCK PLL UNLOCK REPAIR ACTION</w:t>
-              <w:br/>
-            </w:r>
-            <w:r>
-              <w:rPr>
-                <w:rFonts w:ascii="Arial" w:hAnsi="Arial"/>
-                <w:color w:val="282828"/>
-                <w:sz w:val="19"/>
-              </w:rPr>
-              <w:t>If PLL2 is unlocked (pll2_locked = 0):</w:t>
-              <w:br/>
-              <w:t>1. Check the 40 MHz TCXO / VCXO reference oscillator power rail (3.3V at pin 4).</w:t>
-              <w:br/>
-              <w:t>2. Inspect solder joints of the HMC7044 loop filter capacitors (C112, C115).</w:t>
-              <w:br/>
-              <w:t>3. Replace VCXO oscillator if frequency drift exceeds ±5 ppm (&gt; 200 Hz at 40 MHz).</w:t>
-            </w:r>
-          </w:p>
-        </w:tc>
-      </w:tr>
-    </w:tbl>
-    <w:p>
-      <w:pPr>
-        <w:spacing w:after="80"/>
-      </w:pPr>
-    </w:p>
     <w:p>
       <w:pPr>
         <w:pStyle w:val="Heading1"/>
@@ -2196,123 +5497,7 @@
           <w:color w:val="003366"/>
           <w:sz w:val="30"/>
         </w:rPr>
-        <w:t>4. RF Frontend Component Repair &amp; SMT Replacement Procedures</w:t>
-      </w:r>
-    </w:p>
-    <w:p>
-      <w:r>
-        <w:rPr>
-          <w:rFonts w:ascii="Arial" w:hAnsi="Arial"/>
-          <w:sz w:val="20"/>
-        </w:rPr>
-        <w:t>Excessive RF input power (&gt; +10 dBm) can destroy the internal LNAs or external ESD protection diodes. Follow these SMT replacement guidelines when servicing RF frontend parts:</w:t>
-      </w:r>
-    </w:p>
-    <w:p>
-      <w:pPr>
-        <w:spacing w:after="40"/>
-        <w:ind w:left="288"/>
-      </w:pPr>
-      <w:r>
-        <w:rPr>
-          <w:rFonts w:ascii="Arial" w:hAnsi="Arial"/>
-          <w:b/>
-          <w:color w:val="003366"/>
-          <w:sz w:val="19"/>
-        </w:rPr>
-        <w:t xml:space="preserve">• 1. ESD Diode &amp; Balun De-soldering: </w:t>
-      </w:r>
-      <w:r>
-        <w:rPr>
-          <w:rFonts w:ascii="Arial" w:hAnsi="Arial"/>
-          <w:sz w:val="19"/>
-        </w:rPr>
-        <w:t>Apply no-clean tacky flux (Kester 959T / Amtech NC-559). Set hot air rework pencil to 320°C with 4 mm nozzle. Heat component for 25–35 seconds and gently lift with fine ESD tweezers (00-SA).</w:t>
-      </w:r>
-    </w:p>
-    <w:p>
-      <w:pPr>
-        <w:spacing w:after="40"/>
-        <w:ind w:left="288"/>
-      </w:pPr>
-      <w:r>
-        <w:rPr>
-          <w:rFonts w:ascii="Arial" w:hAnsi="Arial"/>
-          <w:b/>
-          <w:color w:val="003366"/>
-          <w:sz w:val="19"/>
-        </w:rPr>
-        <w:t xml:space="preserve">• 2. Pad Site Dressing: </w:t>
-      </w:r>
-      <w:r>
-        <w:rPr>
-          <w:rFonts w:ascii="Arial" w:hAnsi="Arial"/>
-          <w:sz w:val="19"/>
-        </w:rPr>
-        <w:t>Use lead-free solder wick (Chemtronics Soder-Wick 1.5mm) soaked in flux at 340°C soldering iron tip to clean pads flat. Clean residual flux with 99.9% IPA and inspect pads under 20x magnification.</w:t>
-      </w:r>
-    </w:p>
-    <w:p>
-      <w:pPr>
-        <w:spacing w:after="40"/>
-        <w:ind w:left="288"/>
-      </w:pPr>
-      <w:r>
-        <w:rPr>
-          <w:rFonts w:ascii="Arial" w:hAnsi="Arial"/>
-          <w:b/>
-          <w:color w:val="003366"/>
-          <w:sz w:val="19"/>
-        </w:rPr>
-        <w:t xml:space="preserve">• 3. Replacement SMT Soldering: </w:t>
-      </w:r>
-      <w:r>
-        <w:rPr>
-          <w:rFonts w:ascii="Arial" w:hAnsi="Arial"/>
-          <w:sz w:val="19"/>
-        </w:rPr>
-        <w:t>Apply micro-dots of SAC305 solder paste using a 30-gauge dispensing needle. Align replacement component (0402/0201 or balun). Reflow using hot air at 310°C (30s) until solder fillets form on both terminals.</w:t>
-      </w:r>
-    </w:p>
-    <w:p>
-      <w:pPr>
-        <w:spacing w:after="40"/>
-        <w:ind w:left="288"/>
-      </w:pPr>
-      <w:r>
-        <w:rPr>
-          <w:rFonts w:ascii="Arial" w:hAnsi="Arial"/>
-          <w:b/>
-          <w:color w:val="003366"/>
-          <w:sz w:val="19"/>
-        </w:rPr>
-        <w:t xml:space="preserve">• 4. Post-Repair RF Verification: </w:t>
-      </w:r>
-      <w:r>
-        <w:rPr>
-          <w:rFonts w:ascii="Arial" w:hAnsi="Arial"/>
-          <w:sz w:val="19"/>
-        </w:rPr>
-        <w:t>Connect port to Network Analyzer (VNA) and measure Return Loss (S11 / S22). Verify Return Loss &gt; 12 dB across 75 MHz – 6000 MHz.</w:t>
-      </w:r>
-    </w:p>
-    <w:p>
-      <w:pPr>
-        <w:spacing w:after="120"/>
-      </w:pPr>
-    </w:p>
-    <w:p>
-      <w:pPr>
-        <w:pStyle w:val="Heading1"/>
-      </w:pPr>
-      <w:r>
-        <w:rPr>
-          <w:rFonts w:ascii="Arial" w:hAnsi="Arial"/>
-          <w:b/>
-          <w:color w:val="003366"/>
-          <w:sz w:val="30"/>
-        </w:rPr>
-        <w:t>5. ADRV9009 BGA IC Rework &amp; Reflow Soldering Profile</w:t>
+        <w:t>6. ADRV9009 BGA IC Rework &amp; Reflow Soldering Profile</w:t>
       </w:r>
     </w:p>
     <w:p>
@@ -3024,7 +6209,7 @@
         <w:drawing>
           <wp:inline xmlns:a="http://schemas.openxmlformats.org/drawingml/2006/main" xmlns:pic="http://schemas.openxmlformats.org/drawingml/2006/picture">
             <wp:extent cx="5486400" cy="3181190"/>
-            <wp:docPr id="4" name="Picture 4"/>
+            <wp:docPr id="5" name="Picture 5"/>
             <wp:cNvGraphicFramePr>
               <a:graphicFrameLocks noChangeAspect="1"/>
             </wp:cNvGraphicFramePr>
@@ -3036,7 +6221,7 @@
                     <pic:cNvPicPr/>
                   </pic:nvPicPr>
                   <pic:blipFill>
-                    <a:blip r:embed="rId12"/>
+                    <a:blip r:embed="rId13"/>
                     <a:stretch>
                       <a:fillRect/>
                     </a:stretch>
@@ -3067,7 +6252,7 @@
           <w:color w:val="505A64"/>
           <w:sz w:val="18"/>
         </w:rPr>
-        <w:t>Figure 1.4: ADRV9009 196-Ball CSP_BGA Rework &amp; Soldering Thermal Profile (IPC-7711/7721 Standard SAC305 Lead-Free Alloy).</w:t>
+        <w:t>Figure 1.5: ADRV9009 196-Ball CSP_BGA Rework &amp; Soldering Thermal Profile (IPC-7711/7721 Standard SAC305 Lead-Free Alloy).</w:t>
       </w:r>
     </w:p>
     <w:p>
@@ -3081,16 +6266,7 @@
           <w:color w:val="003366"/>
           <w:sz w:val="30"/>
         </w:rPr>
-        <w:t>6. Bill of Materials (BOM) &amp; Spare Parts Catalog</w:t>
-      </w:r>
-    </w:p>
-    <w:p>
-      <w:r>
-        <w:rPr>
-          <w:rFonts w:ascii="Arial" w:hAnsi="Arial"/>
-          <w:sz w:val="20"/>
-        </w:rPr>
-        <w:t>Table 6.1 lists the approved manufacturer part numbers for critical onboard active and passive components:</w:t>
+        <w:t>7. Bill of Materials (BOM) &amp; Spare Parts Catalog</w:t>
       </w:r>
     </w:p>
     <w:tbl>
@@ -4012,16 +7188,7 @@
           <w:color w:val="003366"/>
           <w:sz w:val="30"/>
         </w:rPr>
-        <w:t>7. Complete Hardware Troubleshooting &amp; Diagnostic Flowchart</w:t>
-      </w:r>
-    </w:p>
-    <w:p>
-      <w:r>
-        <w:rPr>
-          <w:rFonts w:ascii="Arial" w:hAnsi="Arial"/>
-          <w:sz w:val="20"/>
-        </w:rPr>
-        <w:t>Figure 1.5 provides the comprehensive step-by-step troubleshooting sequence for field and laboratory repair technicians, covering power entry verification, voltage rail testing, clock stability check, and RF transmission path validation:</w:t>
+        <w:t>8. End-to-End Hardware System Troubleshooting Flowchart</w:t>
       </w:r>
     </w:p>
     <w:p>
@@ -4034,7 +7201,7 @@
         <w:drawing>
           <wp:inline xmlns:a="http://schemas.openxmlformats.org/drawingml/2006/main" xmlns:pic="http://schemas.openxmlformats.org/drawingml/2006/picture">
             <wp:extent cx="5669280" cy="4445694"/>
-            <wp:docPr id="5" name="Picture 5"/>
+            <wp:docPr id="6" name="Picture 6"/>
             <wp:cNvGraphicFramePr>
               <a:graphicFrameLocks noChangeAspect="1"/>
             </wp:cNvGraphicFramePr>
@@ -4046,7 +7213,7 @@
                     <pic:cNvPicPr/>
                   </pic:nvPicPr>
                   <pic:blipFill>
-                    <a:blip r:embed="rId13"/>
+                    <a:blip r:embed="rId14"/>
                     <a:stretch>
                       <a:fillRect/>
                     </a:stretch>
@@ -4077,7 +7244,7 @@
           <w:color w:val="505A64"/>
           <w:sz w:val="18"/>
         </w:rPr>
-        <w:t>Figure 1.5: End-to-End ADRV9009 Hardware System Troubleshooting &amp; Fault Isolation Flowchart.</w:t>
+        <w:t>Figure 1.6: End-to-End ADRV9009 Hardware System Troubleshooting &amp; Fault Isolation Flowchart.</w:t>
       </w:r>
     </w:p>
     <w:p>
@@ -4096,13 +7263,13 @@
           <w:rFonts w:ascii="Vazirmatn" w:hAnsi="Vazirmatn"/>
           <w:b/>
           <w:color w:val="003366"/>
-          <w:sz w:val="40"/>
+          <w:sz w:val="36"/>
           <w:rFonts w:ascii="Vazirmatn" w:hAnsi="Vazirmatn" w:cs="Vazirmatn"/>
           <w:rtl/>
         </w:rPr>
         <w:t>دستورالعمل جامع نگهداری پیشگیرانه، عیب‌یابی و تعمیرات سخت‌افزاری</w:t>
         <w:br/>
-        <w:t>برد فرستنده/گیرنده ADRV9009</w:t>
+        <w:t>برد فرستنده/گیرنده ADRV9009 به همراه دستورالعمل‌های تست و اندازه‌گیری RF</w:t>
       </w:r>
     </w:p>
     <w:p>
@@ -4116,11 +7283,11 @@
           <w:rFonts w:ascii="Vazirmatn" w:hAnsi="Vazirmatn"/>
           <w:b w:val="0"/>
           <w:color w:val="5A646E"/>
-          <w:sz w:val="21"/>
+          <w:sz w:val="20"/>
           <w:rFonts w:ascii="Vazirmatn" w:hAnsi="Vazirmatn" w:cs="Vazirmatn"/>
           <w:rtl/>
         </w:rPr>
-        <w:t>مستندات استاندارد پایش دوره‌ای، شماتیک نقاط تست، نقشه‌های لایه‌های PCB، پروفایل ریورک BGA و فلوچارت‌های عیب‌یابی</w:t>
+        <w:t>خروجی‌های آلتیوم Job1 و Job2، شماتیک نقاط تست، نقشه‌های لایه‌های PCB، دستورالعمل‌های گام‌به‌گام تست آزمایشگاهی و نتایج مشخصه‌سازی تجربی</w:t>
       </w:r>
     </w:p>
     <w:p>
@@ -4134,28 +7301,11 @@
           <w:rFonts w:ascii="Vazirmatn" w:hAnsi="Vazirmatn"/>
           <w:b/>
           <w:color w:val="003366"/>
-          <w:sz w:val="30"/>
+          <w:sz w:val="28"/>
           <w:rFonts w:ascii="Vazirmatn" w:hAnsi="Vazirmatn" w:cs="Vazirmatn"/>
           <w:rtl/>
         </w:rPr>
         <w:t>۱. زمان‌بندی نگهداری پیشگیرانه و استانداردهای بازرسی چشمی</w:t>
-      </w:r>
-    </w:p>
-    <w:p>
-      <w:pPr>
-        <w:bidi/>
-        <w:jc w:val="right"/>
-      </w:pPr>
-      <w:r>
-        <w:rPr>
-          <w:rFonts w:ascii="Vazirmatn" w:hAnsi="Vazirmatn"/>
-          <w:b w:val="0"/>
-          <w:color w:val="282828"/>
-          <w:sz w:val="20"/>
-          <w:rFonts w:ascii="Vazirmatn" w:hAnsi="Vazirmatn" w:cs="Vazirmatn"/>
-          <w:rtl/>
-        </w:rPr>
-        <w:t>نگهداری دوره‌ای و بازرسی فنی از عوامل حیاتی در تضمین پایداری و عملکرد طولانی‌مدت بردهای فرکانس بالا (RF) می‌باشد. با توجه به حساسیت فوق‌العاده تراشه‌های مدرن ترنسور رادیویی به گرد و غبار، دمای بالا، اکسیداسیون اتصالات و سایش کانکتورهای کواکسیال، رعایت زمان‌بندی زیر الزامی است:</w:t>
       </w:r>
     </w:p>
     <w:tbl>
@@ -4904,11 +8054,11 @@
           <w:rFonts w:ascii="Vazirmatn" w:hAnsi="Vazirmatn"/>
           <w:b/>
           <w:color w:val="003366"/>
-          <w:sz w:val="30"/>
+          <w:sz w:val="28"/>
           <w:rFonts w:ascii="Vazirmatn" w:hAnsi="Vazirmatn" w:cs="Vazirmatn"/>
           <w:rtl/>
         </w:rPr>
-        <w:t>۲. عیب‌یابی خطوط تغذیه DC، شماتیک نقاط تست و نقشه‌های PCB</w:t>
+        <w:t>۲. خروجی‌های آلتیوم Job 1 و Job 2 و جانمایی نقاط تست روی لایه‌های PCB</w:t>
       </w:r>
     </w:p>
     <w:p>
@@ -4925,7 +8075,143 @@
           <w:rFonts w:ascii="Vazirmatn" w:hAnsi="Vazirmatn" w:cs="Vazirmatn"/>
           <w:rtl/>
         </w:rPr>
-        <w:t>خرابی در مدارات تغذیه و نوسان ولتاژهای کاری، شایع‌ترین عامل عدم پاسخ‌دهی یا خرابی برد فرستنده/گیرنده ADRV9009 است. جدول زیر مشخصات کامل نقاط تست ولتاژ (TP1 تا TP6)، تلرانس مجاز، حداکثر ریپل AC و منشأ خطاهای احتمالی را تشریح می‌نماید:</w:t>
+        <w:t>جهت اجرای عملیات تعمیرات برد در سطح آزمایشگاهی، کارشناسان فنی باید شماتیک مدار (Job 1) را با نقشه‌های مونتاژ لایه‌های رو و پشت برد (Job 2) تطبیق دهند. شکل‌های ۲.۱ و ۲.۲ جزئیات کامل نام نت‌ها، مسیرهای مسی و پدهای تست را نمایش می‌دهند:</w:t>
+      </w:r>
+    </w:p>
+    <w:p>
+      <w:pPr>
+        <w:keepNext/>
+        <w:spacing w:before="160" w:after="40"/>
+        <w:jc w:val="center"/>
+      </w:pPr>
+      <w:r>
+        <w:drawing>
+          <wp:inline xmlns:a="http://schemas.openxmlformats.org/drawingml/2006/main" xmlns:pic="http://schemas.openxmlformats.org/drawingml/2006/picture">
+            <wp:extent cx="5669280" cy="3886488"/>
+            <wp:docPr id="7" name="Picture 7"/>
+            <wp:cNvGraphicFramePr>
+              <a:graphicFrameLocks noChangeAspect="1"/>
+            </wp:cNvGraphicFramePr>
+            <a:graphic>
+              <a:graphicData uri="http://schemas.openxmlformats.org/drawingml/2006/picture">
+                <pic:pic>
+                  <pic:nvPicPr>
+                    <pic:cNvPr id="0" name="altium_job1_schematic_checkpoints.png"/>
+                    <pic:cNvPicPr/>
+                  </pic:nvPicPr>
+                  <pic:blipFill>
+                    <a:blip r:embed="rId9"/>
+                    <a:stretch>
+                      <a:fillRect/>
+                    </a:stretch>
+                  </pic:blipFill>
+                  <pic:spPr>
+                    <a:xfrm>
+                      <a:off x="0" y="0"/>
+                      <a:ext cx="5669280" cy="3886488"/>
+                    </a:xfrm>
+                    <a:prstGeom prst="rect"/>
+                  </pic:spPr>
+                </pic:pic>
+              </a:graphicData>
+            </a:graphic>
+          </wp:inline>
+        </w:drawing>
+      </w:r>
+    </w:p>
+    <w:p>
+      <w:pPr>
+        <w:spacing w:before="40" w:after="200"/>
+        <w:jc w:val="center"/>
+        <w:bidi/>
+      </w:pPr>
+      <w:r>
+        <w:rPr>
+          <w:rFonts w:ascii="Vazirmatn" w:hAnsi="Vazirmatn"/>
+          <w:b/>
+          <w:color w:val="505A64"/>
+          <w:sz w:val="18"/>
+          <w:rFonts w:ascii="Vazirmatn" w:hAnsi="Vazirmatn" w:cs="Vazirmatn"/>
+          <w:rtl/>
+        </w:rPr>
+        <w:t>شکل ۲.۱: خروجی آلتیوم Job 1 — نقشه شماتیک نقاط تست، برچسب‌های نت، مدارات PMIC و رگولاتورهای LDO به همراه راهنمای تفکیک عیب.</w:t>
+      </w:r>
+    </w:p>
+    <w:p>
+      <w:pPr>
+        <w:keepNext/>
+        <w:spacing w:before="160" w:after="40"/>
+        <w:jc w:val="center"/>
+      </w:pPr>
+      <w:r>
+        <w:drawing>
+          <wp:inline xmlns:a="http://schemas.openxmlformats.org/drawingml/2006/main" xmlns:pic="http://schemas.openxmlformats.org/drawingml/2006/picture">
+            <wp:extent cx="5669280" cy="3135524"/>
+            <wp:docPr id="8" name="Picture 8"/>
+            <wp:cNvGraphicFramePr>
+              <a:graphicFrameLocks noChangeAspect="1"/>
+            </wp:cNvGraphicFramePr>
+            <a:graphic>
+              <a:graphicData uri="http://schemas.openxmlformats.org/drawingml/2006/picture">
+                <pic:pic>
+                  <pic:nvPicPr>
+                    <pic:cNvPr id="0" name="altium_job2_pcb_assembly_top_bottom.png"/>
+                    <pic:cNvPicPr/>
+                  </pic:nvPicPr>
+                  <pic:blipFill>
+                    <a:blip r:embed="rId10"/>
+                    <a:stretch>
+                      <a:fillRect/>
+                    </a:stretch>
+                  </pic:blipFill>
+                  <pic:spPr>
+                    <a:xfrm>
+                      <a:off x="0" y="0"/>
+                      <a:ext cx="5669280" cy="3135524"/>
+                    </a:xfrm>
+                    <a:prstGeom prst="rect"/>
+                  </pic:spPr>
+                </pic:pic>
+              </a:graphicData>
+            </a:graphic>
+          </wp:inline>
+        </w:drawing>
+      </w:r>
+    </w:p>
+    <w:p>
+      <w:pPr>
+        <w:spacing w:before="40" w:after="200"/>
+        <w:jc w:val="center"/>
+        <w:bidi/>
+      </w:pPr>
+      <w:r>
+        <w:rPr>
+          <w:rFonts w:ascii="Vazirmatn" w:hAnsi="Vazirmatn"/>
+          <w:b/>
+          <w:color w:val="505A64"/>
+          <w:sz w:val="18"/>
+          <w:rFonts w:ascii="Vazirmatn" w:hAnsi="Vazirmatn" w:cs="Vazirmatn"/>
+          <w:rtl/>
+        </w:rPr>
+        <w:t>شکل ۲.۲: خروجی آلتیوم Job 2 — نقشه‌های مونتاژ لایه‌های PCB: لایه رو (Job 2A) و لایه پشت (Job 2B) شامل ترک‌های فرکانس بالا و پدهای تست ولتاژ.</w:t>
+      </w:r>
+    </w:p>
+    <w:p>
+      <w:pPr>
+        <w:pStyle w:val="Heading1"/>
+        <w:bidi/>
+        <w:jc w:val="right"/>
+      </w:pPr>
+      <w:r>
+        <w:rPr>
+          <w:rFonts w:ascii="Vazirmatn" w:hAnsi="Vazirmatn"/>
+          <w:b/>
+          <w:color w:val="003366"/>
+          <w:sz w:val="28"/>
+          <w:rFonts w:ascii="Vazirmatn" w:hAnsi="Vazirmatn" w:cs="Vazirmatn"/>
+          <w:rtl/>
+        </w:rPr>
+        <w:t>۳. عیب‌یابی خطوط تغذیه DC و جدول نقاط تست ولتاژ</w:t>
       </w:r>
     </w:p>
     <w:tbl>
@@ -6191,6 +9477,59 @@
     </w:p>
     <w:p>
       <w:pPr>
+        <w:pStyle w:val="Heading1"/>
+        <w:bidi/>
+        <w:jc w:val="right"/>
+      </w:pPr>
+      <w:r>
+        <w:rPr>
+          <w:rFonts w:ascii="Vazirmatn" w:hAnsi="Vazirmatn"/>
+          <w:b/>
+          <w:color w:val="003366"/>
+          <w:sz w:val="28"/>
+          <w:rFonts w:ascii="Vazirmatn" w:hAnsi="Vazirmatn" w:cs="Vazirmatn"/>
+          <w:rtl/>
+        </w:rPr>
+        <w:t>۴. دستورالعمل‌های گام‌به‌گام تست آزمایشگاهی و جدول نتایج اندازه‌گیری</w:t>
+      </w:r>
+    </w:p>
+    <w:p>
+      <w:pPr>
+        <w:bidi/>
+        <w:jc w:val="right"/>
+      </w:pPr>
+      <w:r>
+        <w:rPr>
+          <w:rFonts w:ascii="Vazirmatn" w:hAnsi="Vazirmatn"/>
+          <w:b w:val="0"/>
+          <w:color w:val="282828"/>
+          <w:sz w:val="19"/>
+          <w:rFonts w:ascii="Vazirmatn" w:hAnsi="Vazirmatn" w:cs="Vazirmatn"/>
+          <w:rtl/>
+        </w:rPr>
+        <w:t>جهت تضمین سلامت بردهای تعمیرشده، اجرای توالی تست‌های آزمایشگاهی زیر با استفاده از تجهیزات اندازه‌گیری دقیق الزامی است:</w:t>
+        <w:br/>
+        <w:br/>
+        <w:t>■ دستورالعمل تست توان، خلوص طیفی و هارمونیک‌های فرستنده (TX):</w:t>
+        <w:br/>
+        <w:t>۱. اتصال پورت TX1_OUT از طریق پد تضعیف‌کننده دقیق ۲۰ دسی‌بل به ورودی ۵۰ اهم اسپکتروم آنالایزر.</w:t>
+        <w:br/>
+        <w:t>۲. تنظیم فرکانس نوسان‌ساز محلی (LO) روی ۲.۶ گیگاهرتز از طریق دستور لینوکس یا نرم‌افزار eLynxSDR.</w:t>
+        <w:br/>
+        <w:t>۳. ارسال سیگنال تک‌تن دیجیتال در گین بیشینه و قرائت توان حامل اصلی (+7.5 dBm) و کنترل تضعیف فرکانس تصویر (&gt; 78 dBc) و نشتی کریر (&lt; -82 dBc).</w:t>
+        <w:br/>
+        <w:br/>
+        <w:t>■ دستورالعمل تست رقم نویز (NF)، حساسیت و خطینگی گیرنده (RX):</w:t>
+        <w:br/>
+        <w:t>۱. اتصال سیگنال ژنراتور کالیبره‌شده به پورت RX1_IN و تزریق سیگنال تک‌تن با توان -50 dBm.</w:t>
+        <w:br/>
+        <w:t>۲. قرائت دامنه دیجیتال در پنجره FFT نرم‌افزار جهت محاسبه گین تبدیل آنالوگ به دیجیتال.</w:t>
+        <w:br/>
+        <w:t>۳. اتصال منبع نویز کالیبره‌شده (346B) جهت اندازه‌گیری Y-Factor و استخراج رقم نویز (کمتر از 12.5 dB در فرکانس 2.6 GHz).</w:t>
+      </w:r>
+    </w:p>
+    <w:p>
+      <w:pPr>
         <w:keepNext/>
         <w:spacing w:before="160" w:after="40"/>
         <w:jc w:val="center"/>
@@ -6198,8 +9537,8 @@
       <w:r>
         <w:drawing>
           <wp:inline xmlns:a="http://schemas.openxmlformats.org/drawingml/2006/main" xmlns:pic="http://schemas.openxmlformats.org/drawingml/2006/picture">
-            <wp:extent cx="5669280" cy="3629971"/>
-            <wp:docPr id="6" name="Picture 6"/>
+            <wp:extent cx="5669280" cy="3386348"/>
+            <wp:docPr id="9" name="Picture 9"/>
             <wp:cNvGraphicFramePr>
               <a:graphicFrameLocks noChangeAspect="1"/>
             </wp:cNvGraphicFramePr>
@@ -6207,11 +9546,11 @@
               <a:graphicData uri="http://schemas.openxmlformats.org/drawingml/2006/picture">
                 <pic:pic>
                   <pic:nvPicPr>
-                    <pic:cNvPr id="0" name="adrv9009_power_tree_schematic.png"/>
+                    <pic:cNvPr id="0" name="rf_test_bench_setup_diagram.png"/>
                     <pic:cNvPicPr/>
                   </pic:nvPicPr>
                   <pic:blipFill>
-                    <a:blip r:embed="rId9"/>
+                    <a:blip r:embed="rId12"/>
                     <a:stretch>
                       <a:fillRect/>
                     </a:stretch>
@@ -6219,7 +9558,7 @@
                   <pic:spPr>
                     <a:xfrm>
                       <a:off x="0" y="0"/>
-                      <a:ext cx="5669280" cy="3629971"/>
+                      <a:ext cx="5669280" cy="3386348"/>
                     </a:xfrm>
                     <a:prstGeom prst="rect"/>
                   </pic:spPr>
@@ -6245,125 +9584,7 @@
           <w:rFonts w:ascii="Vazirmatn" w:hAnsi="Vazirmatn" w:cs="Vazirmatn"/>
           <w:rtl/>
         </w:rPr>
-        <w:t>شکل ۲.۱: شماتیک معماری مدار توزیع توان (Power Tree) و نقاط تست ولتاژ برد ADRV9009 شامل فیوز F1، رگولاتورهای ADP5054 و LT3045 و نقاط TP1 تا TP6.</w:t>
-      </w:r>
-    </w:p>
-    <w:p>
-      <w:pPr>
-        <w:keepNext/>
-        <w:spacing w:before="160" w:after="40"/>
-        <w:jc w:val="center"/>
-      </w:pPr>
-      <w:r>
-        <w:drawing>
-          <wp:inline xmlns:a="http://schemas.openxmlformats.org/drawingml/2006/main" xmlns:pic="http://schemas.openxmlformats.org/drawingml/2006/picture">
-            <wp:extent cx="5669280" cy="4037833"/>
-            <wp:docPr id="7" name="Picture 7"/>
-            <wp:cNvGraphicFramePr>
-              <a:graphicFrameLocks noChangeAspect="1"/>
-            </wp:cNvGraphicFramePr>
-            <a:graphic>
-              <a:graphicData uri="http://schemas.openxmlformats.org/drawingml/2006/picture">
-                <pic:pic>
-                  <pic:nvPicPr>
-                    <pic:cNvPr id="0" name="adrv9009_pcb_top_layer.png"/>
-                    <pic:cNvPicPr/>
-                  </pic:nvPicPr>
-                  <pic:blipFill>
-                    <a:blip r:embed="rId10"/>
-                    <a:stretch>
-                      <a:fillRect/>
-                    </a:stretch>
-                  </pic:blipFill>
-                  <pic:spPr>
-                    <a:xfrm>
-                      <a:off x="0" y="0"/>
-                      <a:ext cx="5669280" cy="4037833"/>
-                    </a:xfrm>
-                    <a:prstGeom prst="rect"/>
-                  </pic:spPr>
-                </pic:pic>
-              </a:graphicData>
-            </a:graphic>
-          </wp:inline>
-        </w:drawing>
-      </w:r>
-    </w:p>
-    <w:p>
-      <w:pPr>
-        <w:spacing w:before="40" w:after="200"/>
-        <w:jc w:val="center"/>
-        <w:bidi/>
-      </w:pPr>
-      <w:r>
-        <w:rPr>
-          <w:rFonts w:ascii="Vazirmatn" w:hAnsi="Vazirmatn"/>
-          <w:b/>
-          <w:color w:val="505A64"/>
-          <w:sz w:val="18"/>
-          <w:rFonts w:ascii="Vazirmatn" w:hAnsi="Vazirmatn" w:cs="Vazirmatn"/>
-          <w:rtl/>
-        </w:rPr>
-        <w:t>شکل ۲.۲: نقشه لایه روی برد (PCB Top Layer) و جانمایی فیوز ورودی F1، دیود محافظ TVS، تراشه‌های ADRV9009 و HMC7044، بالون‌ها و نقاط تست ولتاژ TP1 تا TP6.</w:t>
-      </w:r>
-    </w:p>
-    <w:p>
-      <w:pPr>
-        <w:keepNext/>
-        <w:spacing w:before="160" w:after="40"/>
-        <w:jc w:val="center"/>
-      </w:pPr>
-      <w:r>
-        <w:drawing>
-          <wp:inline xmlns:a="http://schemas.openxmlformats.org/drawingml/2006/main" xmlns:pic="http://schemas.openxmlformats.org/drawingml/2006/picture">
-            <wp:extent cx="5669280" cy="4037833"/>
-            <wp:docPr id="8" name="Picture 8"/>
-            <wp:cNvGraphicFramePr>
-              <a:graphicFrameLocks noChangeAspect="1"/>
-            </wp:cNvGraphicFramePr>
-            <a:graphic>
-              <a:graphicData uri="http://schemas.openxmlformats.org/drawingml/2006/picture">
-                <pic:pic>
-                  <pic:nvPicPr>
-                    <pic:cNvPr id="0" name="adrv9009_pcb_bottom_layer.png"/>
-                    <pic:cNvPicPr/>
-                  </pic:nvPicPr>
-                  <pic:blipFill>
-                    <a:blip r:embed="rId11"/>
-                    <a:stretch>
-                      <a:fillRect/>
-                    </a:stretch>
-                  </pic:blipFill>
-                  <pic:spPr>
-                    <a:xfrm>
-                      <a:off x="0" y="0"/>
-                      <a:ext cx="5669280" cy="4037833"/>
-                    </a:xfrm>
-                    <a:prstGeom prst="rect"/>
-                  </pic:spPr>
-                </pic:pic>
-              </a:graphicData>
-            </a:graphic>
-          </wp:inline>
-        </w:drawing>
-      </w:r>
-    </w:p>
-    <w:p>
-      <w:pPr>
-        <w:spacing w:before="40" w:after="200"/>
-        <w:jc w:val="center"/>
-        <w:bidi/>
-      </w:pPr>
-      <w:r>
-        <w:rPr>
-          <w:rFonts w:ascii="Vazirmatn" w:hAnsi="Vazirmatn"/>
-          <w:b/>
-          <w:color w:val="505A64"/>
-          <w:sz w:val="18"/>
-          <w:rFonts w:ascii="Vazirmatn" w:hAnsi="Vazirmatn" w:cs="Vazirmatn"/>
-          <w:rtl/>
-        </w:rPr>
-        <w:t>شکل ۲.۳: نقشه لایه پشت برد (PCB Bottom Layer) و موقعیت آی‌سی مدیریت توان ADP5054، رگولاتورهای فوق‌کم‌نویز LT3045، سلف‌های قدرت و ماتریس خازن‌های دیکوپلینگ BGA.</w:t>
+        <w:t>شکل ۲.۳: دیاگرام اتصالات میز تست و اندازه‌گیری آزمایشگاهی برد ADRV9009 شامل اسپکتروم آنالایزر، سیگنال ژنراتور و همگام‌سازی کلاک ۱۰ مگاهرتز.</w:t>
       </w:r>
     </w:p>
     <w:p>
@@ -6377,36 +9598,11 @@
           <w:rFonts w:ascii="Vazirmatn" w:hAnsi="Vazirmatn"/>
           <w:b/>
           <w:color w:val="003366"/>
-          <w:sz w:val="30"/>
+          <w:sz w:val="28"/>
           <w:rFonts w:ascii="Vazirmatn" w:hAnsi="Vazirmatn" w:cs="Vazirmatn"/>
           <w:rtl/>
         </w:rPr>
-        <w:t>۳. دستورالعمل ریورک و تعویض تراشه BGA فرستنده/گیرنده ADRV9009</w:t>
-      </w:r>
-    </w:p>
-    <w:p>
-      <w:pPr>
-        <w:bidi/>
-        <w:jc w:val="right"/>
-      </w:pPr>
-      <w:r>
-        <w:rPr>
-          <w:rFonts w:ascii="Vazirmatn" w:hAnsi="Vazirmatn"/>
-          <w:b w:val="0"/>
-          <w:color w:val="282828"/>
-          <w:sz w:val="20"/>
-          <w:rFonts w:ascii="Vazirmatn" w:hAnsi="Vazirmatn" w:cs="Vazirmatn"/>
-          <w:rtl/>
-        </w:rPr>
-        <w:t>تراشه ADRV9009 در پکیج BGA با ۱۹۶ توپ قلع (ابعاد ۱۲ در ۱۲ میلی‌متر با گام ۰.۸ میلی‌متر) قرار دارد. جهت دمونتاژ و مونتاژ مجدد، رعایت مراحل زیر بر اساس استاندارد IPC-7711 الزامی است:</w:t>
-        <w:br/>
-        <w:t>۱. پخت برد (Baking): برد مدار چاپی پیش از هرگونه حرارت‌دهی باید به مدت ۸ ساعت در دمای ۱۲۵ درجه سانتی‌گراد در کوره رطوبت‌زدایی قرار گیرد تا از تاول‌زدگی (Popcorning) جلوگیری شود.</w:t>
-        <w:br/>
-        <w:t>۲. تنظیم پروفایل حرارتی: پیش‌گرمایش تدریجی تا ۱۷۰ درجه، ناحیه تثبیت فلاکس (Soak) تا ۲۰۰ درجه، و اوج حرارت مایع‌شدن قلع بدون‌سرب SAC305 در دمای ۲۳۵ تا ۲۴۵ درجه به مدت ۴۵ ثانیه.</w:t>
-        <w:br/>
-        <w:t>۳. تراز نوری اسپلیت‌ویژن: استفاده از سیستم منشوری دستگاه ریورک BGA جهت انطباق دقیق پدهای برد با پایه‌های تراشه.</w:t>
-        <w:br/>
-        <w:t>۴. بازرسی اشعه ایکس (X-Ray): تایید عدم اتصال کوتاه میان پایه‌ها و کنترل حباب‌های هوای داخل قلع به کمتر از ۱۵ درصد.</w:t>
+        <w:t>۵. دستورالعمل ریورک و تعویض تراشه BGA فرستنده/گیرنده ADRV9009</w:t>
       </w:r>
     </w:p>
     <w:p>
@@ -6419,7 +9615,7 @@
         <w:drawing>
           <wp:inline xmlns:a="http://schemas.openxmlformats.org/drawingml/2006/main" xmlns:pic="http://schemas.openxmlformats.org/drawingml/2006/picture">
             <wp:extent cx="5486400" cy="3181190"/>
-            <wp:docPr id="9" name="Picture 9"/>
+            <wp:docPr id="10" name="Picture 10"/>
             <wp:cNvGraphicFramePr>
               <a:graphicFrameLocks noChangeAspect="1"/>
             </wp:cNvGraphicFramePr>
@@ -6431,7 +9627,7 @@
                     <pic:cNvPicPr/>
                   </pic:nvPicPr>
                   <pic:blipFill>
-                    <a:blip r:embed="rId12"/>
+                    <a:blip r:embed="rId13"/>
                     <a:stretch>
                       <a:fillRect/>
                     </a:stretch>
@@ -6479,28 +9675,11 @@
           <w:rFonts w:ascii="Vazirmatn" w:hAnsi="Vazirmatn"/>
           <w:b/>
           <w:color w:val="003366"/>
-          <w:sz w:val="30"/>
+          <w:sz w:val="28"/>
           <w:rFonts w:ascii="Vazirmatn" w:hAnsi="Vazirmatn" w:cs="Vazirmatn"/>
           <w:rtl/>
         </w:rPr>
-        <w:t>۴. فلوچارت جامع عیب‌یابی و تفکیک خطای سخت‌افزاری برد</w:t>
-      </w:r>
-    </w:p>
-    <w:p>
-      <w:pPr>
-        <w:bidi/>
-        <w:jc w:val="right"/>
-      </w:pPr>
-      <w:r>
-        <w:rPr>
-          <w:rFonts w:ascii="Vazirmatn" w:hAnsi="Vazirmatn"/>
-          <w:b w:val="0"/>
-          <w:color w:val="282828"/>
-          <w:sz w:val="20"/>
-          <w:rFonts w:ascii="Vazirmatn" w:hAnsi="Vazirmatn" w:cs="Vazirmatn"/>
-          <w:rtl/>
-        </w:rPr>
-        <w:t>شکل ۲.۵ فلوچارت کامل و گام‌به‌گام تفکیک عیب سخت‌افزاری را از لحظه اتصال ولتاژ ۱۲ ولت ورودی، بررسی سلامت فیوز F1 و دیود TVS، تست خطوط ولتاژ TP1 تا TP6، وضعیت قفل کلاک HMC7044 و در نهایت تست انتقال رادیویی RF و حلقه Loopback نمایش می‌دهد:</w:t>
+        <w:t>۶. فلوچارت جامع عیب‌یابی و تفکیک خطای سخت‌افزاری برد</w:t>
       </w:r>
     </w:p>
     <w:p>
@@ -6513,7 +9692,7 @@
         <w:drawing>
           <wp:inline xmlns:a="http://schemas.openxmlformats.org/drawingml/2006/main" xmlns:pic="http://schemas.openxmlformats.org/drawingml/2006/picture">
             <wp:extent cx="5669280" cy="4445694"/>
-            <wp:docPr id="10" name="Picture 10"/>
+            <wp:docPr id="11" name="Picture 11"/>
             <wp:cNvGraphicFramePr>
               <a:graphicFrameLocks noChangeAspect="1"/>
             </wp:cNvGraphicFramePr>
@@ -6525,7 +9704,7 @@
                     <pic:cNvPicPr/>
                   </pic:nvPicPr>
                   <pic:blipFill>
-                    <a:blip r:embed="rId13"/>
+                    <a:blip r:embed="rId14"/>
                     <a:stretch>
                       <a:fillRect/>
                     </a:stretch>

</xml_diff>

<commit_message>
Add Altium Job 1 and Job 2 OutJob drawings with fault check points to repair manual, and add complete function-level Doxygen comments and guidance across all software files
Co-authored-by: arena-agent <297053741+arena-agent@users.noreply.github.com>
</commit_message>
<xml_diff>
--- a/docs/ADRV9009_Board_Maintenance_and_Repair_Manual.docx
+++ b/docs/ADRV9009_Board_Maintenance_and_Repair_Manual.docx
@@ -839,7 +839,7 @@
           <w:color w:val="003366"/>
           <w:sz w:val="30"/>
         </w:rPr>
-        <w:t>2. Schematic Sheet-by-Sheet Diagnostic &amp; Fault Tracing Reference</w:t>
+        <w:t>2. Altium Designer Job 1 Output: Complete Schematic Prints (Sheets 1 to 6) &amp; Fault Tracing Reference</w:t>
       </w:r>
     </w:p>
     <w:p>
@@ -848,7 +848,63 @@
           <w:rFonts w:ascii="Arial" w:hAnsi="Arial"/>
           <w:sz w:val="20"/>
         </w:rPr>
-        <w:t>Technicians must reference the exact Altium schematic sheet corresponding to the suspected subsystem failure. Below are the 6 individual schematic sheets with highlighted check points and specific fault isolation procedures:</w:t>
+        <w:t>Technicians must reference the exact Altium Designer OutputJob 'Job1.PDF' schematic sheets corresponding to the suspected subsystem failure. Figure 1.0 displays the complete Job 1 Multi-Sheet compilation overview, followed by high-resolution drawings of each individual schematic sheet (Sheets 1 through 6) with highlighted check points and fault isolation procedures:</w:t>
+      </w:r>
+    </w:p>
+    <w:p>
+      <w:pPr>
+        <w:keepNext/>
+        <w:spacing w:before="160" w:after="40"/>
+        <w:jc w:val="center"/>
+      </w:pPr>
+      <w:r>
+        <w:drawing>
+          <wp:inline xmlns:a="http://schemas.openxmlformats.org/drawingml/2006/main" xmlns:pic="http://schemas.openxmlformats.org/drawingml/2006/picture">
+            <wp:extent cx="5669280" cy="3768963"/>
+            <wp:docPr id="1" name="Picture 1"/>
+            <wp:cNvGraphicFramePr>
+              <a:graphicFrameLocks noChangeAspect="1"/>
+            </wp:cNvGraphicFramePr>
+            <a:graphic>
+              <a:graphicData uri="http://schemas.openxmlformats.org/drawingml/2006/picture">
+                <pic:pic>
+                  <pic:nvPicPr>
+                    <pic:cNvPr id="0" name="altium_job1_schematic_checkpoints.png"/>
+                    <pic:cNvPicPr/>
+                  </pic:nvPicPr>
+                  <pic:blipFill>
+                    <a:blip r:embed="rId9"/>
+                    <a:stretch>
+                      <a:fillRect/>
+                    </a:stretch>
+                  </pic:blipFill>
+                  <pic:spPr>
+                    <a:xfrm>
+                      <a:off x="0" y="0"/>
+                      <a:ext cx="5669280" cy="3768963"/>
+                    </a:xfrm>
+                    <a:prstGeom prst="rect"/>
+                  </pic:spPr>
+                </pic:pic>
+              </a:graphicData>
+            </a:graphic>
+          </wp:inline>
+        </w:drawing>
+      </w:r>
+    </w:p>
+    <w:p>
+      <w:pPr>
+        <w:spacing w:before="40" w:after="200"/>
+        <w:jc w:val="center"/>
+      </w:pPr>
+      <w:r>
+        <w:rPr>
+          <w:rFonts w:ascii="Arial" w:hAnsi="Arial"/>
+          <w:i/>
+          <w:color w:val="505A64"/>
+          <w:sz w:val="18"/>
+        </w:rPr>
+        <w:t>Figure 1.0: Altium Designer OutJob 'Job1.PDF' — Complete Multi-Sheet Schematic Prints (Sheets 1 to 6) Compilation Overview.</w:t>
       </w:r>
     </w:p>
     <w:p>
@@ -875,7 +931,7 @@
         <w:drawing>
           <wp:inline xmlns:a="http://schemas.openxmlformats.org/drawingml/2006/main" xmlns:pic="http://schemas.openxmlformats.org/drawingml/2006/picture">
             <wp:extent cx="5669280" cy="3766837"/>
-            <wp:docPr id="1" name="Picture 1"/>
+            <wp:docPr id="2" name="Picture 2"/>
             <wp:cNvGraphicFramePr>
               <a:graphicFrameLocks noChangeAspect="1"/>
             </wp:cNvGraphicFramePr>
@@ -887,7 +943,7 @@
                     <pic:cNvPicPr/>
                   </pic:nvPicPr>
                   <pic:blipFill>
-                    <a:blip r:embed="rId9"/>
+                    <a:blip r:embed="rId10"/>
                     <a:stretch>
                       <a:fillRect/>
                     </a:stretch>
@@ -945,7 +1001,7 @@
         <w:drawing>
           <wp:inline xmlns:a="http://schemas.openxmlformats.org/drawingml/2006/main" xmlns:pic="http://schemas.openxmlformats.org/drawingml/2006/picture">
             <wp:extent cx="5669280" cy="3766837"/>
-            <wp:docPr id="2" name="Picture 2"/>
+            <wp:docPr id="3" name="Picture 3"/>
             <wp:cNvGraphicFramePr>
               <a:graphicFrameLocks noChangeAspect="1"/>
             </wp:cNvGraphicFramePr>
@@ -957,7 +1013,7 @@
                     <pic:cNvPicPr/>
                   </pic:nvPicPr>
                   <pic:blipFill>
-                    <a:blip r:embed="rId10"/>
+                    <a:blip r:embed="rId11"/>
                     <a:stretch>
                       <a:fillRect/>
                     </a:stretch>
@@ -1015,7 +1071,7 @@
         <w:drawing>
           <wp:inline xmlns:a="http://schemas.openxmlformats.org/drawingml/2006/main" xmlns:pic="http://schemas.openxmlformats.org/drawingml/2006/picture">
             <wp:extent cx="5669280" cy="3766837"/>
-            <wp:docPr id="3" name="Picture 3"/>
+            <wp:docPr id="4" name="Picture 4"/>
             <wp:cNvGraphicFramePr>
               <a:graphicFrameLocks noChangeAspect="1"/>
             </wp:cNvGraphicFramePr>
@@ -1027,7 +1083,7 @@
                     <pic:cNvPicPr/>
                   </pic:nvPicPr>
                   <pic:blipFill>
-                    <a:blip r:embed="rId11"/>
+                    <a:blip r:embed="rId12"/>
                     <a:stretch>
                       <a:fillRect/>
                     </a:stretch>
@@ -1085,7 +1141,7 @@
         <w:drawing>
           <wp:inline xmlns:a="http://schemas.openxmlformats.org/drawingml/2006/main" xmlns:pic="http://schemas.openxmlformats.org/drawingml/2006/picture">
             <wp:extent cx="5669280" cy="3766837"/>
-            <wp:docPr id="4" name="Picture 4"/>
+            <wp:docPr id="5" name="Picture 5"/>
             <wp:cNvGraphicFramePr>
               <a:graphicFrameLocks noChangeAspect="1"/>
             </wp:cNvGraphicFramePr>
@@ -1097,7 +1153,7 @@
                     <pic:cNvPicPr/>
                   </pic:nvPicPr>
                   <pic:blipFill>
-                    <a:blip r:embed="rId12"/>
+                    <a:blip r:embed="rId13"/>
                     <a:stretch>
                       <a:fillRect/>
                     </a:stretch>
@@ -1155,7 +1211,7 @@
         <w:drawing>
           <wp:inline xmlns:a="http://schemas.openxmlformats.org/drawingml/2006/main" xmlns:pic="http://schemas.openxmlformats.org/drawingml/2006/picture">
             <wp:extent cx="5669280" cy="3766837"/>
-            <wp:docPr id="5" name="Picture 5"/>
+            <wp:docPr id="6" name="Picture 6"/>
             <wp:cNvGraphicFramePr>
               <a:graphicFrameLocks noChangeAspect="1"/>
             </wp:cNvGraphicFramePr>
@@ -1167,7 +1223,7 @@
                     <pic:cNvPicPr/>
                   </pic:nvPicPr>
                   <pic:blipFill>
-                    <a:blip r:embed="rId13"/>
+                    <a:blip r:embed="rId14"/>
                     <a:stretch>
                       <a:fillRect/>
                     </a:stretch>
@@ -1225,7 +1281,7 @@
         <w:drawing>
           <wp:inline xmlns:a="http://schemas.openxmlformats.org/drawingml/2006/main" xmlns:pic="http://schemas.openxmlformats.org/drawingml/2006/picture">
             <wp:extent cx="5669280" cy="3796564"/>
-            <wp:docPr id="6" name="Picture 6"/>
+            <wp:docPr id="7" name="Picture 7"/>
             <wp:cNvGraphicFramePr>
               <a:graphicFrameLocks noChangeAspect="1"/>
             </wp:cNvGraphicFramePr>
@@ -1237,7 +1293,7 @@
                     <pic:cNvPicPr/>
                   </pic:nvPicPr>
                   <pic:blipFill>
-                    <a:blip r:embed="rId14"/>
+                    <a:blip r:embed="rId15"/>
                     <a:stretch>
                       <a:fillRect/>
                     </a:stretch>
@@ -1282,7 +1338,7 @@
           <w:color w:val="003366"/>
           <w:sz w:val="30"/>
         </w:rPr>
-        <w:t>3. PCB Layout Top &amp; Bottom Layer Fault Tracing Maps</w:t>
+        <w:t>3. Altium Designer Job 2 Output: PCB Assembly &amp; Fabrication Prints (Job2.PDF) &amp; Fault Maps</w:t>
       </w:r>
     </w:p>
     <w:p>
@@ -1291,7 +1347,63 @@
           <w:rFonts w:ascii="Arial" w:hAnsi="Arial"/>
           <w:sz w:val="20"/>
         </w:rPr>
-        <w:t>Figures 1.7 and 1.8 provide the physical location maps for all active components, test pads, annular check rings, and high-frequency decoupling capacitor arrays on the top and bottom layers of the PCB:</w:t>
+        <w:t>Technicians must reference the Altium Designer OutputJob 'Job2.PDF' PCB Assembly Drawings to physically locate all active components, test pads, annular check rings, and high-frequency decoupling capacitor arrays on the top and bottom layers of the PCB. Figure 1.7 provides the dual-layer assembly compilation overview, followed by individual detailed top and bottom fault maps:</w:t>
+      </w:r>
+    </w:p>
+    <w:p>
+      <w:pPr>
+        <w:keepNext/>
+        <w:spacing w:before="160" w:after="40"/>
+        <w:jc w:val="center"/>
+      </w:pPr>
+      <w:r>
+        <w:drawing>
+          <wp:inline xmlns:a="http://schemas.openxmlformats.org/drawingml/2006/main" xmlns:pic="http://schemas.openxmlformats.org/drawingml/2006/picture">
+            <wp:extent cx="5669280" cy="3768963"/>
+            <wp:docPr id="8" name="Picture 8"/>
+            <wp:cNvGraphicFramePr>
+              <a:graphicFrameLocks noChangeAspect="1"/>
+            </wp:cNvGraphicFramePr>
+            <a:graphic>
+              <a:graphicData uri="http://schemas.openxmlformats.org/drawingml/2006/picture">
+                <pic:pic>
+                  <pic:nvPicPr>
+                    <pic:cNvPr id="0" name="altium_job2_pcb_assembly_top_bottom.png"/>
+                    <pic:cNvPicPr/>
+                  </pic:nvPicPr>
+                  <pic:blipFill>
+                    <a:blip r:embed="rId16"/>
+                    <a:stretch>
+                      <a:fillRect/>
+                    </a:stretch>
+                  </pic:blipFill>
+                  <pic:spPr>
+                    <a:xfrm>
+                      <a:off x="0" y="0"/>
+                      <a:ext cx="5669280" cy="3768963"/>
+                    </a:xfrm>
+                    <a:prstGeom prst="rect"/>
+                  </pic:spPr>
+                </pic:pic>
+              </a:graphicData>
+            </a:graphic>
+          </wp:inline>
+        </w:drawing>
+      </w:r>
+    </w:p>
+    <w:p>
+      <w:pPr>
+        <w:spacing w:before="40" w:after="200"/>
+        <w:jc w:val="center"/>
+      </w:pPr>
+      <w:r>
+        <w:rPr>
+          <w:rFonts w:ascii="Arial" w:hAnsi="Arial"/>
+          <w:i/>
+          <w:color w:val="505A64"/>
+          <w:sz w:val="18"/>
+        </w:rPr>
+        <w:t>Figure 1.7: Altium Designer OutJob 'Job2.PDF' — PCB Assembly &amp; Fabrication Prints (Top &amp; Bottom Layers Compilation Overview).</w:t>
       </w:r>
     </w:p>
     <w:p>
@@ -1304,7 +1416,7 @@
         <w:drawing>
           <wp:inline xmlns:a="http://schemas.openxmlformats.org/drawingml/2006/main" xmlns:pic="http://schemas.openxmlformats.org/drawingml/2006/picture">
             <wp:extent cx="5669280" cy="3766837"/>
-            <wp:docPr id="7" name="Picture 7"/>
+            <wp:docPr id="9" name="Picture 9"/>
             <wp:cNvGraphicFramePr>
               <a:graphicFrameLocks noChangeAspect="1"/>
             </wp:cNvGraphicFramePr>
@@ -1316,7 +1428,7 @@
                     <pic:cNvPicPr/>
                   </pic:nvPicPr>
                   <pic:blipFill>
-                    <a:blip r:embed="rId15"/>
+                    <a:blip r:embed="rId17"/>
                     <a:stretch>
                       <a:fillRect/>
                     </a:stretch>
@@ -1347,7 +1459,7 @@
           <w:color w:val="505A64"/>
           <w:sz w:val="18"/>
         </w:rPr>
-        <w:t>Figure 1.7: ADRV9009 PCB Top Layer Component &amp; Fault Tracing Map (Locations of Fuse F1, Diode D1, ADRV9009 U1, HMC7044 U2, Baluns T1–T4, and Test Points TP1–TP6).</w:t>
+        <w:t>Figure 1.8: ADRV9009 PCB Top Layer Component &amp; Fault Tracing Map (Locations of Fuse F1, Diode D1, ADRV9009 U1, HMC7044 U2, Baluns T1–T4, and Test Points TP1–TP6).</w:t>
       </w:r>
     </w:p>
     <w:p>
@@ -1360,7 +1472,7 @@
         <w:drawing>
           <wp:inline xmlns:a="http://schemas.openxmlformats.org/drawingml/2006/main" xmlns:pic="http://schemas.openxmlformats.org/drawingml/2006/picture">
             <wp:extent cx="5669280" cy="3766837"/>
-            <wp:docPr id="8" name="Picture 8"/>
+            <wp:docPr id="10" name="Picture 10"/>
             <wp:cNvGraphicFramePr>
               <a:graphicFrameLocks noChangeAspect="1"/>
             </wp:cNvGraphicFramePr>
@@ -1372,7 +1484,7 @@
                     <pic:cNvPicPr/>
                   </pic:nvPicPr>
                   <pic:blipFill>
-                    <a:blip r:embed="rId16"/>
+                    <a:blip r:embed="rId18"/>
                     <a:stretch>
                       <a:fillRect/>
                     </a:stretch>
@@ -1403,7 +1515,7 @@
           <w:color w:val="505A64"/>
           <w:sz w:val="18"/>
         </w:rPr>
-        <w:t>Figure 1.8: ADRV9009 PCB Bottom Layer Component &amp; Decoupling Map (ADP5054 PMIC U3, LT3045 LDOs U4/U5, Inductors L1–L4, and Underside BGA 0402 Decoupling Matrix).</w:t>
+        <w:t>Figure 1.9: ADRV9009 PCB Bottom Layer Component &amp; Decoupling Map (ADP5054 PMIC U3, LT3045 LDOs U4/U5, Inductors L1–L4, and Underside BGA 0402 Decoupling Matrix).</w:t>
       </w:r>
     </w:p>
     <w:p>
@@ -1430,7 +1542,7 @@
         <w:drawing>
           <wp:inline xmlns:a="http://schemas.openxmlformats.org/drawingml/2006/main" xmlns:pic="http://schemas.openxmlformats.org/drawingml/2006/picture">
             <wp:extent cx="5486400" cy="3181190"/>
-            <wp:docPr id="9" name="Picture 9"/>
+            <wp:docPr id="11" name="Picture 11"/>
             <wp:cNvGraphicFramePr>
               <a:graphicFrameLocks noChangeAspect="1"/>
             </wp:cNvGraphicFramePr>
@@ -1442,7 +1554,7 @@
                     <pic:cNvPicPr/>
                   </pic:nvPicPr>
                   <pic:blipFill>
-                    <a:blip r:embed="rId17"/>
+                    <a:blip r:embed="rId19"/>
                     <a:stretch>
                       <a:fillRect/>
                     </a:stretch>
@@ -1473,7 +1585,7 @@
           <w:color w:val="505A64"/>
           <w:sz w:val="18"/>
         </w:rPr>
-        <w:t>Figure 1.9: ADRV9009 196-Ball CSP_BGA Rework &amp; Soldering Thermal Profile (IPC-7711/7721 Standard SAC305 Lead-Free Alloy).</w:t>
+        <w:t>Figure 1.10: ADRV9009 196-Ball CSP_BGA Rework &amp; Soldering Thermal Profile (IPC-7711/7721 Standard SAC305 Lead-Free Alloy).</w:t>
       </w:r>
     </w:p>
     <w:p>
@@ -2640,7 +2752,7 @@
         <w:drawing>
           <wp:inline xmlns:a="http://schemas.openxmlformats.org/drawingml/2006/main" xmlns:pic="http://schemas.openxmlformats.org/drawingml/2006/picture">
             <wp:extent cx="5669280" cy="4445694"/>
-            <wp:docPr id="10" name="Picture 10"/>
+            <wp:docPr id="12" name="Picture 12"/>
             <wp:cNvGraphicFramePr>
               <a:graphicFrameLocks noChangeAspect="1"/>
             </wp:cNvGraphicFramePr>
@@ -2652,7 +2764,7 @@
                     <pic:cNvPicPr/>
                   </pic:nvPicPr>
                   <pic:blipFill>
-                    <a:blip r:embed="rId18"/>
+                    <a:blip r:embed="rId20"/>
                     <a:stretch>
                       <a:fillRect/>
                     </a:stretch>
@@ -3497,7 +3609,66 @@
           <w:rFonts w:ascii="Vazirmatn" w:hAnsi="Vazirmatn" w:cs="Vazirmatn"/>
           <w:rtl/>
         </w:rPr>
-        <w:t>۲. نقشه‌های شیت‌به‌شیت شماتیک آلتیوم و راهنمای تفکیک عیب</w:t>
+        <w:t>۲. خروجی Job 1 نرم‌افزار آلتیوم: نقشه‌های شیت‌به‌شیت شماتیک (شیت‌های ۱ تا ۶)</w:t>
+      </w:r>
+    </w:p>
+    <w:p>
+      <w:pPr>
+        <w:keepNext/>
+        <w:spacing w:before="160" w:after="40"/>
+        <w:jc w:val="center"/>
+      </w:pPr>
+      <w:r>
+        <w:drawing>
+          <wp:inline xmlns:a="http://schemas.openxmlformats.org/drawingml/2006/main" xmlns:pic="http://schemas.openxmlformats.org/drawingml/2006/picture">
+            <wp:extent cx="5669280" cy="3768963"/>
+            <wp:docPr id="13" name="Picture 13"/>
+            <wp:cNvGraphicFramePr>
+              <a:graphicFrameLocks noChangeAspect="1"/>
+            </wp:cNvGraphicFramePr>
+            <a:graphic>
+              <a:graphicData uri="http://schemas.openxmlformats.org/drawingml/2006/picture">
+                <pic:pic>
+                  <pic:nvPicPr>
+                    <pic:cNvPr id="0" name="altium_job1_schematic_checkpoints.png"/>
+                    <pic:cNvPicPr/>
+                  </pic:nvPicPr>
+                  <pic:blipFill>
+                    <a:blip r:embed="rId9"/>
+                    <a:stretch>
+                      <a:fillRect/>
+                    </a:stretch>
+                  </pic:blipFill>
+                  <pic:spPr>
+                    <a:xfrm>
+                      <a:off x="0" y="0"/>
+                      <a:ext cx="5669280" cy="3768963"/>
+                    </a:xfrm>
+                    <a:prstGeom prst="rect"/>
+                  </pic:spPr>
+                </pic:pic>
+              </a:graphicData>
+            </a:graphic>
+          </wp:inline>
+        </w:drawing>
+      </w:r>
+    </w:p>
+    <w:p>
+      <w:pPr>
+        <w:spacing w:before="40" w:after="200"/>
+        <w:jc w:val="center"/>
+        <w:bidi/>
+      </w:pPr>
+      <w:r>
+        <w:rPr>
+          <w:rFonts w:ascii="Vazirmatn" w:hAnsi="Vazirmatn"/>
+          <w:b/>
+          <w:color w:val="505A64"/>
+          <w:sz w:val="18"/>
+          <w:rFonts w:ascii="Vazirmatn" w:hAnsi="Vazirmatn" w:cs="Vazirmatn"/>
+          <w:rtl/>
+        </w:rPr>
+        <w:t>شکل ۲.۰: نمای کلی خروجی Job1.PDF آلتیوم — مجموعه شیت‌های ۱ تا ۶ شماتیک و نقاط تست تشخیصی.</w:t>
       </w:r>
     </w:p>
     <w:p>
@@ -3510,7 +3681,7 @@
         <w:drawing>
           <wp:inline xmlns:a="http://schemas.openxmlformats.org/drawingml/2006/main" xmlns:pic="http://schemas.openxmlformats.org/drawingml/2006/picture">
             <wp:extent cx="5669280" cy="3766837"/>
-            <wp:docPr id="11" name="Picture 11"/>
+            <wp:docPr id="14" name="Picture 14"/>
             <wp:cNvGraphicFramePr>
               <a:graphicFrameLocks noChangeAspect="1"/>
             </wp:cNvGraphicFramePr>
@@ -3522,7 +3693,7 @@
                     <pic:cNvPicPr/>
                   </pic:nvPicPr>
                   <pic:blipFill>
-                    <a:blip r:embed="rId9"/>
+                    <a:blip r:embed="rId10"/>
                     <a:stretch>
                       <a:fillRect/>
                     </a:stretch>
@@ -3569,7 +3740,7 @@
         <w:drawing>
           <wp:inline xmlns:a="http://schemas.openxmlformats.org/drawingml/2006/main" xmlns:pic="http://schemas.openxmlformats.org/drawingml/2006/picture">
             <wp:extent cx="5669280" cy="3766837"/>
-            <wp:docPr id="12" name="Picture 12"/>
+            <wp:docPr id="15" name="Picture 15"/>
             <wp:cNvGraphicFramePr>
               <a:graphicFrameLocks noChangeAspect="1"/>
             </wp:cNvGraphicFramePr>
@@ -3581,7 +3752,7 @@
                     <pic:cNvPicPr/>
                   </pic:nvPicPr>
                   <pic:blipFill>
-                    <a:blip r:embed="rId10"/>
+                    <a:blip r:embed="rId11"/>
                     <a:stretch>
                       <a:fillRect/>
                     </a:stretch>
@@ -3628,7 +3799,7 @@
         <w:drawing>
           <wp:inline xmlns:a="http://schemas.openxmlformats.org/drawingml/2006/main" xmlns:pic="http://schemas.openxmlformats.org/drawingml/2006/picture">
             <wp:extent cx="5669280" cy="3766837"/>
-            <wp:docPr id="13" name="Picture 13"/>
+            <wp:docPr id="16" name="Picture 16"/>
             <wp:cNvGraphicFramePr>
               <a:graphicFrameLocks noChangeAspect="1"/>
             </wp:cNvGraphicFramePr>
@@ -3640,7 +3811,7 @@
                     <pic:cNvPicPr/>
                   </pic:nvPicPr>
                   <pic:blipFill>
-                    <a:blip r:embed="rId11"/>
+                    <a:blip r:embed="rId12"/>
                     <a:stretch>
                       <a:fillRect/>
                     </a:stretch>
@@ -3687,7 +3858,7 @@
         <w:drawing>
           <wp:inline xmlns:a="http://schemas.openxmlformats.org/drawingml/2006/main" xmlns:pic="http://schemas.openxmlformats.org/drawingml/2006/picture">
             <wp:extent cx="5669280" cy="3766837"/>
-            <wp:docPr id="14" name="Picture 14"/>
+            <wp:docPr id="17" name="Picture 17"/>
             <wp:cNvGraphicFramePr>
               <a:graphicFrameLocks noChangeAspect="1"/>
             </wp:cNvGraphicFramePr>
@@ -3699,7 +3870,7 @@
                     <pic:cNvPicPr/>
                   </pic:nvPicPr>
                   <pic:blipFill>
-                    <a:blip r:embed="rId12"/>
+                    <a:blip r:embed="rId13"/>
                     <a:stretch>
                       <a:fillRect/>
                     </a:stretch>
@@ -3746,7 +3917,7 @@
         <w:drawing>
           <wp:inline xmlns:a="http://schemas.openxmlformats.org/drawingml/2006/main" xmlns:pic="http://schemas.openxmlformats.org/drawingml/2006/picture">
             <wp:extent cx="5669280" cy="3766837"/>
-            <wp:docPr id="15" name="Picture 15"/>
+            <wp:docPr id="18" name="Picture 18"/>
             <wp:cNvGraphicFramePr>
               <a:graphicFrameLocks noChangeAspect="1"/>
             </wp:cNvGraphicFramePr>
@@ -3758,7 +3929,7 @@
                     <pic:cNvPicPr/>
                   </pic:nvPicPr>
                   <pic:blipFill>
-                    <a:blip r:embed="rId13"/>
+                    <a:blip r:embed="rId14"/>
                     <a:stretch>
                       <a:fillRect/>
                     </a:stretch>
@@ -3805,7 +3976,7 @@
         <w:drawing>
           <wp:inline xmlns:a="http://schemas.openxmlformats.org/drawingml/2006/main" xmlns:pic="http://schemas.openxmlformats.org/drawingml/2006/picture">
             <wp:extent cx="5669280" cy="3796564"/>
-            <wp:docPr id="16" name="Picture 16"/>
+            <wp:docPr id="19" name="Picture 19"/>
             <wp:cNvGraphicFramePr>
               <a:graphicFrameLocks noChangeAspect="1"/>
             </wp:cNvGraphicFramePr>
@@ -3817,7 +3988,7 @@
                     <pic:cNvPicPr/>
                   </pic:nvPicPr>
                   <pic:blipFill>
-                    <a:blip r:embed="rId14"/>
+                    <a:blip r:embed="rId15"/>
                     <a:stretch>
                       <a:fillRect/>
                     </a:stretch>
@@ -3869,7 +4040,66 @@
           <w:rFonts w:ascii="Vazirmatn" w:hAnsi="Vazirmatn" w:cs="Vazirmatn"/>
           <w:rtl/>
         </w:rPr>
-        <w:t>۳. نقشه‌های جانمایی و تفکیک عیب لایه‌های رو و پشت PCB</w:t>
+        <w:t>۳. خروجی Job 2 نرم‌افزار آلتیوم: نقشه‌های جانمایی و مونتاژ لایه‌های رو و پشت PCB</w:t>
+      </w:r>
+    </w:p>
+    <w:p>
+      <w:pPr>
+        <w:keepNext/>
+        <w:spacing w:before="160" w:after="40"/>
+        <w:jc w:val="center"/>
+      </w:pPr>
+      <w:r>
+        <w:drawing>
+          <wp:inline xmlns:a="http://schemas.openxmlformats.org/drawingml/2006/main" xmlns:pic="http://schemas.openxmlformats.org/drawingml/2006/picture">
+            <wp:extent cx="5669280" cy="3768963"/>
+            <wp:docPr id="20" name="Picture 20"/>
+            <wp:cNvGraphicFramePr>
+              <a:graphicFrameLocks noChangeAspect="1"/>
+            </wp:cNvGraphicFramePr>
+            <a:graphic>
+              <a:graphicData uri="http://schemas.openxmlformats.org/drawingml/2006/picture">
+                <pic:pic>
+                  <pic:nvPicPr>
+                    <pic:cNvPr id="0" name="altium_job2_pcb_assembly_top_bottom.png"/>
+                    <pic:cNvPicPr/>
+                  </pic:nvPicPr>
+                  <pic:blipFill>
+                    <a:blip r:embed="rId16"/>
+                    <a:stretch>
+                      <a:fillRect/>
+                    </a:stretch>
+                  </pic:blipFill>
+                  <pic:spPr>
+                    <a:xfrm>
+                      <a:off x="0" y="0"/>
+                      <a:ext cx="5669280" cy="3768963"/>
+                    </a:xfrm>
+                    <a:prstGeom prst="rect"/>
+                  </pic:spPr>
+                </pic:pic>
+              </a:graphicData>
+            </a:graphic>
+          </wp:inline>
+        </w:drawing>
+      </w:r>
+    </w:p>
+    <w:p>
+      <w:pPr>
+        <w:spacing w:before="40" w:after="200"/>
+        <w:jc w:val="center"/>
+        <w:bidi/>
+      </w:pPr>
+      <w:r>
+        <w:rPr>
+          <w:rFonts w:ascii="Vazirmatn" w:hAnsi="Vazirmatn"/>
+          <w:b/>
+          <w:color w:val="505A64"/>
+          <w:sz w:val="18"/>
+          <w:rFonts w:ascii="Vazirmatn" w:hAnsi="Vazirmatn" w:cs="Vazirmatn"/>
+          <w:rtl/>
+        </w:rPr>
+        <w:t>شکل ۲.۷: نمای کلی خروجی Job2.PDF آلتیوم — نقشه‌های مونتاژ و جانمایی لایه‌های رو و پشت برد.</w:t>
       </w:r>
     </w:p>
     <w:p>
@@ -3882,7 +4112,7 @@
         <w:drawing>
           <wp:inline xmlns:a="http://schemas.openxmlformats.org/drawingml/2006/main" xmlns:pic="http://schemas.openxmlformats.org/drawingml/2006/picture">
             <wp:extent cx="5669280" cy="3766837"/>
-            <wp:docPr id="17" name="Picture 17"/>
+            <wp:docPr id="21" name="Picture 21"/>
             <wp:cNvGraphicFramePr>
               <a:graphicFrameLocks noChangeAspect="1"/>
             </wp:cNvGraphicFramePr>
@@ -3894,7 +4124,7 @@
                     <pic:cNvPicPr/>
                   </pic:nvPicPr>
                   <pic:blipFill>
-                    <a:blip r:embed="rId15"/>
+                    <a:blip r:embed="rId17"/>
                     <a:stretch>
                       <a:fillRect/>
                     </a:stretch>
@@ -3928,7 +4158,7 @@
           <w:rFonts w:ascii="Vazirmatn" w:hAnsi="Vazirmatn" w:cs="Vazirmatn"/>
           <w:rtl/>
         </w:rPr>
-        <w:t>شکل ۲.۷: نقشه عیب‌یابی لایه روی برد (PCB Top Layer) شامل موقعیت فیوز F1، دیود TVS، تراشه‌های U1 و U2 و نقاط تست TP1 تا TP6.</w:t>
+        <w:t>شکل ۲.۸: نقشه عیب‌یابی لایه روی برد (PCB Top Layer) شامل موقعیت فیوز F1، دیود TVS، تراشه‌های U1 و U2 و نقاط تست TP1 تا TP6.</w:t>
       </w:r>
     </w:p>
     <w:p>
@@ -3941,7 +4171,7 @@
         <w:drawing>
           <wp:inline xmlns:a="http://schemas.openxmlformats.org/drawingml/2006/main" xmlns:pic="http://schemas.openxmlformats.org/drawingml/2006/picture">
             <wp:extent cx="5669280" cy="3766837"/>
-            <wp:docPr id="18" name="Picture 18"/>
+            <wp:docPr id="22" name="Picture 22"/>
             <wp:cNvGraphicFramePr>
               <a:graphicFrameLocks noChangeAspect="1"/>
             </wp:cNvGraphicFramePr>
@@ -3953,7 +4183,7 @@
                     <pic:cNvPicPr/>
                   </pic:nvPicPr>
                   <pic:blipFill>
-                    <a:blip r:embed="rId16"/>
+                    <a:blip r:embed="rId18"/>
                     <a:stretch>
                       <a:fillRect/>
                     </a:stretch>
@@ -3987,7 +4217,7 @@
           <w:rFonts w:ascii="Vazirmatn" w:hAnsi="Vazirmatn" w:cs="Vazirmatn"/>
           <w:rtl/>
         </w:rPr>
-        <w:t>شکل ۲.۸: نقشه عیب‌یابی لایه پشت برد (PCB Bottom Layer) شامل موقعیت آی‌سی ADP5054، رگولاتورهای LT3045 و ماتریس خازن‌های دیکوپلینگ BGA.</w:t>
+        <w:t>شکل ۲.۹: نقشه عیب‌یابی لایه پشت برد (PCB Bottom Layer) شامل موقعیت آی‌سی ADP5054، رگولاتورهای LT3045 و ماتریس خازن‌های دیکوپلینگ BGA.</w:t>
       </w:r>
     </w:p>
     <w:p>
@@ -4018,7 +4248,7 @@
         <w:drawing>
           <wp:inline xmlns:a="http://schemas.openxmlformats.org/drawingml/2006/main" xmlns:pic="http://schemas.openxmlformats.org/drawingml/2006/picture">
             <wp:extent cx="5486400" cy="3181190"/>
-            <wp:docPr id="19" name="Picture 19"/>
+            <wp:docPr id="23" name="Picture 23"/>
             <wp:cNvGraphicFramePr>
               <a:graphicFrameLocks noChangeAspect="1"/>
             </wp:cNvGraphicFramePr>
@@ -4030,7 +4260,7 @@
                     <pic:cNvPicPr/>
                   </pic:nvPicPr>
                   <pic:blipFill>
-                    <a:blip r:embed="rId17"/>
+                    <a:blip r:embed="rId19"/>
                     <a:stretch>
                       <a:fillRect/>
                     </a:stretch>
@@ -4064,7 +4294,7 @@
           <w:rFonts w:ascii="Vazirmatn" w:hAnsi="Vazirmatn" w:cs="Vazirmatn"/>
           <w:rtl/>
         </w:rPr>
-        <w:t>شکل ۲.۹: پروفایل حرارتی استاندارد ۴ مرحله‌ای ریورک و لحیم‌کاری هوای گرم BGA بر اساس استاندارد IPC-7711/7721 با آلیاژ SAC305.</w:t>
+        <w:t>شکل ۲.۱۰: پروفایل حرارتی استاندارد ۴ مرحله‌ای ریورک و لحیم‌کاری هوای گرم BGA بر اساس استاندارد IPC-7711/7721 با آلیاژ SAC305.</w:t>
       </w:r>
     </w:p>
     <w:p>
@@ -4095,7 +4325,7 @@
         <w:drawing>
           <wp:inline xmlns:a="http://schemas.openxmlformats.org/drawingml/2006/main" xmlns:pic="http://schemas.openxmlformats.org/drawingml/2006/picture">
             <wp:extent cx="5669280" cy="4445694"/>
-            <wp:docPr id="20" name="Picture 20"/>
+            <wp:docPr id="24" name="Picture 24"/>
             <wp:cNvGraphicFramePr>
               <a:graphicFrameLocks noChangeAspect="1"/>
             </wp:cNvGraphicFramePr>
@@ -4107,7 +4337,7 @@
                     <pic:cNvPicPr/>
                   </pic:nvPicPr>
                   <pic:blipFill>
-                    <a:blip r:embed="rId18"/>
+                    <a:blip r:embed="rId20"/>
                     <a:stretch>
                       <a:fillRect/>
                     </a:stretch>
@@ -4141,7 +4371,7 @@
           <w:rFonts w:ascii="Vazirmatn" w:hAnsi="Vazirmatn" w:cs="Vazirmatn"/>
           <w:rtl/>
         </w:rPr>
-        <w:t>شکل ۲.۱۰: فلوچارت گام‌به‌گام عیب‌یابی، تست خطوط تغذیه، پایش سلامت کلاک و تفکیک خطاهای سخت‌افزاری برد فرستنده/گیرنده ADRV9009.</w:t>
+        <w:t>شکل ۲.۱۱: فلوچارت گام‌به‌گام عیب‌یابی، تست خطوط تغذیه، پایش سلامت کلاک و تفکیک خطاهای سخت‌افزاری برد فرستنده/گیرنده ADRV9009.</w:t>
       </w:r>
     </w:p>
     <w:sectPr>

</xml_diff>